<commit_message>
feat: map smart_bsc_id to E00{bsc_id} in Celsis and ScanRDI, and save updated templates
</commit_message>
<xml_diff>
--- a/USP71 OOS P1 template 0.docx
+++ b/USP71 OOS P1 template 0.docx
@@ -171,14 +171,65 @@
                 <w:lang w:eastAsia="zh-CN"/>
               </w:rPr>
             </w:pPr>
-            <w:r>
-              <w:rPr>
-                <w:rFonts w:ascii="Times New Roman" w:hAnsi="Times New Roman"/>
-                <w:bCs/>
-                <w:sz w:val="22"/>
-                <w:szCs w:val="22"/>
-              </w:rPr>
-              <w:t>{{ analyst_name }}</w:t>
+            <w:proofErr w:type="gramStart"/>
+            <w:r>
+              <w:rPr>
+                <w:rFonts w:ascii="Times New Roman" w:hAnsi="Times New Roman"/>
+                <w:bCs/>
+                <w:sz w:val="22"/>
+                <w:szCs w:val="22"/>
+              </w:rPr>
+              <w:t xml:space="preserve">{{ </w:t>
+            </w:r>
+            <w:proofErr w:type="spellStart"/>
+            <w:r>
+              <w:rPr>
+                <w:rFonts w:ascii="Times New Roman" w:hAnsi="Times New Roman"/>
+                <w:bCs/>
+                <w:sz w:val="22"/>
+                <w:szCs w:val="22"/>
+              </w:rPr>
+              <w:t>analyst</w:t>
+            </w:r>
+            <w:proofErr w:type="gramEnd"/>
+            <w:r>
+              <w:rPr>
+                <w:rFonts w:ascii="Times New Roman" w:hAnsi="Times New Roman"/>
+                <w:bCs/>
+                <w:sz w:val="22"/>
+                <w:szCs w:val="22"/>
+              </w:rPr>
+              <w:t>_</w:t>
+            </w:r>
+            <w:proofErr w:type="gramStart"/>
+            <w:r>
+              <w:rPr>
+                <w:rFonts w:ascii="Times New Roman" w:hAnsi="Times New Roman"/>
+                <w:bCs/>
+                <w:sz w:val="22"/>
+                <w:szCs w:val="22"/>
+              </w:rPr>
+              <w:t>name</w:t>
+            </w:r>
+            <w:proofErr w:type="spellEnd"/>
+            <w:r>
+              <w:rPr>
+                <w:rFonts w:ascii="Times New Roman" w:hAnsi="Times New Roman"/>
+                <w:bCs/>
+                <w:sz w:val="22"/>
+                <w:szCs w:val="22"/>
+              </w:rPr>
+              <w:t xml:space="preserve"> }</w:t>
+            </w:r>
+            <w:proofErr w:type="gramEnd"/>
+            <w:r>
+              <w:rPr>
+                <w:rFonts w:ascii="Times New Roman" w:hAnsi="Times New Roman"/>
+                <w:bCs/>
+                <w:sz w:val="22"/>
+                <w:szCs w:val="22"/>
+              </w:rPr>
+              <w:t>}</w:t>
             </w:r>
           </w:p>
           <w:p>
@@ -256,6 +307,7 @@
                 <w:szCs w:val="22"/>
               </w:rPr>
             </w:pPr>
+            <w:proofErr w:type="gramStart"/>
             <w:r>
               <w:rPr>
                 <w:rFonts w:ascii="Times New Roman" w:hAnsi="Times New Roman"/>
@@ -265,6 +317,7 @@
               </w:rPr>
               <w:t xml:space="preserve">{{ </w:t>
             </w:r>
+            <w:proofErr w:type="spellStart"/>
             <w:r>
               <w:rPr>
                 <w:rFonts w:ascii="Times New Roman" w:hAnsi="Times New Roman"/>
@@ -274,14 +327,45 @@
               </w:rPr>
               <w:t>process</w:t>
             </w:r>
-            <w:r>
-              <w:rPr>
-                <w:rFonts w:ascii="Times New Roman" w:hAnsi="Times New Roman"/>
-                <w:bCs/>
-                <w:sz w:val="22"/>
-                <w:szCs w:val="22"/>
-              </w:rPr>
-              <w:t>_date }}</w:t>
+            <w:proofErr w:type="gramEnd"/>
+            <w:r>
+              <w:rPr>
+                <w:rFonts w:ascii="Times New Roman" w:hAnsi="Times New Roman"/>
+                <w:bCs/>
+                <w:sz w:val="22"/>
+                <w:szCs w:val="22"/>
+              </w:rPr>
+              <w:t>_</w:t>
+            </w:r>
+            <w:proofErr w:type="gramStart"/>
+            <w:r>
+              <w:rPr>
+                <w:rFonts w:ascii="Times New Roman" w:hAnsi="Times New Roman"/>
+                <w:bCs/>
+                <w:sz w:val="22"/>
+                <w:szCs w:val="22"/>
+              </w:rPr>
+              <w:t>date</w:t>
+            </w:r>
+            <w:proofErr w:type="spellEnd"/>
+            <w:r>
+              <w:rPr>
+                <w:rFonts w:ascii="Times New Roman" w:hAnsi="Times New Roman"/>
+                <w:bCs/>
+                <w:sz w:val="22"/>
+                <w:szCs w:val="22"/>
+              </w:rPr>
+              <w:t xml:space="preserve"> }</w:t>
+            </w:r>
+            <w:proofErr w:type="gramEnd"/>
+            <w:r>
+              <w:rPr>
+                <w:rFonts w:ascii="Times New Roman" w:hAnsi="Times New Roman"/>
+                <w:bCs/>
+                <w:sz w:val="22"/>
+                <w:szCs w:val="22"/>
+              </w:rPr>
+              <w:t>}</w:t>
             </w:r>
           </w:p>
           <w:p>
@@ -339,14 +423,65 @@
               </w:rPr>
             </w:pPr>
             <w:bookmarkStart w:id="0" w:name="OLE_LINK17"/>
-            <w:r>
-              <w:rPr>
-                <w:rFonts w:ascii="Times New Roman" w:hAnsi="Times New Roman"/>
-                <w:bCs/>
-                <w:sz w:val="22"/>
-                <w:szCs w:val="22"/>
-              </w:rPr>
-              <w:t>{{ test_date }}</w:t>
+            <w:proofErr w:type="gramStart"/>
+            <w:r>
+              <w:rPr>
+                <w:rFonts w:ascii="Times New Roman" w:hAnsi="Times New Roman"/>
+                <w:bCs/>
+                <w:sz w:val="22"/>
+                <w:szCs w:val="22"/>
+              </w:rPr>
+              <w:t xml:space="preserve">{{ </w:t>
+            </w:r>
+            <w:proofErr w:type="spellStart"/>
+            <w:r>
+              <w:rPr>
+                <w:rFonts w:ascii="Times New Roman" w:hAnsi="Times New Roman"/>
+                <w:bCs/>
+                <w:sz w:val="22"/>
+                <w:szCs w:val="22"/>
+              </w:rPr>
+              <w:t>test</w:t>
+            </w:r>
+            <w:proofErr w:type="gramEnd"/>
+            <w:r>
+              <w:rPr>
+                <w:rFonts w:ascii="Times New Roman" w:hAnsi="Times New Roman"/>
+                <w:bCs/>
+                <w:sz w:val="22"/>
+                <w:szCs w:val="22"/>
+              </w:rPr>
+              <w:t>_</w:t>
+            </w:r>
+            <w:proofErr w:type="gramStart"/>
+            <w:r>
+              <w:rPr>
+                <w:rFonts w:ascii="Times New Roman" w:hAnsi="Times New Roman"/>
+                <w:bCs/>
+                <w:sz w:val="22"/>
+                <w:szCs w:val="22"/>
+              </w:rPr>
+              <w:t>date</w:t>
+            </w:r>
+            <w:proofErr w:type="spellEnd"/>
+            <w:r>
+              <w:rPr>
+                <w:rFonts w:ascii="Times New Roman" w:hAnsi="Times New Roman"/>
+                <w:bCs/>
+                <w:sz w:val="22"/>
+                <w:szCs w:val="22"/>
+              </w:rPr>
+              <w:t xml:space="preserve"> }</w:t>
+            </w:r>
+            <w:proofErr w:type="gramEnd"/>
+            <w:r>
+              <w:rPr>
+                <w:rFonts w:ascii="Times New Roman" w:hAnsi="Times New Roman"/>
+                <w:bCs/>
+                <w:sz w:val="22"/>
+                <w:szCs w:val="22"/>
+              </w:rPr>
+              <w:t>}</w:t>
             </w:r>
           </w:p>
           <w:bookmarkEnd w:id="0"/>
@@ -407,14 +542,65 @@
                 <w:szCs w:val="22"/>
               </w:rPr>
             </w:pPr>
-            <w:r>
-              <w:rPr>
-                <w:rFonts w:ascii="Times New Roman" w:hAnsi="Times New Roman"/>
-                <w:bCs/>
-                <w:sz w:val="22"/>
-                <w:szCs w:val="22"/>
-              </w:rPr>
-              <w:t>{{ test_date }}</w:t>
+            <w:proofErr w:type="gramStart"/>
+            <w:r>
+              <w:rPr>
+                <w:rFonts w:ascii="Times New Roman" w:hAnsi="Times New Roman"/>
+                <w:bCs/>
+                <w:sz w:val="22"/>
+                <w:szCs w:val="22"/>
+              </w:rPr>
+              <w:t xml:space="preserve">{{ </w:t>
+            </w:r>
+            <w:proofErr w:type="spellStart"/>
+            <w:r>
+              <w:rPr>
+                <w:rFonts w:ascii="Times New Roman" w:hAnsi="Times New Roman"/>
+                <w:bCs/>
+                <w:sz w:val="22"/>
+                <w:szCs w:val="22"/>
+              </w:rPr>
+              <w:t>test</w:t>
+            </w:r>
+            <w:proofErr w:type="gramEnd"/>
+            <w:r>
+              <w:rPr>
+                <w:rFonts w:ascii="Times New Roman" w:hAnsi="Times New Roman"/>
+                <w:bCs/>
+                <w:sz w:val="22"/>
+                <w:szCs w:val="22"/>
+              </w:rPr>
+              <w:t>_</w:t>
+            </w:r>
+            <w:proofErr w:type="gramStart"/>
+            <w:r>
+              <w:rPr>
+                <w:rFonts w:ascii="Times New Roman" w:hAnsi="Times New Roman"/>
+                <w:bCs/>
+                <w:sz w:val="22"/>
+                <w:szCs w:val="22"/>
+              </w:rPr>
+              <w:t>date</w:t>
+            </w:r>
+            <w:proofErr w:type="spellEnd"/>
+            <w:r>
+              <w:rPr>
+                <w:rFonts w:ascii="Times New Roman" w:hAnsi="Times New Roman"/>
+                <w:bCs/>
+                <w:sz w:val="22"/>
+                <w:szCs w:val="22"/>
+              </w:rPr>
+              <w:t xml:space="preserve"> }</w:t>
+            </w:r>
+            <w:proofErr w:type="gramEnd"/>
+            <w:r>
+              <w:rPr>
+                <w:rFonts w:ascii="Times New Roman" w:hAnsi="Times New Roman"/>
+                <w:bCs/>
+                <w:sz w:val="22"/>
+                <w:szCs w:val="22"/>
+              </w:rPr>
+              <w:t>}</w:t>
             </w:r>
           </w:p>
           <w:p>
@@ -527,14 +713,65 @@
               </w:rPr>
             </w:pPr>
             <w:bookmarkStart w:id="1" w:name="OLE_LINK16"/>
-            <w:r>
-              <w:rPr>
-                <w:rFonts w:ascii="Times New Roman" w:hAnsi="Times New Roman"/>
-                <w:bCs/>
-                <w:sz w:val="22"/>
-                <w:szCs w:val="22"/>
-              </w:rPr>
-              <w:t>{{ sample_id }}</w:t>
+            <w:proofErr w:type="gramStart"/>
+            <w:r>
+              <w:rPr>
+                <w:rFonts w:ascii="Times New Roman" w:hAnsi="Times New Roman"/>
+                <w:bCs/>
+                <w:sz w:val="22"/>
+                <w:szCs w:val="22"/>
+              </w:rPr>
+              <w:t xml:space="preserve">{{ </w:t>
+            </w:r>
+            <w:proofErr w:type="spellStart"/>
+            <w:r>
+              <w:rPr>
+                <w:rFonts w:ascii="Times New Roman" w:hAnsi="Times New Roman"/>
+                <w:bCs/>
+                <w:sz w:val="22"/>
+                <w:szCs w:val="22"/>
+              </w:rPr>
+              <w:t>sample</w:t>
+            </w:r>
+            <w:proofErr w:type="gramEnd"/>
+            <w:r>
+              <w:rPr>
+                <w:rFonts w:ascii="Times New Roman" w:hAnsi="Times New Roman"/>
+                <w:bCs/>
+                <w:sz w:val="22"/>
+                <w:szCs w:val="22"/>
+              </w:rPr>
+              <w:t>_</w:t>
+            </w:r>
+            <w:proofErr w:type="gramStart"/>
+            <w:r>
+              <w:rPr>
+                <w:rFonts w:ascii="Times New Roman" w:hAnsi="Times New Roman"/>
+                <w:bCs/>
+                <w:sz w:val="22"/>
+                <w:szCs w:val="22"/>
+              </w:rPr>
+              <w:t>id</w:t>
+            </w:r>
+            <w:proofErr w:type="spellEnd"/>
+            <w:r>
+              <w:rPr>
+                <w:rFonts w:ascii="Times New Roman" w:hAnsi="Times New Roman"/>
+                <w:bCs/>
+                <w:sz w:val="22"/>
+                <w:szCs w:val="22"/>
+              </w:rPr>
+              <w:t xml:space="preserve"> }</w:t>
+            </w:r>
+            <w:proofErr w:type="gramEnd"/>
+            <w:r>
+              <w:rPr>
+                <w:rFonts w:ascii="Times New Roman" w:hAnsi="Times New Roman"/>
+                <w:bCs/>
+                <w:sz w:val="22"/>
+                <w:szCs w:val="22"/>
+              </w:rPr>
+              <w:t>}</w:t>
             </w:r>
           </w:p>
           <w:bookmarkEnd w:id="1"/>
@@ -561,15 +798,49 @@
                 <w:lang w:eastAsia="zh-CN"/>
               </w:rPr>
             </w:pPr>
-            <w:r>
-              <w:rPr>
-                <w:rFonts w:ascii="Times New Roman" w:eastAsiaTheme="minorEastAsia" w:hAnsi="Times New Roman"/>
-                <w:bCs/>
-                <w:sz w:val="22"/>
-                <w:szCs w:val="22"/>
-                <w:lang w:eastAsia="zh-CN"/>
-              </w:rPr>
-              <w:t>{{ client_name }}</w:t>
+            <w:proofErr w:type="gramStart"/>
+            <w:r>
+              <w:rPr>
+                <w:rFonts w:ascii="Times New Roman" w:eastAsiaTheme="minorEastAsia" w:hAnsi="Times New Roman"/>
+                <w:bCs/>
+                <w:sz w:val="22"/>
+                <w:szCs w:val="22"/>
+                <w:lang w:eastAsia="zh-CN"/>
+              </w:rPr>
+              <w:t xml:space="preserve">{{ </w:t>
+            </w:r>
+            <w:proofErr w:type="spellStart"/>
+            <w:r>
+              <w:rPr>
+                <w:rFonts w:ascii="Times New Roman" w:eastAsiaTheme="minorEastAsia" w:hAnsi="Times New Roman"/>
+                <w:bCs/>
+                <w:sz w:val="22"/>
+                <w:szCs w:val="22"/>
+                <w:lang w:eastAsia="zh-CN"/>
+              </w:rPr>
+              <w:t>client</w:t>
+            </w:r>
+            <w:proofErr w:type="gramEnd"/>
+            <w:r>
+              <w:rPr>
+                <w:rFonts w:ascii="Times New Roman" w:eastAsiaTheme="minorEastAsia" w:hAnsi="Times New Roman"/>
+                <w:bCs/>
+                <w:sz w:val="22"/>
+                <w:szCs w:val="22"/>
+                <w:lang w:eastAsia="zh-CN"/>
+              </w:rPr>
+              <w:t>_name</w:t>
+            </w:r>
+            <w:proofErr w:type="spellEnd"/>
+            <w:r>
+              <w:rPr>
+                <w:rFonts w:ascii="Times New Roman" w:eastAsiaTheme="minorEastAsia" w:hAnsi="Times New Roman"/>
+                <w:bCs/>
+                <w:sz w:val="22"/>
+                <w:szCs w:val="22"/>
+                <w:lang w:eastAsia="zh-CN"/>
+              </w:rPr>
+              <w:t xml:space="preserve"> }}</w:t>
             </w:r>
           </w:p>
         </w:tc>
@@ -640,14 +911,65 @@
                 <w:szCs w:val="22"/>
               </w:rPr>
             </w:pPr>
-            <w:r>
-              <w:rPr>
-                <w:rFonts w:ascii="Times New Roman" w:hAnsi="Times New Roman"/>
-                <w:bCs/>
-                <w:sz w:val="22"/>
-                <w:szCs w:val="22"/>
-              </w:rPr>
-              <w:t>{{ prepper_name }}</w:t>
+            <w:proofErr w:type="gramStart"/>
+            <w:r>
+              <w:rPr>
+                <w:rFonts w:ascii="Times New Roman" w:hAnsi="Times New Roman"/>
+                <w:bCs/>
+                <w:sz w:val="22"/>
+                <w:szCs w:val="22"/>
+              </w:rPr>
+              <w:t xml:space="preserve">{{ </w:t>
+            </w:r>
+            <w:proofErr w:type="spellStart"/>
+            <w:r>
+              <w:rPr>
+                <w:rFonts w:ascii="Times New Roman" w:hAnsi="Times New Roman"/>
+                <w:bCs/>
+                <w:sz w:val="22"/>
+                <w:szCs w:val="22"/>
+              </w:rPr>
+              <w:t>prepper</w:t>
+            </w:r>
+            <w:proofErr w:type="gramEnd"/>
+            <w:r>
+              <w:rPr>
+                <w:rFonts w:ascii="Times New Roman" w:hAnsi="Times New Roman"/>
+                <w:bCs/>
+                <w:sz w:val="22"/>
+                <w:szCs w:val="22"/>
+              </w:rPr>
+              <w:t>_</w:t>
+            </w:r>
+            <w:proofErr w:type="gramStart"/>
+            <w:r>
+              <w:rPr>
+                <w:rFonts w:ascii="Times New Roman" w:hAnsi="Times New Roman"/>
+                <w:bCs/>
+                <w:sz w:val="22"/>
+                <w:szCs w:val="22"/>
+              </w:rPr>
+              <w:t>name</w:t>
+            </w:r>
+            <w:proofErr w:type="spellEnd"/>
+            <w:r>
+              <w:rPr>
+                <w:rFonts w:ascii="Times New Roman" w:hAnsi="Times New Roman"/>
+                <w:bCs/>
+                <w:sz w:val="22"/>
+                <w:szCs w:val="22"/>
+              </w:rPr>
+              <w:t xml:space="preserve"> }</w:t>
+            </w:r>
+            <w:proofErr w:type="gramEnd"/>
+            <w:r>
+              <w:rPr>
+                <w:rFonts w:ascii="Times New Roman" w:hAnsi="Times New Roman"/>
+                <w:bCs/>
+                <w:sz w:val="22"/>
+                <w:szCs w:val="22"/>
+              </w:rPr>
+              <w:t>}</w:t>
             </w:r>
             <w:r>
               <w:rPr>
@@ -667,6 +989,7 @@
               </w:rPr>
               <w:t>(</w:t>
             </w:r>
+            <w:proofErr w:type="gramStart"/>
             <w:r>
               <w:rPr>
                 <w:rFonts w:ascii="Times New Roman" w:hAnsi="Times New Roman"/>
@@ -676,6 +999,7 @@
               </w:rPr>
               <w:t xml:space="preserve">{{ </w:t>
             </w:r>
+            <w:proofErr w:type="spellStart"/>
             <w:r>
               <w:rPr>
                 <w:rFonts w:ascii="Times New Roman" w:hAnsi="Times New Roman"/>
@@ -685,14 +1009,45 @@
               </w:rPr>
               <w:t>prepper</w:t>
             </w:r>
-            <w:r>
-              <w:rPr>
-                <w:rFonts w:ascii="Times New Roman" w:hAnsi="Times New Roman"/>
-                <w:bCs/>
-                <w:sz w:val="22"/>
-                <w:szCs w:val="22"/>
-              </w:rPr>
-              <w:t>_initial }})</w:t>
+            <w:proofErr w:type="gramEnd"/>
+            <w:r>
+              <w:rPr>
+                <w:rFonts w:ascii="Times New Roman" w:hAnsi="Times New Roman"/>
+                <w:bCs/>
+                <w:sz w:val="22"/>
+                <w:szCs w:val="22"/>
+              </w:rPr>
+              <w:t>_</w:t>
+            </w:r>
+            <w:proofErr w:type="gramStart"/>
+            <w:r>
+              <w:rPr>
+                <w:rFonts w:ascii="Times New Roman" w:hAnsi="Times New Roman"/>
+                <w:bCs/>
+                <w:sz w:val="22"/>
+                <w:szCs w:val="22"/>
+              </w:rPr>
+              <w:t>initial</w:t>
+            </w:r>
+            <w:proofErr w:type="spellEnd"/>
+            <w:r>
+              <w:rPr>
+                <w:rFonts w:ascii="Times New Roman" w:hAnsi="Times New Roman"/>
+                <w:bCs/>
+                <w:sz w:val="22"/>
+                <w:szCs w:val="22"/>
+              </w:rPr>
+              <w:t xml:space="preserve"> }</w:t>
+            </w:r>
+            <w:proofErr w:type="gramEnd"/>
+            <w:r>
+              <w:rPr>
+                <w:rFonts w:ascii="Times New Roman" w:hAnsi="Times New Roman"/>
+                <w:bCs/>
+                <w:sz w:val="22"/>
+                <w:szCs w:val="22"/>
+              </w:rPr>
+              <w:t>})</w:t>
             </w:r>
           </w:p>
           <w:p>
@@ -735,14 +1090,65 @@
                 <w:szCs w:val="22"/>
               </w:rPr>
             </w:pPr>
-            <w:r>
-              <w:rPr>
-                <w:rFonts w:ascii="Times New Roman" w:hAnsi="Times New Roman"/>
-                <w:bCs/>
-                <w:sz w:val="22"/>
-                <w:szCs w:val="22"/>
-              </w:rPr>
-              <w:t>{{ analyst_name }}</w:t>
+            <w:proofErr w:type="gramStart"/>
+            <w:r>
+              <w:rPr>
+                <w:rFonts w:ascii="Times New Roman" w:hAnsi="Times New Roman"/>
+                <w:bCs/>
+                <w:sz w:val="22"/>
+                <w:szCs w:val="22"/>
+              </w:rPr>
+              <w:t xml:space="preserve">{{ </w:t>
+            </w:r>
+            <w:proofErr w:type="spellStart"/>
+            <w:r>
+              <w:rPr>
+                <w:rFonts w:ascii="Times New Roman" w:hAnsi="Times New Roman"/>
+                <w:bCs/>
+                <w:sz w:val="22"/>
+                <w:szCs w:val="22"/>
+              </w:rPr>
+              <w:t>analyst</w:t>
+            </w:r>
+            <w:proofErr w:type="gramEnd"/>
+            <w:r>
+              <w:rPr>
+                <w:rFonts w:ascii="Times New Roman" w:hAnsi="Times New Roman"/>
+                <w:bCs/>
+                <w:sz w:val="22"/>
+                <w:szCs w:val="22"/>
+              </w:rPr>
+              <w:t>_</w:t>
+            </w:r>
+            <w:proofErr w:type="gramStart"/>
+            <w:r>
+              <w:rPr>
+                <w:rFonts w:ascii="Times New Roman" w:hAnsi="Times New Roman"/>
+                <w:bCs/>
+                <w:sz w:val="22"/>
+                <w:szCs w:val="22"/>
+              </w:rPr>
+              <w:t>name</w:t>
+            </w:r>
+            <w:proofErr w:type="spellEnd"/>
+            <w:r>
+              <w:rPr>
+                <w:rFonts w:ascii="Times New Roman" w:hAnsi="Times New Roman"/>
+                <w:bCs/>
+                <w:sz w:val="22"/>
+                <w:szCs w:val="22"/>
+              </w:rPr>
+              <w:t xml:space="preserve"> }</w:t>
+            </w:r>
+            <w:proofErr w:type="gramEnd"/>
+            <w:r>
+              <w:rPr>
+                <w:rFonts w:ascii="Times New Roman" w:hAnsi="Times New Roman"/>
+                <w:bCs/>
+                <w:sz w:val="22"/>
+                <w:szCs w:val="22"/>
+              </w:rPr>
+              <w:t>}</w:t>
             </w:r>
             <w:r>
               <w:rPr>
@@ -753,14 +1159,65 @@
               </w:rPr>
               <w:t xml:space="preserve"> (</w:t>
             </w:r>
-            <w:r>
-              <w:rPr>
-                <w:rFonts w:ascii="Times New Roman" w:hAnsi="Times New Roman"/>
-                <w:bCs/>
-                <w:sz w:val="22"/>
-                <w:szCs w:val="22"/>
-              </w:rPr>
-              <w:t>{{ analyst_initial }})</w:t>
+            <w:proofErr w:type="gramStart"/>
+            <w:r>
+              <w:rPr>
+                <w:rFonts w:ascii="Times New Roman" w:hAnsi="Times New Roman"/>
+                <w:bCs/>
+                <w:sz w:val="22"/>
+                <w:szCs w:val="22"/>
+              </w:rPr>
+              <w:t xml:space="preserve">{{ </w:t>
+            </w:r>
+            <w:proofErr w:type="spellStart"/>
+            <w:r>
+              <w:rPr>
+                <w:rFonts w:ascii="Times New Roman" w:hAnsi="Times New Roman"/>
+                <w:bCs/>
+                <w:sz w:val="22"/>
+                <w:szCs w:val="22"/>
+              </w:rPr>
+              <w:t>analyst</w:t>
+            </w:r>
+            <w:proofErr w:type="gramEnd"/>
+            <w:r>
+              <w:rPr>
+                <w:rFonts w:ascii="Times New Roman" w:hAnsi="Times New Roman"/>
+                <w:bCs/>
+                <w:sz w:val="22"/>
+                <w:szCs w:val="22"/>
+              </w:rPr>
+              <w:t>_</w:t>
+            </w:r>
+            <w:proofErr w:type="gramStart"/>
+            <w:r>
+              <w:rPr>
+                <w:rFonts w:ascii="Times New Roman" w:hAnsi="Times New Roman"/>
+                <w:bCs/>
+                <w:sz w:val="22"/>
+                <w:szCs w:val="22"/>
+              </w:rPr>
+              <w:t>initial</w:t>
+            </w:r>
+            <w:proofErr w:type="spellEnd"/>
+            <w:r>
+              <w:rPr>
+                <w:rFonts w:ascii="Times New Roman" w:hAnsi="Times New Roman"/>
+                <w:bCs/>
+                <w:sz w:val="22"/>
+                <w:szCs w:val="22"/>
+              </w:rPr>
+              <w:t xml:space="preserve"> }</w:t>
+            </w:r>
+            <w:proofErr w:type="gramEnd"/>
+            <w:r>
+              <w:rPr>
+                <w:rFonts w:ascii="Times New Roman" w:hAnsi="Times New Roman"/>
+                <w:bCs/>
+                <w:sz w:val="22"/>
+                <w:szCs w:val="22"/>
+              </w:rPr>
+              <w:t>})</w:t>
             </w:r>
           </w:p>
           <w:p>
@@ -814,6 +1271,7 @@
                 <w:szCs w:val="22"/>
               </w:rPr>
             </w:pPr>
+            <w:proofErr w:type="gramStart"/>
             <w:r>
               <w:rPr>
                 <w:rFonts w:ascii="Times New Roman" w:hAnsi="Times New Roman"/>
@@ -824,6 +1282,7 @@
               <w:t xml:space="preserve">{{ </w:t>
             </w:r>
             <w:bookmarkStart w:id="2" w:name="OLE_LINK19"/>
+            <w:proofErr w:type="spellStart"/>
             <w:r>
               <w:rPr>
                 <w:rFonts w:ascii="Times New Roman" w:eastAsiaTheme="minorEastAsia" w:hAnsi="Times New Roman" w:hint="eastAsia"/>
@@ -835,14 +1294,45 @@
               <w:t>subculture</w:t>
             </w:r>
             <w:bookmarkEnd w:id="2"/>
-            <w:r>
-              <w:rPr>
-                <w:rFonts w:ascii="Times New Roman" w:hAnsi="Times New Roman"/>
-                <w:bCs/>
-                <w:sz w:val="22"/>
-                <w:szCs w:val="22"/>
-              </w:rPr>
-              <w:t>_name }} (</w:t>
+            <w:proofErr w:type="gramEnd"/>
+            <w:r>
+              <w:rPr>
+                <w:rFonts w:ascii="Times New Roman" w:hAnsi="Times New Roman"/>
+                <w:bCs/>
+                <w:sz w:val="22"/>
+                <w:szCs w:val="22"/>
+              </w:rPr>
+              <w:t>_</w:t>
+            </w:r>
+            <w:proofErr w:type="gramStart"/>
+            <w:r>
+              <w:rPr>
+                <w:rFonts w:ascii="Times New Roman" w:hAnsi="Times New Roman"/>
+                <w:bCs/>
+                <w:sz w:val="22"/>
+                <w:szCs w:val="22"/>
+              </w:rPr>
+              <w:t>name</w:t>
+            </w:r>
+            <w:proofErr w:type="spellEnd"/>
+            <w:r>
+              <w:rPr>
+                <w:rFonts w:ascii="Times New Roman" w:hAnsi="Times New Roman"/>
+                <w:bCs/>
+                <w:sz w:val="22"/>
+                <w:szCs w:val="22"/>
+              </w:rPr>
+              <w:t xml:space="preserve"> }</w:t>
+            </w:r>
+            <w:proofErr w:type="gramEnd"/>
+            <w:r>
+              <w:rPr>
+                <w:rFonts w:ascii="Times New Roman" w:hAnsi="Times New Roman"/>
+                <w:bCs/>
+                <w:sz w:val="22"/>
+                <w:szCs w:val="22"/>
+              </w:rPr>
+              <w:t>} (</w:t>
             </w:r>
             <w:r>
               <w:rPr>
@@ -870,48 +1360,160 @@
                 <w:sz w:val="22"/>
                 <w:szCs w:val="22"/>
               </w:rPr>
+              <w:t xml:space="preserve"> _</w:t>
+            </w:r>
+            <w:proofErr w:type="gramStart"/>
+            <w:r>
+              <w:rPr>
+                <w:rFonts w:ascii="Times New Roman" w:hAnsi="Times New Roman"/>
+                <w:bCs/>
+                <w:sz w:val="22"/>
+                <w:szCs w:val="22"/>
+              </w:rPr>
+              <w:t>initial }</w:t>
+            </w:r>
+            <w:proofErr w:type="gramEnd"/>
+            <w:r>
+              <w:rPr>
+                <w:rFonts w:ascii="Times New Roman" w:hAnsi="Times New Roman"/>
+                <w:bCs/>
+                <w:sz w:val="22"/>
+                <w:szCs w:val="22"/>
+              </w:rPr>
+              <w:t>})</w:t>
+            </w:r>
+          </w:p>
+          <w:p>
+            <w:pPr>
+              <w:outlineLvl w:val="0"/>
+              <w:rPr>
+                <w:rFonts w:ascii="Times New Roman" w:eastAsiaTheme="minorEastAsia" w:hAnsi="Times New Roman"/>
+                <w:bCs/>
+                <w:sz w:val="22"/>
+                <w:szCs w:val="22"/>
+                <w:lang w:eastAsia="zh-CN"/>
+              </w:rPr>
+            </w:pPr>
+          </w:p>
+          <w:p>
+            <w:pPr>
+              <w:outlineLvl w:val="0"/>
+              <w:rPr>
+                <w:rFonts w:ascii="Times New Roman" w:hAnsi="Times New Roman"/>
+                <w:bCs/>
+                <w:sz w:val="22"/>
+                <w:szCs w:val="22"/>
+              </w:rPr>
+            </w:pPr>
+            <w:r>
+              <w:rPr>
+                <w:rFonts w:ascii="Times New Roman" w:hAnsi="Times New Roman"/>
+                <w:bCs/>
+                <w:sz w:val="22"/>
+                <w:szCs w:val="22"/>
+              </w:rPr>
+              <w:t>Reading</w:t>
+            </w:r>
+            <w:r>
+              <w:rPr>
+                <w:rFonts w:ascii="Times New Roman" w:hAnsi="Times New Roman"/>
+                <w:bCs/>
+                <w:sz w:val="22"/>
+                <w:szCs w:val="22"/>
+              </w:rPr>
               <w:t xml:space="preserve"> </w:t>
             </w:r>
             <w:r>
               <w:rPr>
-                <w:rFonts w:ascii="Times New Roman" w:hAnsi="Times New Roman"/>
-                <w:bCs/>
-                <w:sz w:val="22"/>
-                <w:szCs w:val="22"/>
-              </w:rPr>
-              <w:t>_initial }})</w:t>
-            </w:r>
-          </w:p>
-          <w:p>
-            <w:pPr>
-              <w:outlineLvl w:val="0"/>
-              <w:rPr>
                 <w:rFonts w:ascii="Times New Roman" w:eastAsiaTheme="minorEastAsia" w:hAnsi="Times New Roman" w:hint="eastAsia"/>
                 <w:bCs/>
                 <w:sz w:val="22"/>
                 <w:szCs w:val="22"/>
                 <w:lang w:eastAsia="zh-CN"/>
               </w:rPr>
-            </w:pPr>
-          </w:p>
-          <w:p>
-            <w:pPr>
-              <w:outlineLvl w:val="0"/>
-              <w:rPr>
-                <w:rFonts w:ascii="Times New Roman" w:hAnsi="Times New Roman"/>
-                <w:bCs/>
-                <w:sz w:val="22"/>
-                <w:szCs w:val="22"/>
-              </w:rPr>
-            </w:pPr>
-            <w:r>
-              <w:rPr>
-                <w:rFonts w:ascii="Times New Roman" w:hAnsi="Times New Roman"/>
-                <w:bCs/>
-                <w:sz w:val="22"/>
-                <w:szCs w:val="22"/>
-              </w:rPr>
-              <w:t>Reading</w:t>
+              <w:t>Analyst</w:t>
+            </w:r>
+            <w:r>
+              <w:rPr>
+                <w:rFonts w:ascii="Times New Roman" w:hAnsi="Times New Roman"/>
+                <w:bCs/>
+                <w:sz w:val="22"/>
+                <w:szCs w:val="22"/>
+              </w:rPr>
+              <w:t>:</w:t>
+            </w:r>
+          </w:p>
+          <w:p>
+            <w:pPr>
+              <w:outlineLvl w:val="0"/>
+              <w:rPr>
+                <w:rFonts w:ascii="Times New Roman" w:eastAsiaTheme="minorEastAsia" w:hAnsi="Times New Roman"/>
+                <w:bCs/>
+                <w:sz w:val="22"/>
+                <w:szCs w:val="22"/>
+                <w:lang w:eastAsia="zh-CN"/>
+              </w:rPr>
+            </w:pPr>
+            <w:bookmarkStart w:id="3" w:name="OLE_LINK18"/>
+            <w:proofErr w:type="gramStart"/>
+            <w:r>
+              <w:rPr>
+                <w:rFonts w:ascii="Times New Roman" w:hAnsi="Times New Roman"/>
+                <w:bCs/>
+                <w:sz w:val="22"/>
+                <w:szCs w:val="22"/>
+              </w:rPr>
+              <w:t xml:space="preserve">{{ </w:t>
+            </w:r>
+            <w:proofErr w:type="spellStart"/>
+            <w:r>
+              <w:rPr>
+                <w:rFonts w:ascii="Times New Roman" w:hAnsi="Times New Roman"/>
+                <w:bCs/>
+                <w:sz w:val="22"/>
+                <w:szCs w:val="22"/>
+              </w:rPr>
+              <w:t>reading</w:t>
+            </w:r>
+            <w:proofErr w:type="gramEnd"/>
+            <w:r>
+              <w:rPr>
+                <w:rFonts w:ascii="Times New Roman" w:hAnsi="Times New Roman"/>
+                <w:bCs/>
+                <w:sz w:val="22"/>
+                <w:szCs w:val="22"/>
+              </w:rPr>
+              <w:t>_</w:t>
+            </w:r>
+            <w:proofErr w:type="gramStart"/>
+            <w:r>
+              <w:rPr>
+                <w:rFonts w:ascii="Times New Roman" w:hAnsi="Times New Roman"/>
+                <w:bCs/>
+                <w:sz w:val="22"/>
+                <w:szCs w:val="22"/>
+              </w:rPr>
+              <w:t>name</w:t>
+            </w:r>
+            <w:proofErr w:type="spellEnd"/>
+            <w:r>
+              <w:rPr>
+                <w:rFonts w:ascii="Times New Roman" w:hAnsi="Times New Roman"/>
+                <w:bCs/>
+                <w:sz w:val="22"/>
+                <w:szCs w:val="22"/>
+              </w:rPr>
+              <w:t xml:space="preserve"> }</w:t>
+            </w:r>
+            <w:proofErr w:type="gramEnd"/>
+            <w:r>
+              <w:rPr>
+                <w:rFonts w:ascii="Times New Roman" w:hAnsi="Times New Roman"/>
+                <w:bCs/>
+                <w:sz w:val="22"/>
+                <w:szCs w:val="22"/>
+              </w:rPr>
+              <w:t>}</w:t>
             </w:r>
             <w:r>
               <w:rPr>
@@ -922,38 +1524,17 @@
               </w:rPr>
               <w:t xml:space="preserve"> </w:t>
             </w:r>
-            <w:r>
-              <w:rPr>
-                <w:rFonts w:ascii="Times New Roman" w:eastAsiaTheme="minorEastAsia" w:hAnsi="Times New Roman" w:hint="eastAsia"/>
-                <w:bCs/>
-                <w:sz w:val="22"/>
-                <w:szCs w:val="22"/>
-                <w:lang w:eastAsia="zh-CN"/>
-              </w:rPr>
-              <w:t>Analyst</w:t>
-            </w:r>
-            <w:r>
-              <w:rPr>
-                <w:rFonts w:ascii="Times New Roman" w:hAnsi="Times New Roman"/>
-                <w:bCs/>
-                <w:sz w:val="22"/>
-                <w:szCs w:val="22"/>
-              </w:rPr>
-              <w:t>:</w:t>
-            </w:r>
-          </w:p>
-          <w:p>
-            <w:pPr>
-              <w:outlineLvl w:val="0"/>
-              <w:rPr>
-                <w:rFonts w:ascii="Times New Roman" w:eastAsiaTheme="minorEastAsia" w:hAnsi="Times New Roman"/>
-                <w:bCs/>
-                <w:sz w:val="22"/>
-                <w:szCs w:val="22"/>
-                <w:lang w:eastAsia="zh-CN"/>
-              </w:rPr>
-            </w:pPr>
-            <w:bookmarkStart w:id="3" w:name="OLE_LINK18"/>
+            <w:bookmarkEnd w:id="3"/>
+            <w:r>
+              <w:rPr>
+                <w:rFonts w:ascii="Times New Roman" w:hAnsi="Times New Roman"/>
+                <w:bCs/>
+                <w:sz w:val="22"/>
+                <w:szCs w:val="22"/>
+              </w:rPr>
+              <w:t>(</w:t>
+            </w:r>
+            <w:proofErr w:type="gramStart"/>
             <w:r>
               <w:rPr>
                 <w:rFonts w:ascii="Times New Roman" w:hAnsi="Times New Roman"/>
@@ -963,6 +1544,7 @@
               </w:rPr>
               <w:t xml:space="preserve">{{ </w:t>
             </w:r>
+            <w:proofErr w:type="spellStart"/>
             <w:r>
               <w:rPr>
                 <w:rFonts w:ascii="Times New Roman" w:hAnsi="Times New Roman"/>
@@ -972,61 +1554,7 @@
               </w:rPr>
               <w:t>reading</w:t>
             </w:r>
-            <w:r>
-              <w:rPr>
-                <w:rFonts w:ascii="Times New Roman" w:hAnsi="Times New Roman"/>
-                <w:bCs/>
-                <w:sz w:val="22"/>
-                <w:szCs w:val="22"/>
-              </w:rPr>
-              <w:t>_name</w:t>
-            </w:r>
-            <w:r>
-              <w:rPr>
-                <w:rFonts w:ascii="Times New Roman" w:hAnsi="Times New Roman"/>
-                <w:bCs/>
-                <w:sz w:val="22"/>
-                <w:szCs w:val="22"/>
-              </w:rPr>
-              <w:t xml:space="preserve"> }}</w:t>
-            </w:r>
-            <w:r>
-              <w:rPr>
-                <w:rFonts w:ascii="Times New Roman" w:hAnsi="Times New Roman"/>
-                <w:bCs/>
-                <w:sz w:val="22"/>
-                <w:szCs w:val="22"/>
-              </w:rPr>
-              <w:t xml:space="preserve"> </w:t>
-            </w:r>
-            <w:bookmarkEnd w:id="3"/>
-            <w:r>
-              <w:rPr>
-                <w:rFonts w:ascii="Times New Roman" w:hAnsi="Times New Roman"/>
-                <w:bCs/>
-                <w:sz w:val="22"/>
-                <w:szCs w:val="22"/>
-              </w:rPr>
-              <w:t>(</w:t>
-            </w:r>
-            <w:r>
-              <w:rPr>
-                <w:rFonts w:ascii="Times New Roman" w:hAnsi="Times New Roman"/>
-                <w:bCs/>
-                <w:sz w:val="22"/>
-                <w:szCs w:val="22"/>
-              </w:rPr>
-              <w:t xml:space="preserve">{{ </w:t>
-            </w:r>
-            <w:r>
-              <w:rPr>
-                <w:rFonts w:ascii="Times New Roman" w:hAnsi="Times New Roman"/>
-                <w:bCs/>
-                <w:sz w:val="22"/>
-                <w:szCs w:val="22"/>
-              </w:rPr>
-              <w:t>reading</w:t>
-            </w:r>
+            <w:proofErr w:type="gramEnd"/>
             <w:r>
               <w:rPr>
                 <w:rFonts w:ascii="Times New Roman" w:hAnsi="Times New Roman"/>
@@ -1036,6 +1564,7 @@
               </w:rPr>
               <w:t>_initial</w:t>
             </w:r>
+            <w:proofErr w:type="spellEnd"/>
             <w:r>
               <w:rPr>
                 <w:rFonts w:ascii="Times New Roman" w:hAnsi="Times New Roman"/>
@@ -1089,14 +1618,45 @@
                 <w:szCs w:val="22"/>
               </w:rPr>
             </w:pPr>
-            <w:r>
-              <w:rPr>
-                <w:rFonts w:ascii="Times New Roman" w:hAnsi="Times New Roman"/>
-                <w:bCs/>
-                <w:sz w:val="22"/>
-                <w:szCs w:val="22"/>
-              </w:rPr>
-              <w:t>{{ sample_name }}</w:t>
+            <w:proofErr w:type="gramStart"/>
+            <w:r>
+              <w:rPr>
+                <w:rFonts w:ascii="Times New Roman" w:hAnsi="Times New Roman"/>
+                <w:bCs/>
+                <w:sz w:val="22"/>
+                <w:szCs w:val="22"/>
+              </w:rPr>
+              <w:t xml:space="preserve">{{ </w:t>
+            </w:r>
+            <w:proofErr w:type="spellStart"/>
+            <w:r>
+              <w:rPr>
+                <w:rFonts w:ascii="Times New Roman" w:hAnsi="Times New Roman"/>
+                <w:bCs/>
+                <w:sz w:val="22"/>
+                <w:szCs w:val="22"/>
+              </w:rPr>
+              <w:t>sample</w:t>
+            </w:r>
+            <w:proofErr w:type="gramEnd"/>
+            <w:r>
+              <w:rPr>
+                <w:rFonts w:ascii="Times New Roman" w:hAnsi="Times New Roman"/>
+                <w:bCs/>
+                <w:sz w:val="22"/>
+                <w:szCs w:val="22"/>
+              </w:rPr>
+              <w:t>_name</w:t>
+            </w:r>
+            <w:proofErr w:type="spellEnd"/>
+            <w:r>
+              <w:rPr>
+                <w:rFonts w:ascii="Times New Roman" w:hAnsi="Times New Roman"/>
+                <w:bCs/>
+                <w:sz w:val="22"/>
+                <w:szCs w:val="22"/>
+              </w:rPr>
+              <w:t xml:space="preserve"> }}</w:t>
             </w:r>
           </w:p>
         </w:tc>
@@ -1144,14 +1704,45 @@
                 <w:szCs w:val="22"/>
               </w:rPr>
             </w:pPr>
-            <w:r>
-              <w:rPr>
-                <w:rFonts w:ascii="Times New Roman" w:hAnsi="Times New Roman"/>
-                <w:bCs/>
-                <w:sz w:val="22"/>
-                <w:szCs w:val="22"/>
-              </w:rPr>
-              <w:t>{{ lot_number }}</w:t>
+            <w:proofErr w:type="gramStart"/>
+            <w:r>
+              <w:rPr>
+                <w:rFonts w:ascii="Times New Roman" w:hAnsi="Times New Roman"/>
+                <w:bCs/>
+                <w:sz w:val="22"/>
+                <w:szCs w:val="22"/>
+              </w:rPr>
+              <w:t xml:space="preserve">{{ </w:t>
+            </w:r>
+            <w:proofErr w:type="spellStart"/>
+            <w:r>
+              <w:rPr>
+                <w:rFonts w:ascii="Times New Roman" w:hAnsi="Times New Roman"/>
+                <w:bCs/>
+                <w:sz w:val="22"/>
+                <w:szCs w:val="22"/>
+              </w:rPr>
+              <w:t>lot</w:t>
+            </w:r>
+            <w:proofErr w:type="gramEnd"/>
+            <w:r>
+              <w:rPr>
+                <w:rFonts w:ascii="Times New Roman" w:hAnsi="Times New Roman"/>
+                <w:bCs/>
+                <w:sz w:val="22"/>
+                <w:szCs w:val="22"/>
+              </w:rPr>
+              <w:t>_number</w:t>
+            </w:r>
+            <w:proofErr w:type="spellEnd"/>
+            <w:r>
+              <w:rPr>
+                <w:rFonts w:ascii="Times New Roman" w:hAnsi="Times New Roman"/>
+                <w:bCs/>
+                <w:sz w:val="22"/>
+                <w:szCs w:val="22"/>
+              </w:rPr>
+              <w:t xml:space="preserve"> }}</w:t>
             </w:r>
           </w:p>
         </w:tc>
@@ -1238,14 +1829,45 @@
                 <w:szCs w:val="22"/>
               </w:rPr>
             </w:pPr>
-            <w:r>
-              <w:rPr>
-                <w:rFonts w:ascii="Times New Roman" w:hAnsi="Times New Roman"/>
-                <w:bCs/>
-                <w:sz w:val="22"/>
-                <w:szCs w:val="22"/>
-              </w:rPr>
-              <w:t>{{ dosage_form}}</w:t>
+            <w:proofErr w:type="gramStart"/>
+            <w:r>
+              <w:rPr>
+                <w:rFonts w:ascii="Times New Roman" w:hAnsi="Times New Roman"/>
+                <w:bCs/>
+                <w:sz w:val="22"/>
+                <w:szCs w:val="22"/>
+              </w:rPr>
+              <w:t xml:space="preserve">{{ </w:t>
+            </w:r>
+            <w:proofErr w:type="spellStart"/>
+            <w:r>
+              <w:rPr>
+                <w:rFonts w:ascii="Times New Roman" w:hAnsi="Times New Roman"/>
+                <w:bCs/>
+                <w:sz w:val="22"/>
+                <w:szCs w:val="22"/>
+              </w:rPr>
+              <w:t>dosage</w:t>
+            </w:r>
+            <w:proofErr w:type="gramEnd"/>
+            <w:r>
+              <w:rPr>
+                <w:rFonts w:ascii="Times New Roman" w:hAnsi="Times New Roman"/>
+                <w:bCs/>
+                <w:sz w:val="22"/>
+                <w:szCs w:val="22"/>
+              </w:rPr>
+              <w:t>_form</w:t>
+            </w:r>
+            <w:proofErr w:type="spellEnd"/>
+            <w:r>
+              <w:rPr>
+                <w:rFonts w:ascii="Times New Roman" w:hAnsi="Times New Roman"/>
+                <w:bCs/>
+                <w:sz w:val="22"/>
+                <w:szCs w:val="22"/>
+              </w:rPr>
+              <w:t>}}</w:t>
             </w:r>
           </w:p>
         </w:tc>
@@ -1353,7 +1975,55 @@
               </w:rPr>
             </w:pPr>
             <w:r>
-              <w:t xml:space="preserve">On {{ test_date }}, sample {{ sample_id }} was found positive for viable microorganisms after USP &lt;71&gt; sterility testing. </w:t>
+              <w:t xml:space="preserve">On </w:t>
+            </w:r>
+            <w:proofErr w:type="gramStart"/>
+            <w:r>
+              <w:t xml:space="preserve">{{ </w:t>
+            </w:r>
+            <w:proofErr w:type="spellStart"/>
+            <w:r>
+              <w:t>test</w:t>
+            </w:r>
+            <w:proofErr w:type="gramEnd"/>
+            <w:r>
+              <w:t>_</w:t>
+            </w:r>
+            <w:proofErr w:type="gramStart"/>
+            <w:r>
+              <w:t>date</w:t>
+            </w:r>
+            <w:proofErr w:type="spellEnd"/>
+            <w:r>
+              <w:t xml:space="preserve"> }</w:t>
+            </w:r>
+            <w:proofErr w:type="gramEnd"/>
+            <w:r>
+              <w:t xml:space="preserve">}, sample </w:t>
+            </w:r>
+            <w:proofErr w:type="gramStart"/>
+            <w:r>
+              <w:t xml:space="preserve">{{ </w:t>
+            </w:r>
+            <w:proofErr w:type="spellStart"/>
+            <w:r>
+              <w:t>sample</w:t>
+            </w:r>
+            <w:proofErr w:type="gramEnd"/>
+            <w:r>
+              <w:t>_</w:t>
+            </w:r>
+            <w:proofErr w:type="gramStart"/>
+            <w:r>
+              <w:t>id</w:t>
+            </w:r>
+            <w:proofErr w:type="spellEnd"/>
+            <w:r>
+              <w:t xml:space="preserve"> }</w:t>
+            </w:r>
+            <w:proofErr w:type="gramEnd"/>
+            <w:r>
+              <w:t xml:space="preserve">} was found positive for viable microorganisms after USP &lt;71&gt; sterility testing. </w:t>
             </w:r>
           </w:p>
           <w:p>
@@ -1663,8 +2333,19 @@
                 <w:sz w:val="22"/>
                 <w:szCs w:val="22"/>
               </w:rPr>
-              <w:t>SOP / Test Method #:</w:t>
-            </w:r>
+              <w:t xml:space="preserve">SOP / Test </w:t>
+            </w:r>
+            <w:proofErr w:type="gramStart"/>
+            <w:r>
+              <w:rPr>
+                <w:rFonts w:ascii="Times New Roman" w:hAnsi="Times New Roman"/>
+                <w:bCs/>
+                <w:sz w:val="22"/>
+                <w:szCs w:val="22"/>
+              </w:rPr>
+              <w:t>Method #:</w:t>
+            </w:r>
+            <w:proofErr w:type="gramEnd"/>
           </w:p>
           <w:p>
             <w:pPr>
@@ -1980,14 +2661,65 @@
                 <w:szCs w:val="22"/>
               </w:rPr>
             </w:pPr>
-            <w:r>
-              <w:rPr>
-                <w:rFonts w:ascii="Times New Roman" w:hAnsi="Times New Roman"/>
-                <w:bCs/>
-                <w:sz w:val="22"/>
-                <w:szCs w:val="22"/>
-              </w:rPr>
-              <w:t>{{ test_date }}</w:t>
+            <w:proofErr w:type="gramStart"/>
+            <w:r>
+              <w:rPr>
+                <w:rFonts w:ascii="Times New Roman" w:hAnsi="Times New Roman"/>
+                <w:bCs/>
+                <w:sz w:val="22"/>
+                <w:szCs w:val="22"/>
+              </w:rPr>
+              <w:t xml:space="preserve">{{ </w:t>
+            </w:r>
+            <w:proofErr w:type="spellStart"/>
+            <w:r>
+              <w:rPr>
+                <w:rFonts w:ascii="Times New Roman" w:hAnsi="Times New Roman"/>
+                <w:bCs/>
+                <w:sz w:val="22"/>
+                <w:szCs w:val="22"/>
+              </w:rPr>
+              <w:t>test</w:t>
+            </w:r>
+            <w:proofErr w:type="gramEnd"/>
+            <w:r>
+              <w:rPr>
+                <w:rFonts w:ascii="Times New Roman" w:hAnsi="Times New Roman"/>
+                <w:bCs/>
+                <w:sz w:val="22"/>
+                <w:szCs w:val="22"/>
+              </w:rPr>
+              <w:t>_</w:t>
+            </w:r>
+            <w:proofErr w:type="gramStart"/>
+            <w:r>
+              <w:rPr>
+                <w:rFonts w:ascii="Times New Roman" w:hAnsi="Times New Roman"/>
+                <w:bCs/>
+                <w:sz w:val="22"/>
+                <w:szCs w:val="22"/>
+              </w:rPr>
+              <w:t>date</w:t>
+            </w:r>
+            <w:proofErr w:type="spellEnd"/>
+            <w:r>
+              <w:rPr>
+                <w:rFonts w:ascii="Times New Roman" w:hAnsi="Times New Roman"/>
+                <w:bCs/>
+                <w:sz w:val="22"/>
+                <w:szCs w:val="22"/>
+              </w:rPr>
+              <w:t xml:space="preserve"> }</w:t>
+            </w:r>
+            <w:proofErr w:type="gramEnd"/>
+            <w:r>
+              <w:rPr>
+                <w:rFonts w:ascii="Times New Roman" w:hAnsi="Times New Roman"/>
+                <w:bCs/>
+                <w:sz w:val="22"/>
+                <w:szCs w:val="22"/>
+              </w:rPr>
+              <w:t>}</w:t>
             </w:r>
           </w:p>
           <w:p>
@@ -2576,23 +3308,125 @@
               <w:t xml:space="preserve">analysts </w:t>
             </w:r>
             <w:bookmarkStart w:id="6" w:name="OLE_LINK25"/>
-            <w:r>
-              <w:rPr>
-                <w:rFonts w:ascii="Times New Roman" w:hAnsi="Times New Roman"/>
-                <w:bCs/>
-                <w:sz w:val="22"/>
-                <w:szCs w:val="22"/>
-              </w:rPr>
-              <w:t xml:space="preserve">{{ prepper_name }}, </w:t>
-            </w:r>
-            <w:r>
-              <w:rPr>
-                <w:rFonts w:ascii="Times New Roman" w:hAnsi="Times New Roman"/>
-                <w:bCs/>
-                <w:sz w:val="22"/>
-                <w:szCs w:val="22"/>
-              </w:rPr>
-              <w:t>{{ analyst_name }}</w:t>
+            <w:proofErr w:type="gramStart"/>
+            <w:r>
+              <w:rPr>
+                <w:rFonts w:ascii="Times New Roman" w:hAnsi="Times New Roman"/>
+                <w:bCs/>
+                <w:sz w:val="22"/>
+                <w:szCs w:val="22"/>
+              </w:rPr>
+              <w:t xml:space="preserve">{{ </w:t>
+            </w:r>
+            <w:proofErr w:type="spellStart"/>
+            <w:r>
+              <w:rPr>
+                <w:rFonts w:ascii="Times New Roman" w:hAnsi="Times New Roman"/>
+                <w:bCs/>
+                <w:sz w:val="22"/>
+                <w:szCs w:val="22"/>
+              </w:rPr>
+              <w:t>prepper</w:t>
+            </w:r>
+            <w:proofErr w:type="gramEnd"/>
+            <w:r>
+              <w:rPr>
+                <w:rFonts w:ascii="Times New Roman" w:hAnsi="Times New Roman"/>
+                <w:bCs/>
+                <w:sz w:val="22"/>
+                <w:szCs w:val="22"/>
+              </w:rPr>
+              <w:t>_</w:t>
+            </w:r>
+            <w:proofErr w:type="gramStart"/>
+            <w:r>
+              <w:rPr>
+                <w:rFonts w:ascii="Times New Roman" w:hAnsi="Times New Roman"/>
+                <w:bCs/>
+                <w:sz w:val="22"/>
+                <w:szCs w:val="22"/>
+              </w:rPr>
+              <w:t>name</w:t>
+            </w:r>
+            <w:proofErr w:type="spellEnd"/>
+            <w:r>
+              <w:rPr>
+                <w:rFonts w:ascii="Times New Roman" w:hAnsi="Times New Roman"/>
+                <w:bCs/>
+                <w:sz w:val="22"/>
+                <w:szCs w:val="22"/>
+              </w:rPr>
+              <w:t xml:space="preserve"> }</w:t>
+            </w:r>
+            <w:proofErr w:type="gramEnd"/>
+            <w:r>
+              <w:rPr>
+                <w:rFonts w:ascii="Times New Roman" w:hAnsi="Times New Roman"/>
+                <w:bCs/>
+                <w:sz w:val="22"/>
+                <w:szCs w:val="22"/>
+              </w:rPr>
+              <w:t xml:space="preserve">}, </w:t>
+            </w:r>
+            <w:proofErr w:type="gramStart"/>
+            <w:r>
+              <w:rPr>
+                <w:rFonts w:ascii="Times New Roman" w:hAnsi="Times New Roman"/>
+                <w:bCs/>
+                <w:sz w:val="22"/>
+                <w:szCs w:val="22"/>
+              </w:rPr>
+              <w:t xml:space="preserve">{{ </w:t>
+            </w:r>
+            <w:proofErr w:type="spellStart"/>
+            <w:r>
+              <w:rPr>
+                <w:rFonts w:ascii="Times New Roman" w:hAnsi="Times New Roman"/>
+                <w:bCs/>
+                <w:sz w:val="22"/>
+                <w:szCs w:val="22"/>
+              </w:rPr>
+              <w:t>analyst</w:t>
+            </w:r>
+            <w:proofErr w:type="gramEnd"/>
+            <w:r>
+              <w:rPr>
+                <w:rFonts w:ascii="Times New Roman" w:hAnsi="Times New Roman"/>
+                <w:bCs/>
+                <w:sz w:val="22"/>
+                <w:szCs w:val="22"/>
+              </w:rPr>
+              <w:t>_</w:t>
+            </w:r>
+            <w:proofErr w:type="gramStart"/>
+            <w:r>
+              <w:rPr>
+                <w:rFonts w:ascii="Times New Roman" w:hAnsi="Times New Roman"/>
+                <w:bCs/>
+                <w:sz w:val="22"/>
+                <w:szCs w:val="22"/>
+              </w:rPr>
+              <w:t>name</w:t>
+            </w:r>
+            <w:proofErr w:type="spellEnd"/>
+            <w:r>
+              <w:rPr>
+                <w:rFonts w:ascii="Times New Roman" w:hAnsi="Times New Roman"/>
+                <w:bCs/>
+                <w:sz w:val="22"/>
+                <w:szCs w:val="22"/>
+              </w:rPr>
+              <w:t xml:space="preserve"> }</w:t>
+            </w:r>
+            <w:proofErr w:type="gramEnd"/>
+            <w:r>
+              <w:rPr>
+                <w:rFonts w:ascii="Times New Roman" w:hAnsi="Times New Roman"/>
+                <w:bCs/>
+                <w:sz w:val="22"/>
+                <w:szCs w:val="22"/>
+              </w:rPr>
+              <w:t>}</w:t>
             </w:r>
             <w:r>
               <w:rPr>
@@ -2603,6 +3437,7 @@
               </w:rPr>
               <w:t xml:space="preserve">, </w:t>
             </w:r>
+            <w:proofErr w:type="gramStart"/>
             <w:r>
               <w:rPr>
                 <w:rFonts w:ascii="Times New Roman" w:hAnsi="Times New Roman"/>
@@ -2612,6 +3447,7 @@
               </w:rPr>
               <w:t xml:space="preserve">{{ </w:t>
             </w:r>
+            <w:proofErr w:type="spellStart"/>
             <w:r>
               <w:rPr>
                 <w:rFonts w:ascii="Times New Roman" w:eastAsiaTheme="minorEastAsia" w:hAnsi="Times New Roman" w:hint="eastAsia"/>
@@ -2622,14 +3458,45 @@
               </w:rPr>
               <w:t>subculture</w:t>
             </w:r>
-            <w:r>
-              <w:rPr>
-                <w:rFonts w:ascii="Times New Roman" w:hAnsi="Times New Roman"/>
-                <w:bCs/>
-                <w:sz w:val="22"/>
-                <w:szCs w:val="22"/>
-              </w:rPr>
-              <w:t>_name }}</w:t>
+            <w:proofErr w:type="gramEnd"/>
+            <w:r>
+              <w:rPr>
+                <w:rFonts w:ascii="Times New Roman" w:hAnsi="Times New Roman"/>
+                <w:bCs/>
+                <w:sz w:val="22"/>
+                <w:szCs w:val="22"/>
+              </w:rPr>
+              <w:t>_</w:t>
+            </w:r>
+            <w:proofErr w:type="gramStart"/>
+            <w:r>
+              <w:rPr>
+                <w:rFonts w:ascii="Times New Roman" w:hAnsi="Times New Roman"/>
+                <w:bCs/>
+                <w:sz w:val="22"/>
+                <w:szCs w:val="22"/>
+              </w:rPr>
+              <w:t>name</w:t>
+            </w:r>
+            <w:proofErr w:type="spellEnd"/>
+            <w:r>
+              <w:rPr>
+                <w:rFonts w:ascii="Times New Roman" w:hAnsi="Times New Roman"/>
+                <w:bCs/>
+                <w:sz w:val="22"/>
+                <w:szCs w:val="22"/>
+              </w:rPr>
+              <w:t xml:space="preserve"> }</w:t>
+            </w:r>
+            <w:proofErr w:type="gramEnd"/>
+            <w:r>
+              <w:rPr>
+                <w:rFonts w:ascii="Times New Roman" w:hAnsi="Times New Roman"/>
+                <w:bCs/>
+                <w:sz w:val="22"/>
+                <w:szCs w:val="22"/>
+              </w:rPr>
+              <w:t>}</w:t>
             </w:r>
             <w:r>
               <w:rPr>
@@ -2651,6 +3518,7 @@
               </w:rPr>
               <w:t xml:space="preserve">and </w:t>
             </w:r>
+            <w:proofErr w:type="gramStart"/>
             <w:r>
               <w:rPr>
                 <w:rFonts w:ascii="Times New Roman" w:hAnsi="Times New Roman"/>
@@ -2660,6 +3528,7 @@
               </w:rPr>
               <w:t xml:space="preserve">{{ </w:t>
             </w:r>
+            <w:proofErr w:type="spellStart"/>
             <w:r>
               <w:rPr>
                 <w:rFonts w:ascii="Times New Roman" w:hAnsi="Times New Roman"/>
@@ -2669,14 +3538,45 @@
               </w:rPr>
               <w:t>reading</w:t>
             </w:r>
-            <w:r>
-              <w:rPr>
-                <w:rFonts w:ascii="Times New Roman" w:hAnsi="Times New Roman"/>
-                <w:bCs/>
-                <w:sz w:val="22"/>
-                <w:szCs w:val="22"/>
-              </w:rPr>
-              <w:t xml:space="preserve">_name }} </w:t>
+            <w:proofErr w:type="gramEnd"/>
+            <w:r>
+              <w:rPr>
+                <w:rFonts w:ascii="Times New Roman" w:hAnsi="Times New Roman"/>
+                <w:bCs/>
+                <w:sz w:val="22"/>
+                <w:szCs w:val="22"/>
+              </w:rPr>
+              <w:t>_</w:t>
+            </w:r>
+            <w:proofErr w:type="gramStart"/>
+            <w:r>
+              <w:rPr>
+                <w:rFonts w:ascii="Times New Roman" w:hAnsi="Times New Roman"/>
+                <w:bCs/>
+                <w:sz w:val="22"/>
+                <w:szCs w:val="22"/>
+              </w:rPr>
+              <w:t>name</w:t>
+            </w:r>
+            <w:proofErr w:type="spellEnd"/>
+            <w:r>
+              <w:rPr>
+                <w:rFonts w:ascii="Times New Roman" w:hAnsi="Times New Roman"/>
+                <w:bCs/>
+                <w:sz w:val="22"/>
+                <w:szCs w:val="22"/>
+              </w:rPr>
+              <w:t xml:space="preserve"> }</w:t>
+            </w:r>
+            <w:proofErr w:type="gramEnd"/>
+            <w:r>
+              <w:rPr>
+                <w:rFonts w:ascii="Times New Roman" w:hAnsi="Times New Roman"/>
+                <w:bCs/>
+                <w:sz w:val="22"/>
+                <w:szCs w:val="22"/>
+              </w:rPr>
+              <w:t xml:space="preserve">} </w:t>
             </w:r>
             <w:bookmarkEnd w:id="5"/>
             <w:bookmarkEnd w:id="6"/>
@@ -2971,14 +3871,65 @@
               </w:rPr>
               <w:t xml:space="preserve">sample ID: </w:t>
             </w:r>
-            <w:r>
-              <w:rPr>
-                <w:rFonts w:ascii="Times New Roman" w:hAnsi="Times New Roman"/>
-                <w:bCs/>
-                <w:sz w:val="22"/>
-                <w:szCs w:val="22"/>
-              </w:rPr>
-              <w:t>{{ sample_id }}</w:t>
+            <w:proofErr w:type="gramStart"/>
+            <w:r>
+              <w:rPr>
+                <w:rFonts w:ascii="Times New Roman" w:hAnsi="Times New Roman"/>
+                <w:bCs/>
+                <w:sz w:val="22"/>
+                <w:szCs w:val="22"/>
+              </w:rPr>
+              <w:t xml:space="preserve">{{ </w:t>
+            </w:r>
+            <w:proofErr w:type="spellStart"/>
+            <w:r>
+              <w:rPr>
+                <w:rFonts w:ascii="Times New Roman" w:hAnsi="Times New Roman"/>
+                <w:bCs/>
+                <w:sz w:val="22"/>
+                <w:szCs w:val="22"/>
+              </w:rPr>
+              <w:t>sample</w:t>
+            </w:r>
+            <w:proofErr w:type="gramEnd"/>
+            <w:r>
+              <w:rPr>
+                <w:rFonts w:ascii="Times New Roman" w:hAnsi="Times New Roman"/>
+                <w:bCs/>
+                <w:sz w:val="22"/>
+                <w:szCs w:val="22"/>
+              </w:rPr>
+              <w:t>_</w:t>
+            </w:r>
+            <w:proofErr w:type="gramStart"/>
+            <w:r>
+              <w:rPr>
+                <w:rFonts w:ascii="Times New Roman" w:hAnsi="Times New Roman"/>
+                <w:bCs/>
+                <w:sz w:val="22"/>
+                <w:szCs w:val="22"/>
+              </w:rPr>
+              <w:t>id</w:t>
+            </w:r>
+            <w:proofErr w:type="spellEnd"/>
+            <w:r>
+              <w:rPr>
+                <w:rFonts w:ascii="Times New Roman" w:hAnsi="Times New Roman"/>
+                <w:bCs/>
+                <w:sz w:val="22"/>
+                <w:szCs w:val="22"/>
+              </w:rPr>
+              <w:t xml:space="preserve"> }</w:t>
+            </w:r>
+            <w:proofErr w:type="gramEnd"/>
+            <w:r>
+              <w:rPr>
+                <w:rFonts w:ascii="Times New Roman" w:hAnsi="Times New Roman"/>
+                <w:bCs/>
+                <w:sz w:val="22"/>
+                <w:szCs w:val="22"/>
+              </w:rPr>
+              <w:t>}</w:t>
             </w:r>
             <w:r>
               <w:rPr>
@@ -3576,7 +4527,25 @@
                 <w:sz w:val="22"/>
                 <w:szCs w:val="22"/>
               </w:rPr>
-              <w:t>Are the Test Result Records Attached &amp; Calculations Verified and Correct?</w:t>
+              <w:t xml:space="preserve">Are the Test Result Records Attached &amp; Calculations </w:t>
+            </w:r>
+            <w:proofErr w:type="gramStart"/>
+            <w:r>
+              <w:rPr>
+                <w:rFonts w:ascii="Times New Roman" w:hAnsi="Times New Roman"/>
+                <w:sz w:val="22"/>
+                <w:szCs w:val="22"/>
+              </w:rPr>
+              <w:t>Verified</w:t>
+            </w:r>
+            <w:proofErr w:type="gramEnd"/>
+            <w:r>
+              <w:rPr>
+                <w:rFonts w:ascii="Times New Roman" w:hAnsi="Times New Roman"/>
+                <w:sz w:val="22"/>
+                <w:szCs w:val="22"/>
+              </w:rPr>
+              <w:t xml:space="preserve"> and Correct?</w:t>
             </w:r>
           </w:p>
         </w:tc>
@@ -3808,7 +4777,25 @@
                 <w:sz w:val="22"/>
                 <w:szCs w:val="22"/>
               </w:rPr>
-              <w:t>Information is available in EagleTrax under</w:t>
+              <w:t xml:space="preserve">Information is available in </w:t>
+            </w:r>
+            <w:proofErr w:type="spellStart"/>
+            <w:r>
+              <w:rPr>
+                <w:rFonts w:ascii="Times New Roman" w:hAnsi="Times New Roman"/>
+                <w:sz w:val="22"/>
+                <w:szCs w:val="22"/>
+              </w:rPr>
+              <w:t>EagleTrax</w:t>
+            </w:r>
+            <w:proofErr w:type="spellEnd"/>
+            <w:r>
+              <w:rPr>
+                <w:rFonts w:ascii="Times New Roman" w:hAnsi="Times New Roman"/>
+                <w:sz w:val="22"/>
+                <w:szCs w:val="22"/>
+              </w:rPr>
+              <w:t xml:space="preserve"> under</w:t>
             </w:r>
             <w:r>
               <w:rPr>
@@ -3818,14 +4805,45 @@
               </w:rPr>
               <w:t xml:space="preserve"> </w:t>
             </w:r>
-            <w:r>
-              <w:rPr>
-                <w:rFonts w:ascii="Times New Roman" w:hAnsi="Times New Roman"/>
-                <w:bCs/>
-                <w:sz w:val="22"/>
-                <w:szCs w:val="22"/>
-              </w:rPr>
-              <w:t>{{ sample_id }}</w:t>
+            <w:proofErr w:type="gramStart"/>
+            <w:r>
+              <w:rPr>
+                <w:rFonts w:ascii="Times New Roman" w:hAnsi="Times New Roman"/>
+                <w:bCs/>
+                <w:sz w:val="22"/>
+                <w:szCs w:val="22"/>
+              </w:rPr>
+              <w:t xml:space="preserve">{{ </w:t>
+            </w:r>
+            <w:proofErr w:type="spellStart"/>
+            <w:r>
+              <w:rPr>
+                <w:rFonts w:ascii="Times New Roman" w:hAnsi="Times New Roman"/>
+                <w:bCs/>
+                <w:sz w:val="22"/>
+                <w:szCs w:val="22"/>
+              </w:rPr>
+              <w:t>sample</w:t>
+            </w:r>
+            <w:proofErr w:type="gramEnd"/>
+            <w:r>
+              <w:rPr>
+                <w:rFonts w:ascii="Times New Roman" w:hAnsi="Times New Roman"/>
+                <w:bCs/>
+                <w:sz w:val="22"/>
+                <w:szCs w:val="22"/>
+              </w:rPr>
+              <w:t>_id</w:t>
+            </w:r>
+            <w:proofErr w:type="spellEnd"/>
+            <w:r>
+              <w:rPr>
+                <w:rFonts w:ascii="Times New Roman" w:hAnsi="Times New Roman"/>
+                <w:bCs/>
+                <w:sz w:val="22"/>
+                <w:szCs w:val="22"/>
+              </w:rPr>
+              <w:t xml:space="preserve"> }}</w:t>
             </w:r>
           </w:p>
         </w:tc>
@@ -4398,7 +5416,25 @@
                 <w:sz w:val="22"/>
                 <w:szCs w:val="22"/>
               </w:rPr>
-              <w:t>Does the processing method/ method set conform to the required specification?</w:t>
+              <w:t xml:space="preserve">Does the processing method/ </w:t>
+            </w:r>
+            <w:proofErr w:type="gramStart"/>
+            <w:r>
+              <w:rPr>
+                <w:rFonts w:ascii="Times New Roman" w:hAnsi="Times New Roman"/>
+                <w:sz w:val="22"/>
+                <w:szCs w:val="22"/>
+              </w:rPr>
+              <w:t>method set</w:t>
+            </w:r>
+            <w:proofErr w:type="gramEnd"/>
+            <w:r>
+              <w:rPr>
+                <w:rFonts w:ascii="Times New Roman" w:hAnsi="Times New Roman"/>
+                <w:sz w:val="22"/>
+                <w:szCs w:val="22"/>
+              </w:rPr>
+              <w:t xml:space="preserve"> conform to the required specification?</w:t>
             </w:r>
           </w:p>
         </w:tc>
@@ -4902,7 +5938,25 @@
                 <w:sz w:val="22"/>
                 <w:szCs w:val="22"/>
               </w:rPr>
-              <w:t>Information is available in EagleTrax Sample</w:t>
+              <w:t xml:space="preserve">Information is available in </w:t>
+            </w:r>
+            <w:proofErr w:type="spellStart"/>
+            <w:r>
+              <w:rPr>
+                <w:rFonts w:ascii="Times New Roman" w:hAnsi="Times New Roman"/>
+                <w:sz w:val="22"/>
+                <w:szCs w:val="22"/>
+              </w:rPr>
+              <w:t>EagleTrax</w:t>
+            </w:r>
+            <w:proofErr w:type="spellEnd"/>
+            <w:r>
+              <w:rPr>
+                <w:rFonts w:ascii="Times New Roman" w:hAnsi="Times New Roman"/>
+                <w:sz w:val="22"/>
+                <w:szCs w:val="22"/>
+              </w:rPr>
+              <w:t xml:space="preserve"> Sample</w:t>
             </w:r>
             <w:bookmarkEnd w:id="7"/>
             <w:r>
@@ -4913,14 +5967,45 @@
               </w:rPr>
               <w:t xml:space="preserve"> Location History under </w:t>
             </w:r>
-            <w:r>
-              <w:rPr>
-                <w:rFonts w:ascii="Times New Roman" w:hAnsi="Times New Roman"/>
-                <w:bCs/>
-                <w:sz w:val="22"/>
-                <w:szCs w:val="22"/>
-              </w:rPr>
-              <w:t>{{ sample_id }}</w:t>
+            <w:proofErr w:type="gramStart"/>
+            <w:r>
+              <w:rPr>
+                <w:rFonts w:ascii="Times New Roman" w:hAnsi="Times New Roman"/>
+                <w:bCs/>
+                <w:sz w:val="22"/>
+                <w:szCs w:val="22"/>
+              </w:rPr>
+              <w:t xml:space="preserve">{{ </w:t>
+            </w:r>
+            <w:proofErr w:type="spellStart"/>
+            <w:r>
+              <w:rPr>
+                <w:rFonts w:ascii="Times New Roman" w:hAnsi="Times New Roman"/>
+                <w:bCs/>
+                <w:sz w:val="22"/>
+                <w:szCs w:val="22"/>
+              </w:rPr>
+              <w:t>sample</w:t>
+            </w:r>
+            <w:proofErr w:type="gramEnd"/>
+            <w:r>
+              <w:rPr>
+                <w:rFonts w:ascii="Times New Roman" w:hAnsi="Times New Roman"/>
+                <w:bCs/>
+                <w:sz w:val="22"/>
+                <w:szCs w:val="22"/>
+              </w:rPr>
+              <w:t>_id</w:t>
+            </w:r>
+            <w:proofErr w:type="spellEnd"/>
+            <w:r>
+              <w:rPr>
+                <w:rFonts w:ascii="Times New Roman" w:hAnsi="Times New Roman"/>
+                <w:bCs/>
+                <w:sz w:val="22"/>
+                <w:szCs w:val="22"/>
+              </w:rPr>
+              <w:t xml:space="preserve"> }}</w:t>
             </w:r>
           </w:p>
         </w:tc>
@@ -6080,7 +7165,25 @@
                 <w:sz w:val="22"/>
                 <w:szCs w:val="22"/>
               </w:rPr>
-              <w:t>Information is available in EagleTrax Sample</w:t>
+              <w:t xml:space="preserve">Information is available in </w:t>
+            </w:r>
+            <w:proofErr w:type="spellStart"/>
+            <w:r>
+              <w:rPr>
+                <w:rFonts w:ascii="Times New Roman" w:hAnsi="Times New Roman"/>
+                <w:sz w:val="22"/>
+                <w:szCs w:val="22"/>
+              </w:rPr>
+              <w:t>EagleTrax</w:t>
+            </w:r>
+            <w:proofErr w:type="spellEnd"/>
+            <w:r>
+              <w:rPr>
+                <w:rFonts w:ascii="Times New Roman" w:hAnsi="Times New Roman"/>
+                <w:sz w:val="22"/>
+                <w:szCs w:val="22"/>
+              </w:rPr>
+              <w:t xml:space="preserve"> Sample</w:t>
             </w:r>
             <w:r>
               <w:rPr>
@@ -6285,7 +7388,25 @@
                 <w:sz w:val="22"/>
                 <w:szCs w:val="22"/>
               </w:rPr>
-              <w:t>Information is available in EagleTrax Sample</w:t>
+              <w:t xml:space="preserve">Information is available in </w:t>
+            </w:r>
+            <w:proofErr w:type="spellStart"/>
+            <w:r>
+              <w:rPr>
+                <w:rFonts w:ascii="Times New Roman" w:hAnsi="Times New Roman"/>
+                <w:sz w:val="22"/>
+                <w:szCs w:val="22"/>
+              </w:rPr>
+              <w:t>EagleTrax</w:t>
+            </w:r>
+            <w:proofErr w:type="spellEnd"/>
+            <w:r>
+              <w:rPr>
+                <w:rFonts w:ascii="Times New Roman" w:hAnsi="Times New Roman"/>
+                <w:sz w:val="22"/>
+                <w:szCs w:val="22"/>
+              </w:rPr>
+              <w:t xml:space="preserve"> Sample</w:t>
             </w:r>
             <w:r>
               <w:rPr>
@@ -7638,39 +8759,39 @@
                 <w:sz w:val="22"/>
                 <w:szCs w:val="22"/>
               </w:rPr>
-              <w:t>E00</w:t>
-            </w:r>
-            <w:r>
-              <w:rPr>
-                <w:rFonts w:ascii="Times New Roman" w:hAnsi="Times New Roman"/>
-                <w:sz w:val="22"/>
-                <w:szCs w:val="22"/>
-              </w:rPr>
-              <w:t xml:space="preserve">{{ </w:t>
-            </w:r>
-            <w:r>
-              <w:rPr>
-                <w:rFonts w:ascii="Times New Roman" w:hAnsi="Times New Roman"/>
-                <w:sz w:val="22"/>
-                <w:szCs w:val="22"/>
-              </w:rPr>
-              <w:t>usp71</w:t>
-            </w:r>
-            <w:r>
-              <w:rPr>
-                <w:rFonts w:ascii="Times New Roman" w:hAnsi="Times New Roman"/>
-                <w:sz w:val="22"/>
-                <w:szCs w:val="22"/>
-              </w:rPr>
-              <w:t>_id</w:t>
-            </w:r>
-            <w:r>
-              <w:rPr>
-                <w:rFonts w:ascii="Times New Roman" w:hAnsi="Times New Roman"/>
-                <w:sz w:val="22"/>
-                <w:szCs w:val="22"/>
-              </w:rPr>
-              <w:t xml:space="preserve"> }}</w:t>
+              <w:t>ISO 5 BSC E00</w:t>
+            </w:r>
+            <w:r>
+              <w:rPr>
+                <w:rFonts w:ascii="Times New Roman" w:eastAsiaTheme="minorEastAsia" w:hAnsi="Times New Roman"/>
+                <w:bCs/>
+                <w:sz w:val="22"/>
+                <w:szCs w:val="22"/>
+                <w:lang w:eastAsia="zh-CN"/>
+              </w:rPr>
+              <w:t>{{</w:t>
+            </w:r>
+            <w:proofErr w:type="spellStart"/>
+            <w:r>
+              <w:rPr>
+                <w:rFonts w:ascii="Times New Roman" w:eastAsiaTheme="minorEastAsia" w:hAnsi="Times New Roman"/>
+                <w:bCs/>
+                <w:sz w:val="22"/>
+                <w:szCs w:val="22"/>
+                <w:lang w:eastAsia="zh-CN"/>
+              </w:rPr>
+              <w:t>bsc_id</w:t>
+            </w:r>
+            <w:proofErr w:type="spellEnd"/>
+            <w:r>
+              <w:rPr>
+                <w:rFonts w:ascii="Times New Roman" w:eastAsiaTheme="minorEastAsia" w:hAnsi="Times New Roman"/>
+                <w:bCs/>
+                <w:sz w:val="22"/>
+                <w:szCs w:val="22"/>
+                <w:lang w:eastAsia="zh-CN"/>
+              </w:rPr>
+              <w:t>}}</w:t>
             </w:r>
           </w:p>
         </w:tc>
@@ -7964,13 +9085,59 @@
               <w:t>E00</w:t>
             </w:r>
             <w:bookmarkStart w:id="11" w:name="OLE_LINK6"/>
-            <w:r>
-              <w:rPr>
-                <w:rFonts w:ascii="Times New Roman" w:hAnsi="Times New Roman"/>
-                <w:sz w:val="22"/>
-                <w:szCs w:val="22"/>
-              </w:rPr>
-              <w:t>{{ cr_id }}</w:t>
+            <w:proofErr w:type="gramStart"/>
+            <w:r>
+              <w:rPr>
+                <w:rFonts w:ascii="Times New Roman" w:hAnsi="Times New Roman"/>
+                <w:sz w:val="22"/>
+                <w:szCs w:val="22"/>
+              </w:rPr>
+              <w:t xml:space="preserve">{{ </w:t>
+            </w:r>
+            <w:proofErr w:type="spellStart"/>
+            <w:r>
+              <w:rPr>
+                <w:rFonts w:ascii="Times New Roman" w:hAnsi="Times New Roman"/>
+                <w:sz w:val="22"/>
+                <w:szCs w:val="22"/>
+              </w:rPr>
+              <w:t>cr</w:t>
+            </w:r>
+            <w:proofErr w:type="gramEnd"/>
+            <w:r>
+              <w:rPr>
+                <w:rFonts w:ascii="Times New Roman" w:hAnsi="Times New Roman"/>
+                <w:sz w:val="22"/>
+                <w:szCs w:val="22"/>
+              </w:rPr>
+              <w:t>_</w:t>
+            </w:r>
+            <w:proofErr w:type="gramStart"/>
+            <w:r>
+              <w:rPr>
+                <w:rFonts w:ascii="Times New Roman" w:hAnsi="Times New Roman"/>
+                <w:sz w:val="22"/>
+                <w:szCs w:val="22"/>
+              </w:rPr>
+              <w:t>id</w:t>
+            </w:r>
+            <w:proofErr w:type="spellEnd"/>
+            <w:r>
+              <w:rPr>
+                <w:rFonts w:ascii="Times New Roman" w:hAnsi="Times New Roman"/>
+                <w:sz w:val="22"/>
+                <w:szCs w:val="22"/>
+              </w:rPr>
+              <w:t xml:space="preserve"> }</w:t>
+            </w:r>
+            <w:proofErr w:type="gramEnd"/>
+            <w:r>
+              <w:rPr>
+                <w:rFonts w:ascii="Times New Roman" w:hAnsi="Times New Roman"/>
+                <w:sz w:val="22"/>
+                <w:szCs w:val="22"/>
+              </w:rPr>
+              <w:t>}</w:t>
             </w:r>
             <w:bookmarkEnd w:id="11"/>
             <w:r>
@@ -7988,7 +9155,16 @@
                 <w:sz w:val="22"/>
                 <w:szCs w:val="22"/>
               </w:rPr>
-              <w:t>(CR</w:t>
+              <w:t>(</w:t>
+            </w:r>
+            <w:proofErr w:type="gramStart"/>
+            <w:r>
+              <w:rPr>
+                <w:rFonts w:ascii="Times New Roman" w:hAnsi="Times New Roman"/>
+                <w:sz w:val="22"/>
+                <w:szCs w:val="22"/>
+              </w:rPr>
+              <w:t>CR</w:t>
             </w:r>
             <w:bookmarkStart w:id="13" w:name="OLE_LINK14"/>
             <w:r>
@@ -7997,7 +9173,52 @@
                 <w:sz w:val="22"/>
                 <w:szCs w:val="22"/>
               </w:rPr>
-              <w:t>{{ cr_suit }}</w:t>
+              <w:t xml:space="preserve">{{ </w:t>
+            </w:r>
+            <w:proofErr w:type="spellStart"/>
+            <w:r>
+              <w:rPr>
+                <w:rFonts w:ascii="Times New Roman" w:hAnsi="Times New Roman"/>
+                <w:sz w:val="22"/>
+                <w:szCs w:val="22"/>
+              </w:rPr>
+              <w:t>cr</w:t>
+            </w:r>
+            <w:proofErr w:type="gramEnd"/>
+            <w:r>
+              <w:rPr>
+                <w:rFonts w:ascii="Times New Roman" w:hAnsi="Times New Roman"/>
+                <w:sz w:val="22"/>
+                <w:szCs w:val="22"/>
+              </w:rPr>
+              <w:t>_</w:t>
+            </w:r>
+            <w:proofErr w:type="gramStart"/>
+            <w:r>
+              <w:rPr>
+                <w:rFonts w:ascii="Times New Roman" w:hAnsi="Times New Roman"/>
+                <w:sz w:val="22"/>
+                <w:szCs w:val="22"/>
+              </w:rPr>
+              <w:t>suit</w:t>
+            </w:r>
+            <w:proofErr w:type="spellEnd"/>
+            <w:r>
+              <w:rPr>
+                <w:rFonts w:ascii="Times New Roman" w:hAnsi="Times New Roman"/>
+                <w:sz w:val="22"/>
+                <w:szCs w:val="22"/>
+              </w:rPr>
+              <w:t xml:space="preserve"> }</w:t>
+            </w:r>
+            <w:proofErr w:type="gramEnd"/>
+            <w:r>
+              <w:rPr>
+                <w:rFonts w:ascii="Times New Roman" w:hAnsi="Times New Roman"/>
+                <w:sz w:val="22"/>
+                <w:szCs w:val="22"/>
+              </w:rPr>
+              <w:t>}</w:t>
             </w:r>
             <w:bookmarkEnd w:id="13"/>
             <w:r>
@@ -8697,7 +9918,27 @@
                 <w:sz w:val="22"/>
                 <w:szCs w:val="22"/>
               </w:rPr>
-              <w:t>System Suitability RSD &lt; 10% (QDA,CAD)?</w:t>
+              <w:t>System Suitability RSD &lt; 10% (</w:t>
+            </w:r>
+            <w:proofErr w:type="gramStart"/>
+            <w:r>
+              <w:rPr>
+                <w:rFonts w:ascii="Times New Roman" w:hAnsi="Times New Roman"/>
+                <w:color w:val="000000" w:themeColor="text1"/>
+                <w:sz w:val="22"/>
+                <w:szCs w:val="22"/>
+              </w:rPr>
+              <w:t>QDA,CAD</w:t>
+            </w:r>
+            <w:proofErr w:type="gramEnd"/>
+            <w:r>
+              <w:rPr>
+                <w:rFonts w:ascii="Times New Roman" w:hAnsi="Times New Roman"/>
+                <w:color w:val="000000" w:themeColor="text1"/>
+                <w:sz w:val="22"/>
+                <w:szCs w:val="22"/>
+              </w:rPr>
+              <w:t>)?</w:t>
             </w:r>
           </w:p>
         </w:tc>
@@ -9535,13 +10776,23 @@
                 <w:szCs w:val="22"/>
               </w:rPr>
             </w:pPr>
-            <w:r>
-              <w:rPr>
-                <w:rFonts w:ascii="Times New Roman" w:hAnsi="Times New Roman"/>
-                <w:sz w:val="22"/>
-                <w:szCs w:val="22"/>
-              </w:rPr>
-              <w:t>Is equipment/instrument functional and calibrated</w:t>
+            <w:proofErr w:type="gramStart"/>
+            <w:r>
+              <w:rPr>
+                <w:rFonts w:ascii="Times New Roman" w:hAnsi="Times New Roman"/>
+                <w:sz w:val="22"/>
+                <w:szCs w:val="22"/>
+              </w:rPr>
+              <w:t>Is</w:t>
+            </w:r>
+            <w:proofErr w:type="gramEnd"/>
+            <w:r>
+              <w:rPr>
+                <w:rFonts w:ascii="Times New Roman" w:hAnsi="Times New Roman"/>
+                <w:sz w:val="22"/>
+                <w:szCs w:val="22"/>
+              </w:rPr>
+              <w:t xml:space="preserve"> equipment/instrument functional and calibrated</w:t>
             </w:r>
             <w:r>
               <w:rPr>
@@ -10221,7 +11472,25 @@
                 <w:sz w:val="22"/>
                 <w:szCs w:val="22"/>
               </w:rPr>
-              <w:t>hromatogram/spectra/raw data correct?</w:t>
+              <w:t xml:space="preserve">hromatogram/spectra/raw </w:t>
+            </w:r>
+            <w:proofErr w:type="gramStart"/>
+            <w:r>
+              <w:rPr>
+                <w:rFonts w:ascii="Times New Roman" w:hAnsi="Times New Roman"/>
+                <w:sz w:val="22"/>
+                <w:szCs w:val="22"/>
+              </w:rPr>
+              <w:t>data</w:t>
+            </w:r>
+            <w:proofErr w:type="gramEnd"/>
+            <w:r>
+              <w:rPr>
+                <w:rFonts w:ascii="Times New Roman" w:hAnsi="Times New Roman"/>
+                <w:sz w:val="22"/>
+                <w:szCs w:val="22"/>
+              </w:rPr>
+              <w:t xml:space="preserve"> correct?</w:t>
             </w:r>
           </w:p>
         </w:tc>
@@ -10848,6 +12117,7 @@
                 <w:sz w:val="22"/>
                 <w:szCs w:val="22"/>
               </w:rPr>
+              <w:lastRenderedPageBreak/>
               <w:t xml:space="preserve">Phase I Summary: </w:t>
             </w:r>
           </w:p>
@@ -10893,414 +12163,1670 @@
                 <w:szCs w:val="22"/>
                 <w:lang w:eastAsia="zh-CN"/>
               </w:rPr>
+              <w:t>All the analysts involved in the testing, the processing analyst (</w:t>
+            </w:r>
+            <w:proofErr w:type="gramStart"/>
+            <w:r>
+              <w:rPr>
+                <w:rFonts w:ascii="Times New Roman" w:eastAsiaTheme="minorEastAsia" w:hAnsi="Times New Roman"/>
+                <w:bCs/>
+                <w:sz w:val="22"/>
+                <w:szCs w:val="22"/>
+                <w:lang w:eastAsia="zh-CN"/>
+              </w:rPr>
+              <w:t xml:space="preserve">{{ </w:t>
+            </w:r>
+            <w:proofErr w:type="spellStart"/>
+            <w:r>
+              <w:rPr>
+                <w:rFonts w:ascii="Times New Roman" w:eastAsiaTheme="minorEastAsia" w:hAnsi="Times New Roman"/>
+                <w:bCs/>
+                <w:sz w:val="22"/>
+                <w:szCs w:val="22"/>
+                <w:lang w:eastAsia="zh-CN"/>
+              </w:rPr>
+              <w:t>analyst</w:t>
+            </w:r>
+            <w:proofErr w:type="gramEnd"/>
+            <w:r>
+              <w:rPr>
+                <w:rFonts w:ascii="Times New Roman" w:eastAsiaTheme="minorEastAsia" w:hAnsi="Times New Roman"/>
+                <w:bCs/>
+                <w:sz w:val="22"/>
+                <w:szCs w:val="22"/>
+                <w:lang w:eastAsia="zh-CN"/>
+              </w:rPr>
+              <w:t>_</w:t>
+            </w:r>
+            <w:proofErr w:type="gramStart"/>
+            <w:r>
+              <w:rPr>
+                <w:rFonts w:ascii="Times New Roman" w:eastAsiaTheme="minorEastAsia" w:hAnsi="Times New Roman"/>
+                <w:bCs/>
+                <w:sz w:val="22"/>
+                <w:szCs w:val="22"/>
+                <w:lang w:eastAsia="zh-CN"/>
+              </w:rPr>
+              <w:t>name</w:t>
+            </w:r>
+            <w:proofErr w:type="spellEnd"/>
+            <w:r>
+              <w:rPr>
+                <w:rFonts w:ascii="Times New Roman" w:eastAsiaTheme="minorEastAsia" w:hAnsi="Times New Roman"/>
+                <w:bCs/>
+                <w:sz w:val="22"/>
+                <w:szCs w:val="22"/>
+                <w:lang w:eastAsia="zh-CN"/>
+              </w:rPr>
+              <w:t xml:space="preserve"> }</w:t>
+            </w:r>
+            <w:proofErr w:type="gramEnd"/>
+            <w:r>
+              <w:rPr>
+                <w:rFonts w:ascii="Times New Roman" w:eastAsiaTheme="minorEastAsia" w:hAnsi="Times New Roman"/>
+                <w:bCs/>
+                <w:sz w:val="22"/>
+                <w:szCs w:val="22"/>
+                <w:lang w:eastAsia="zh-CN"/>
+              </w:rPr>
+              <w:t>}) and the reading analyst who confirmed the positive result (</w:t>
+            </w:r>
+            <w:proofErr w:type="gramStart"/>
+            <w:r>
+              <w:rPr>
+                <w:rFonts w:ascii="Times New Roman" w:eastAsiaTheme="minorEastAsia" w:hAnsi="Times New Roman"/>
+                <w:bCs/>
+                <w:sz w:val="22"/>
+                <w:szCs w:val="22"/>
+                <w:lang w:eastAsia="zh-CN"/>
+              </w:rPr>
+              <w:t xml:space="preserve">{{ </w:t>
+            </w:r>
+            <w:proofErr w:type="spellStart"/>
+            <w:r>
+              <w:rPr>
+                <w:rFonts w:ascii="Times New Roman" w:eastAsiaTheme="minorEastAsia" w:hAnsi="Times New Roman"/>
+                <w:bCs/>
+                <w:sz w:val="22"/>
+                <w:szCs w:val="22"/>
+                <w:lang w:eastAsia="zh-CN"/>
+              </w:rPr>
+              <w:t>reading</w:t>
+            </w:r>
+            <w:proofErr w:type="gramEnd"/>
+            <w:r>
+              <w:rPr>
+                <w:rFonts w:ascii="Times New Roman" w:eastAsiaTheme="minorEastAsia" w:hAnsi="Times New Roman"/>
+                <w:bCs/>
+                <w:sz w:val="22"/>
+                <w:szCs w:val="22"/>
+                <w:lang w:eastAsia="zh-CN"/>
+              </w:rPr>
+              <w:t>_</w:t>
+            </w:r>
+            <w:proofErr w:type="gramStart"/>
+            <w:r>
+              <w:rPr>
+                <w:rFonts w:ascii="Times New Roman" w:eastAsiaTheme="minorEastAsia" w:hAnsi="Times New Roman"/>
+                <w:bCs/>
+                <w:sz w:val="22"/>
+                <w:szCs w:val="22"/>
+                <w:lang w:eastAsia="zh-CN"/>
+              </w:rPr>
+              <w:t>name</w:t>
+            </w:r>
+            <w:proofErr w:type="spellEnd"/>
+            <w:r>
+              <w:rPr>
+                <w:rFonts w:ascii="Times New Roman" w:eastAsiaTheme="minorEastAsia" w:hAnsi="Times New Roman"/>
+                <w:bCs/>
+                <w:sz w:val="22"/>
+                <w:szCs w:val="22"/>
+                <w:lang w:eastAsia="zh-CN"/>
+              </w:rPr>
+              <w:t xml:space="preserve"> }</w:t>
+            </w:r>
+            <w:proofErr w:type="gramEnd"/>
+            <w:r>
+              <w:rPr>
+                <w:rFonts w:ascii="Times New Roman" w:eastAsiaTheme="minorEastAsia" w:hAnsi="Times New Roman"/>
+                <w:bCs/>
+                <w:sz w:val="22"/>
+                <w:szCs w:val="22"/>
+                <w:lang w:eastAsia="zh-CN"/>
+              </w:rPr>
+              <w:t xml:space="preserve">}), were interviewed comprehensively. Their answers are recorded throughout this document. </w:t>
+            </w:r>
+          </w:p>
+          <w:p>
+            <w:pPr>
+              <w:outlineLvl w:val="0"/>
+              <w:rPr>
+                <w:rFonts w:ascii="Times New Roman" w:eastAsiaTheme="minorEastAsia" w:hAnsi="Times New Roman"/>
+                <w:bCs/>
+                <w:sz w:val="22"/>
+                <w:szCs w:val="22"/>
+                <w:lang w:eastAsia="zh-CN"/>
+              </w:rPr>
+            </w:pPr>
+          </w:p>
+          <w:p>
+            <w:pPr>
+              <w:outlineLvl w:val="0"/>
+              <w:rPr>
+                <w:rFonts w:ascii="Times New Roman" w:eastAsiaTheme="minorEastAsia" w:hAnsi="Times New Roman"/>
+                <w:bCs/>
+                <w:sz w:val="22"/>
+                <w:szCs w:val="22"/>
+                <w:lang w:eastAsia="zh-CN"/>
+              </w:rPr>
+            </w:pPr>
+            <w:r>
+              <w:rPr>
+                <w:rFonts w:ascii="Times New Roman" w:eastAsiaTheme="minorEastAsia" w:hAnsi="Times New Roman"/>
+                <w:bCs/>
+                <w:sz w:val="22"/>
+                <w:szCs w:val="22"/>
+                <w:lang w:eastAsia="zh-CN"/>
+              </w:rPr>
+              <w:t xml:space="preserve">Upon arrival, the sample was stored in accordance with the Client’s instructions. Analyst </w:t>
+            </w:r>
+            <w:proofErr w:type="gramStart"/>
+            <w:r>
+              <w:rPr>
+                <w:rFonts w:ascii="Times New Roman" w:eastAsiaTheme="minorEastAsia" w:hAnsi="Times New Roman"/>
+                <w:bCs/>
+                <w:sz w:val="22"/>
+                <w:szCs w:val="22"/>
+                <w:lang w:eastAsia="zh-CN"/>
+              </w:rPr>
+              <w:t xml:space="preserve">{{ </w:t>
+            </w:r>
+            <w:proofErr w:type="spellStart"/>
+            <w:r>
+              <w:rPr>
+                <w:rFonts w:ascii="Times New Roman" w:eastAsiaTheme="minorEastAsia" w:hAnsi="Times New Roman"/>
+                <w:bCs/>
+                <w:sz w:val="22"/>
+                <w:szCs w:val="22"/>
+                <w:lang w:eastAsia="zh-CN"/>
+              </w:rPr>
+              <w:t>prepper</w:t>
+            </w:r>
+            <w:proofErr w:type="gramEnd"/>
+            <w:r>
+              <w:rPr>
+                <w:rFonts w:ascii="Times New Roman" w:eastAsiaTheme="minorEastAsia" w:hAnsi="Times New Roman"/>
+                <w:bCs/>
+                <w:sz w:val="22"/>
+                <w:szCs w:val="22"/>
+                <w:lang w:eastAsia="zh-CN"/>
+              </w:rPr>
+              <w:t>_</w:t>
+            </w:r>
+            <w:proofErr w:type="gramStart"/>
+            <w:r>
+              <w:rPr>
+                <w:rFonts w:ascii="Times New Roman" w:eastAsiaTheme="minorEastAsia" w:hAnsi="Times New Roman"/>
+                <w:bCs/>
+                <w:sz w:val="22"/>
+                <w:szCs w:val="22"/>
+                <w:lang w:eastAsia="zh-CN"/>
+              </w:rPr>
+              <w:t>name</w:t>
+            </w:r>
+            <w:proofErr w:type="spellEnd"/>
+            <w:r>
+              <w:rPr>
+                <w:rFonts w:ascii="Times New Roman" w:eastAsiaTheme="minorEastAsia" w:hAnsi="Times New Roman"/>
+                <w:bCs/>
+                <w:sz w:val="22"/>
+                <w:szCs w:val="22"/>
+                <w:lang w:eastAsia="zh-CN"/>
+              </w:rPr>
+              <w:t xml:space="preserve"> }</w:t>
+            </w:r>
+            <w:proofErr w:type="gramEnd"/>
+            <w:r>
+              <w:rPr>
+                <w:rFonts w:ascii="Times New Roman" w:eastAsiaTheme="minorEastAsia" w:hAnsi="Times New Roman"/>
+                <w:bCs/>
+                <w:sz w:val="22"/>
+                <w:szCs w:val="22"/>
+                <w:lang w:eastAsia="zh-CN"/>
+              </w:rPr>
+              <w:t>} verified the sample’s integrity throughout both the preparation and processing stages. No leaks or turbidity were observed at any point, verifying the integrity of the sample.</w:t>
+            </w:r>
+          </w:p>
+          <w:p>
+            <w:pPr>
+              <w:outlineLvl w:val="0"/>
+              <w:rPr>
+                <w:rFonts w:ascii="Times New Roman" w:eastAsiaTheme="minorEastAsia" w:hAnsi="Times New Roman"/>
+                <w:bCs/>
+                <w:sz w:val="22"/>
+                <w:szCs w:val="22"/>
+                <w:lang w:eastAsia="zh-CN"/>
+              </w:rPr>
+            </w:pPr>
+          </w:p>
+          <w:p>
+            <w:pPr>
+              <w:outlineLvl w:val="0"/>
+              <w:rPr>
+                <w:rFonts w:ascii="Times New Roman" w:eastAsiaTheme="minorEastAsia" w:hAnsi="Times New Roman"/>
+                <w:bCs/>
+                <w:sz w:val="22"/>
+                <w:szCs w:val="22"/>
+                <w:lang w:eastAsia="zh-CN"/>
+              </w:rPr>
+            </w:pPr>
+            <w:r>
+              <w:rPr>
+                <w:rFonts w:ascii="Times New Roman" w:eastAsiaTheme="minorEastAsia" w:hAnsi="Times New Roman"/>
+                <w:bCs/>
+                <w:sz w:val="22"/>
+                <w:szCs w:val="22"/>
+                <w:lang w:eastAsia="zh-CN"/>
+              </w:rPr>
+              <w:t>All reagents and supplies mentioned in the material section above were stored according to the suppliers’ recommendations, and their integrity was visually verified before utilization. Moreover, all reagents and supplies had valid expiration dates. The functionality of all equipment was confirmed by reviewing data generated by our comprehensive in-house continuous monitoring system.</w:t>
+            </w:r>
+          </w:p>
+          <w:p>
+            <w:pPr>
+              <w:outlineLvl w:val="0"/>
+              <w:rPr>
+                <w:rFonts w:ascii="Times New Roman" w:eastAsiaTheme="minorEastAsia" w:hAnsi="Times New Roman"/>
+                <w:bCs/>
+                <w:sz w:val="22"/>
+                <w:szCs w:val="22"/>
+                <w:lang w:eastAsia="zh-CN"/>
+              </w:rPr>
+            </w:pPr>
+            <w:proofErr w:type="gramStart"/>
+            <w:r>
+              <w:rPr>
+                <w:rFonts w:ascii="Times New Roman" w:eastAsiaTheme="minorEastAsia" w:hAnsi="Times New Roman"/>
+                <w:bCs/>
+                <w:sz w:val="22"/>
+                <w:szCs w:val="22"/>
+                <w:lang w:eastAsia="zh-CN"/>
+              </w:rPr>
+              <w:t xml:space="preserve">{{ </w:t>
+            </w:r>
+            <w:proofErr w:type="spellStart"/>
+            <w:r>
+              <w:rPr>
+                <w:rFonts w:ascii="Times New Roman" w:eastAsiaTheme="minorEastAsia" w:hAnsi="Times New Roman"/>
+                <w:bCs/>
+                <w:sz w:val="22"/>
+                <w:szCs w:val="22"/>
+                <w:lang w:eastAsia="zh-CN"/>
+              </w:rPr>
+              <w:t>equipment</w:t>
+            </w:r>
+            <w:proofErr w:type="gramEnd"/>
+            <w:r>
+              <w:rPr>
+                <w:rFonts w:ascii="Times New Roman" w:eastAsiaTheme="minorEastAsia" w:hAnsi="Times New Roman"/>
+                <w:bCs/>
+                <w:sz w:val="22"/>
+                <w:szCs w:val="22"/>
+                <w:lang w:eastAsia="zh-CN"/>
+              </w:rPr>
+              <w:t>_</w:t>
+            </w:r>
+            <w:proofErr w:type="gramStart"/>
+            <w:r>
+              <w:rPr>
+                <w:rFonts w:ascii="Times New Roman" w:eastAsiaTheme="minorEastAsia" w:hAnsi="Times New Roman"/>
+                <w:bCs/>
+                <w:sz w:val="22"/>
+                <w:szCs w:val="22"/>
+                <w:lang w:eastAsia="zh-CN"/>
+              </w:rPr>
+              <w:t>summary</w:t>
+            </w:r>
+            <w:proofErr w:type="spellEnd"/>
+            <w:r>
+              <w:rPr>
+                <w:rFonts w:ascii="Times New Roman" w:eastAsiaTheme="minorEastAsia" w:hAnsi="Times New Roman"/>
+                <w:bCs/>
+                <w:sz w:val="22"/>
+                <w:szCs w:val="22"/>
+                <w:lang w:eastAsia="zh-CN"/>
+              </w:rPr>
+              <w:t xml:space="preserve"> }</w:t>
+            </w:r>
+            <w:proofErr w:type="gramEnd"/>
+            <w:r>
+              <w:rPr>
+                <w:rFonts w:ascii="Times New Roman" w:eastAsiaTheme="minorEastAsia" w:hAnsi="Times New Roman"/>
+                <w:bCs/>
+                <w:sz w:val="22"/>
+                <w:szCs w:val="22"/>
+                <w:lang w:eastAsia="zh-CN"/>
+              </w:rPr>
+              <w:t>}</w:t>
+            </w:r>
+          </w:p>
+          <w:p>
+            <w:pPr>
+              <w:outlineLvl w:val="0"/>
+              <w:rPr>
+                <w:rFonts w:ascii="Times New Roman" w:eastAsiaTheme="minorEastAsia" w:hAnsi="Times New Roman"/>
+                <w:bCs/>
+                <w:sz w:val="22"/>
+                <w:szCs w:val="22"/>
+                <w:lang w:eastAsia="zh-CN"/>
+              </w:rPr>
+            </w:pPr>
+          </w:p>
+          <w:p>
+            <w:pPr>
+              <w:outlineLvl w:val="0"/>
+              <w:rPr>
+                <w:rFonts w:ascii="Times New Roman" w:eastAsiaTheme="minorEastAsia" w:hAnsi="Times New Roman"/>
+                <w:bCs/>
+                <w:sz w:val="22"/>
+                <w:szCs w:val="22"/>
+                <w:lang w:eastAsia="zh-CN"/>
+              </w:rPr>
+            </w:pPr>
+            <w:r>
+              <w:rPr>
+                <w:rFonts w:ascii="Times New Roman" w:eastAsiaTheme="minorEastAsia" w:hAnsi="Times New Roman"/>
+                <w:bCs/>
+                <w:sz w:val="22"/>
+                <w:szCs w:val="22"/>
+                <w:lang w:eastAsia="zh-CN"/>
+              </w:rPr>
+              <w:t>On {{</w:t>
+            </w:r>
+            <w:proofErr w:type="spellStart"/>
+            <w:r>
+              <w:rPr>
+                <w:rFonts w:ascii="Times New Roman" w:eastAsiaTheme="minorEastAsia" w:hAnsi="Times New Roman"/>
+                <w:bCs/>
+                <w:sz w:val="22"/>
+                <w:szCs w:val="22"/>
+                <w:lang w:eastAsia="zh-CN"/>
+              </w:rPr>
+              <w:t>received_</w:t>
+            </w:r>
+            <w:proofErr w:type="gramStart"/>
+            <w:r>
+              <w:rPr>
+                <w:rFonts w:ascii="Times New Roman" w:eastAsiaTheme="minorEastAsia" w:hAnsi="Times New Roman"/>
+                <w:bCs/>
+                <w:sz w:val="22"/>
+                <w:szCs w:val="22"/>
+                <w:lang w:eastAsia="zh-CN"/>
+              </w:rPr>
+              <w:t>data</w:t>
+            </w:r>
+            <w:proofErr w:type="spellEnd"/>
+            <w:r>
+              <w:rPr>
+                <w:rFonts w:ascii="Times New Roman" w:eastAsiaTheme="minorEastAsia" w:hAnsi="Times New Roman"/>
+                <w:bCs/>
+                <w:sz w:val="22"/>
+                <w:szCs w:val="22"/>
+                <w:lang w:eastAsia="zh-CN"/>
+              </w:rPr>
+              <w:t>}},</w:t>
+            </w:r>
+            <w:proofErr w:type="gramEnd"/>
+            <w:r>
+              <w:rPr>
+                <w:rFonts w:ascii="Times New Roman" w:eastAsiaTheme="minorEastAsia" w:hAnsi="Times New Roman"/>
+                <w:bCs/>
+                <w:sz w:val="22"/>
+                <w:szCs w:val="22"/>
+                <w:lang w:eastAsia="zh-CN"/>
+              </w:rPr>
+              <w:t xml:space="preserve"> the sample vials for </w:t>
+            </w:r>
+            <w:proofErr w:type="gramStart"/>
+            <w:r>
+              <w:rPr>
+                <w:rFonts w:ascii="Times New Roman" w:eastAsiaTheme="minorEastAsia" w:hAnsi="Times New Roman"/>
+                <w:bCs/>
+                <w:sz w:val="22"/>
+                <w:szCs w:val="22"/>
+                <w:lang w:eastAsia="zh-CN"/>
+              </w:rPr>
+              <w:t xml:space="preserve">{{ </w:t>
+            </w:r>
+            <w:proofErr w:type="spellStart"/>
+            <w:r>
+              <w:rPr>
+                <w:rFonts w:ascii="Times New Roman" w:eastAsiaTheme="minorEastAsia" w:hAnsi="Times New Roman"/>
+                <w:bCs/>
+                <w:sz w:val="22"/>
+                <w:szCs w:val="22"/>
+                <w:lang w:eastAsia="zh-CN"/>
+              </w:rPr>
+              <w:t>sample</w:t>
+            </w:r>
+            <w:proofErr w:type="gramEnd"/>
+            <w:r>
+              <w:rPr>
+                <w:rFonts w:ascii="Times New Roman" w:eastAsiaTheme="minorEastAsia" w:hAnsi="Times New Roman"/>
+                <w:bCs/>
+                <w:sz w:val="22"/>
+                <w:szCs w:val="22"/>
+                <w:lang w:eastAsia="zh-CN"/>
+              </w:rPr>
+              <w:t>_</w:t>
+            </w:r>
+            <w:proofErr w:type="gramStart"/>
+            <w:r>
+              <w:rPr>
+                <w:rFonts w:ascii="Times New Roman" w:eastAsiaTheme="minorEastAsia" w:hAnsi="Times New Roman"/>
+                <w:bCs/>
+                <w:sz w:val="22"/>
+                <w:szCs w:val="22"/>
+                <w:lang w:eastAsia="zh-CN"/>
+              </w:rPr>
+              <w:t>id</w:t>
+            </w:r>
+            <w:proofErr w:type="spellEnd"/>
+            <w:r>
+              <w:rPr>
+                <w:rFonts w:ascii="Times New Roman" w:eastAsiaTheme="minorEastAsia" w:hAnsi="Times New Roman"/>
+                <w:bCs/>
+                <w:sz w:val="22"/>
+                <w:szCs w:val="22"/>
+                <w:lang w:eastAsia="zh-CN"/>
+              </w:rPr>
+              <w:t xml:space="preserve"> }</w:t>
+            </w:r>
+            <w:proofErr w:type="gramEnd"/>
+            <w:r>
+              <w:rPr>
+                <w:rFonts w:ascii="Times New Roman" w:eastAsiaTheme="minorEastAsia" w:hAnsi="Times New Roman"/>
+                <w:bCs/>
+                <w:sz w:val="22"/>
+                <w:szCs w:val="22"/>
+                <w:lang w:eastAsia="zh-CN"/>
+              </w:rPr>
+              <w:t xml:space="preserve">} were received from the Sample Submissions team and brought into the Sterile Microbiology lab. Upon arrival, each sample vial was sprayed with an acidified bleach disinfectant, placed into pre-disinfected bins, and allowed a 10-minute contact time. The secondary disinfection happened in the ISO 8 anteroom (Suite </w:t>
+            </w:r>
+            <w:proofErr w:type="gramStart"/>
+            <w:r>
+              <w:rPr>
+                <w:rFonts w:ascii="Times New Roman" w:eastAsiaTheme="minorEastAsia" w:hAnsi="Times New Roman"/>
+                <w:bCs/>
+                <w:sz w:val="22"/>
+                <w:szCs w:val="22"/>
+                <w:lang w:eastAsia="zh-CN"/>
+              </w:rPr>
+              <w:t xml:space="preserve">{{ </w:t>
+            </w:r>
+            <w:proofErr w:type="spellStart"/>
+            <w:r>
+              <w:rPr>
+                <w:rFonts w:ascii="Times New Roman" w:eastAsiaTheme="minorEastAsia" w:hAnsi="Times New Roman"/>
+                <w:bCs/>
+                <w:sz w:val="22"/>
+                <w:szCs w:val="22"/>
+                <w:lang w:eastAsia="zh-CN"/>
+              </w:rPr>
+              <w:t>cr</w:t>
+            </w:r>
+            <w:proofErr w:type="gramEnd"/>
+            <w:r>
+              <w:rPr>
+                <w:rFonts w:ascii="Times New Roman" w:eastAsiaTheme="minorEastAsia" w:hAnsi="Times New Roman"/>
+                <w:bCs/>
+                <w:sz w:val="22"/>
+                <w:szCs w:val="22"/>
+                <w:lang w:eastAsia="zh-CN"/>
+              </w:rPr>
+              <w:t>_</w:t>
+            </w:r>
+            <w:proofErr w:type="gramStart"/>
+            <w:r>
+              <w:rPr>
+                <w:rFonts w:ascii="Times New Roman" w:eastAsiaTheme="minorEastAsia" w:hAnsi="Times New Roman"/>
+                <w:bCs/>
+                <w:sz w:val="22"/>
+                <w:szCs w:val="22"/>
+                <w:lang w:eastAsia="zh-CN"/>
+              </w:rPr>
+              <w:t>suit</w:t>
+            </w:r>
+            <w:proofErr w:type="spellEnd"/>
+            <w:r>
+              <w:rPr>
+                <w:rFonts w:ascii="Times New Roman" w:eastAsiaTheme="minorEastAsia" w:hAnsi="Times New Roman"/>
+                <w:bCs/>
+                <w:sz w:val="22"/>
+                <w:szCs w:val="22"/>
+                <w:lang w:eastAsia="zh-CN"/>
+              </w:rPr>
+              <w:t xml:space="preserve"> }</w:t>
+            </w:r>
+            <w:proofErr w:type="gramEnd"/>
+            <w:r>
+              <w:rPr>
+                <w:rFonts w:ascii="Times New Roman" w:eastAsiaTheme="minorEastAsia" w:hAnsi="Times New Roman"/>
+                <w:bCs/>
+                <w:sz w:val="22"/>
+                <w:szCs w:val="22"/>
+                <w:lang w:eastAsia="zh-CN"/>
+              </w:rPr>
+              <w:t xml:space="preserve">})), where the vials were again treated with acidified bleach and provided a 10‑minute contact time before processing. Subsequently, the vials were moved into the ISO 7 cleanroom Suite </w:t>
+            </w:r>
+            <w:proofErr w:type="gramStart"/>
+            <w:r>
+              <w:rPr>
+                <w:rFonts w:ascii="Times New Roman" w:eastAsiaTheme="minorEastAsia" w:hAnsi="Times New Roman"/>
+                <w:bCs/>
+                <w:sz w:val="22"/>
+                <w:szCs w:val="22"/>
+                <w:lang w:eastAsia="zh-CN"/>
+              </w:rPr>
+              <w:t xml:space="preserve">{{ </w:t>
+            </w:r>
+            <w:proofErr w:type="spellStart"/>
+            <w:r>
+              <w:rPr>
+                <w:rFonts w:ascii="Times New Roman" w:eastAsiaTheme="minorEastAsia" w:hAnsi="Times New Roman"/>
+                <w:bCs/>
+                <w:sz w:val="22"/>
+                <w:szCs w:val="22"/>
+                <w:lang w:eastAsia="zh-CN"/>
+              </w:rPr>
+              <w:t>cr</w:t>
+            </w:r>
+            <w:proofErr w:type="gramEnd"/>
+            <w:r>
+              <w:rPr>
+                <w:rFonts w:ascii="Times New Roman" w:eastAsiaTheme="minorEastAsia" w:hAnsi="Times New Roman"/>
+                <w:bCs/>
+                <w:sz w:val="22"/>
+                <w:szCs w:val="22"/>
+                <w:lang w:eastAsia="zh-CN"/>
+              </w:rPr>
+              <w:t>_</w:t>
+            </w:r>
+            <w:proofErr w:type="gramStart"/>
+            <w:r>
+              <w:rPr>
+                <w:rFonts w:ascii="Times New Roman" w:eastAsiaTheme="minorEastAsia" w:hAnsi="Times New Roman"/>
+                <w:bCs/>
+                <w:sz w:val="22"/>
+                <w:szCs w:val="22"/>
+                <w:lang w:eastAsia="zh-CN"/>
+              </w:rPr>
+              <w:t>suit</w:t>
+            </w:r>
+            <w:proofErr w:type="spellEnd"/>
+            <w:r>
+              <w:rPr>
+                <w:rFonts w:ascii="Times New Roman" w:eastAsiaTheme="minorEastAsia" w:hAnsi="Times New Roman"/>
+                <w:bCs/>
+                <w:sz w:val="22"/>
+                <w:szCs w:val="22"/>
+                <w:lang w:eastAsia="zh-CN"/>
+              </w:rPr>
+              <w:t xml:space="preserve"> }}({{ suit</w:t>
+            </w:r>
+            <w:proofErr w:type="gramEnd"/>
+            <w:r>
+              <w:rPr>
+                <w:rFonts w:ascii="Times New Roman" w:eastAsiaTheme="minorEastAsia" w:hAnsi="Times New Roman"/>
+                <w:bCs/>
+                <w:sz w:val="22"/>
+                <w:szCs w:val="22"/>
+                <w:lang w:eastAsia="zh-CN"/>
+              </w:rPr>
+              <w:t xml:space="preserve"> }}). Inside this cleanroom, the processing analyst, </w:t>
+            </w:r>
+            <w:proofErr w:type="gramStart"/>
+            <w:r>
+              <w:rPr>
+                <w:rFonts w:ascii="Times New Roman" w:eastAsiaTheme="minorEastAsia" w:hAnsi="Times New Roman"/>
+                <w:bCs/>
+                <w:sz w:val="22"/>
+                <w:szCs w:val="22"/>
+                <w:lang w:eastAsia="zh-CN"/>
+              </w:rPr>
+              <w:t xml:space="preserve">{{ </w:t>
+            </w:r>
+            <w:proofErr w:type="spellStart"/>
+            <w:r>
+              <w:rPr>
+                <w:rFonts w:ascii="Times New Roman" w:eastAsiaTheme="minorEastAsia" w:hAnsi="Times New Roman"/>
+                <w:bCs/>
+                <w:sz w:val="22"/>
+                <w:szCs w:val="22"/>
+                <w:lang w:eastAsia="zh-CN"/>
+              </w:rPr>
+              <w:t>analyst</w:t>
+            </w:r>
+            <w:proofErr w:type="gramEnd"/>
+            <w:r>
+              <w:rPr>
+                <w:rFonts w:ascii="Times New Roman" w:eastAsiaTheme="minorEastAsia" w:hAnsi="Times New Roman"/>
+                <w:bCs/>
+                <w:sz w:val="22"/>
+                <w:szCs w:val="22"/>
+                <w:lang w:eastAsia="zh-CN"/>
+              </w:rPr>
+              <w:t>_</w:t>
+            </w:r>
+            <w:proofErr w:type="gramStart"/>
+            <w:r>
+              <w:rPr>
+                <w:rFonts w:ascii="Times New Roman" w:eastAsiaTheme="minorEastAsia" w:hAnsi="Times New Roman"/>
+                <w:bCs/>
+                <w:sz w:val="22"/>
+                <w:szCs w:val="22"/>
+                <w:lang w:eastAsia="zh-CN"/>
+              </w:rPr>
+              <w:t>name</w:t>
+            </w:r>
+            <w:proofErr w:type="spellEnd"/>
+            <w:r>
+              <w:rPr>
+                <w:rFonts w:ascii="Times New Roman" w:eastAsiaTheme="minorEastAsia" w:hAnsi="Times New Roman"/>
+                <w:bCs/>
+                <w:sz w:val="22"/>
+                <w:szCs w:val="22"/>
+                <w:lang w:eastAsia="zh-CN"/>
+              </w:rPr>
+              <w:t xml:space="preserve"> }</w:t>
+            </w:r>
+            <w:proofErr w:type="gramEnd"/>
+            <w:r>
+              <w:rPr>
+                <w:rFonts w:ascii="Times New Roman" w:eastAsiaTheme="minorEastAsia" w:hAnsi="Times New Roman"/>
+                <w:bCs/>
+                <w:sz w:val="22"/>
+                <w:szCs w:val="22"/>
+                <w:lang w:eastAsia="zh-CN"/>
+              </w:rPr>
+              <w:t>}, performed a final disinfection step, allowing an additional 10-minute contact time. Once fully disinfected, the vials were transferred into the ISO 5 BSC E00{{</w:t>
+            </w:r>
+            <w:proofErr w:type="spellStart"/>
+            <w:r>
+              <w:rPr>
+                <w:rFonts w:ascii="Times New Roman" w:eastAsiaTheme="minorEastAsia" w:hAnsi="Times New Roman"/>
+                <w:bCs/>
+                <w:sz w:val="22"/>
+                <w:szCs w:val="22"/>
+                <w:lang w:eastAsia="zh-CN"/>
+              </w:rPr>
+              <w:t>bsc_id</w:t>
+            </w:r>
+            <w:proofErr w:type="spellEnd"/>
+            <w:r>
+              <w:rPr>
+                <w:rFonts w:ascii="Times New Roman" w:eastAsiaTheme="minorEastAsia" w:hAnsi="Times New Roman"/>
+                <w:bCs/>
+                <w:sz w:val="22"/>
+                <w:szCs w:val="22"/>
+                <w:lang w:eastAsia="zh-CN"/>
+              </w:rPr>
+              <w:t>}}.</w:t>
+            </w:r>
+          </w:p>
+          <w:p>
+            <w:pPr>
+              <w:outlineLvl w:val="0"/>
+              <w:rPr>
+                <w:rFonts w:ascii="Times New Roman" w:eastAsiaTheme="minorEastAsia" w:hAnsi="Times New Roman"/>
+                <w:bCs/>
+                <w:sz w:val="22"/>
+                <w:szCs w:val="22"/>
+                <w:lang w:eastAsia="zh-CN"/>
+              </w:rPr>
+            </w:pPr>
+          </w:p>
+          <w:p>
+            <w:pPr>
+              <w:outlineLvl w:val="0"/>
+              <w:rPr>
+                <w:rFonts w:ascii="Times New Roman" w:eastAsiaTheme="minorEastAsia" w:hAnsi="Times New Roman"/>
+                <w:bCs/>
+                <w:sz w:val="22"/>
+                <w:szCs w:val="22"/>
+                <w:lang w:eastAsia="zh-CN"/>
+              </w:rPr>
+            </w:pPr>
+            <w:r>
+              <w:rPr>
+                <w:rFonts w:ascii="Times New Roman" w:eastAsiaTheme="minorEastAsia" w:hAnsi="Times New Roman"/>
+                <w:bCs/>
+                <w:sz w:val="22"/>
+                <w:szCs w:val="22"/>
+                <w:lang w:eastAsia="zh-CN"/>
+              </w:rPr>
+              <w:t>Once transferred into the ISO 5 BSC, the vials were placed on the disinfected working surface of the BSC E00{{</w:t>
+            </w:r>
+            <w:proofErr w:type="spellStart"/>
+            <w:r>
+              <w:rPr>
+                <w:rFonts w:ascii="Times New Roman" w:eastAsiaTheme="minorEastAsia" w:hAnsi="Times New Roman"/>
+                <w:bCs/>
+                <w:sz w:val="22"/>
+                <w:szCs w:val="22"/>
+                <w:lang w:eastAsia="zh-CN"/>
+              </w:rPr>
+              <w:t>bsc_id</w:t>
+            </w:r>
+            <w:proofErr w:type="spellEnd"/>
+            <w:r>
+              <w:rPr>
+                <w:rFonts w:ascii="Times New Roman" w:eastAsiaTheme="minorEastAsia" w:hAnsi="Times New Roman"/>
+                <w:bCs/>
+                <w:sz w:val="22"/>
+                <w:szCs w:val="22"/>
+                <w:lang w:eastAsia="zh-CN"/>
+              </w:rPr>
+              <w:t xml:space="preserve">}} and aseptically opened and tested in accordance with SOP 2.600.008 (USP / EP 2.6.1 Sterility Test). Following testing, the media bottles were subsequently transferred into designated incubators, E001356 and E001357, to initiate incubation. </w:t>
+            </w:r>
+          </w:p>
+          <w:p>
+            <w:pPr>
+              <w:outlineLvl w:val="0"/>
+              <w:rPr>
+                <w:rFonts w:ascii="Times New Roman" w:eastAsiaTheme="minorEastAsia" w:hAnsi="Times New Roman"/>
+                <w:bCs/>
+                <w:sz w:val="22"/>
+                <w:szCs w:val="22"/>
+                <w:lang w:eastAsia="zh-CN"/>
+              </w:rPr>
+            </w:pPr>
+          </w:p>
+          <w:p>
+            <w:pPr>
+              <w:outlineLvl w:val="0"/>
+              <w:rPr>
+                <w:rFonts w:ascii="Times New Roman" w:eastAsiaTheme="minorEastAsia" w:hAnsi="Times New Roman"/>
+                <w:bCs/>
+                <w:sz w:val="22"/>
+                <w:szCs w:val="22"/>
+                <w:lang w:eastAsia="zh-CN"/>
+              </w:rPr>
+            </w:pPr>
+            <w:r>
+              <w:rPr>
+                <w:rFonts w:ascii="Times New Roman" w:eastAsiaTheme="minorEastAsia" w:hAnsi="Times New Roman"/>
+                <w:bCs/>
+                <w:sz w:val="22"/>
+                <w:szCs w:val="22"/>
+                <w:lang w:eastAsia="zh-CN"/>
+              </w:rPr>
+              <w:t xml:space="preserve">On </w:t>
+            </w:r>
+            <w:proofErr w:type="gramStart"/>
+            <w:r>
+              <w:rPr>
+                <w:rFonts w:ascii="Times New Roman" w:eastAsiaTheme="minorEastAsia" w:hAnsi="Times New Roman"/>
+                <w:bCs/>
+                <w:sz w:val="22"/>
+                <w:szCs w:val="22"/>
+                <w:lang w:eastAsia="zh-CN"/>
+              </w:rPr>
+              <w:t xml:space="preserve">{{ </w:t>
+            </w:r>
+            <w:proofErr w:type="spellStart"/>
+            <w:r>
+              <w:rPr>
+                <w:rFonts w:ascii="Times New Roman" w:eastAsiaTheme="minorEastAsia" w:hAnsi="Times New Roman"/>
+                <w:bCs/>
+                <w:sz w:val="22"/>
+                <w:szCs w:val="22"/>
+                <w:lang w:eastAsia="zh-CN"/>
+              </w:rPr>
+              <w:t>test</w:t>
+            </w:r>
+            <w:proofErr w:type="gramEnd"/>
+            <w:r>
+              <w:rPr>
+                <w:rFonts w:ascii="Times New Roman" w:eastAsiaTheme="minorEastAsia" w:hAnsi="Times New Roman"/>
+                <w:bCs/>
+                <w:sz w:val="22"/>
+                <w:szCs w:val="22"/>
+                <w:lang w:eastAsia="zh-CN"/>
+              </w:rPr>
+              <w:t>_</w:t>
+            </w:r>
+            <w:proofErr w:type="gramStart"/>
+            <w:r>
+              <w:rPr>
+                <w:rFonts w:ascii="Times New Roman" w:eastAsiaTheme="minorEastAsia" w:hAnsi="Times New Roman"/>
+                <w:bCs/>
+                <w:sz w:val="22"/>
+                <w:szCs w:val="22"/>
+                <w:lang w:eastAsia="zh-CN"/>
+              </w:rPr>
+              <w:t>date</w:t>
+            </w:r>
+            <w:proofErr w:type="spellEnd"/>
+            <w:r>
+              <w:rPr>
+                <w:rFonts w:ascii="Times New Roman" w:eastAsiaTheme="minorEastAsia" w:hAnsi="Times New Roman"/>
+                <w:bCs/>
+                <w:sz w:val="22"/>
+                <w:szCs w:val="22"/>
+                <w:lang w:eastAsia="zh-CN"/>
+              </w:rPr>
+              <w:t xml:space="preserve"> }</w:t>
+            </w:r>
+            <w:proofErr w:type="gramEnd"/>
+            <w:r>
+              <w:rPr>
+                <w:rFonts w:ascii="Times New Roman" w:eastAsiaTheme="minorEastAsia" w:hAnsi="Times New Roman"/>
+                <w:bCs/>
+                <w:sz w:val="22"/>
+                <w:szCs w:val="22"/>
+                <w:lang w:eastAsia="zh-CN"/>
+              </w:rPr>
+              <w:t>} (Day {{</w:t>
+            </w:r>
+            <w:proofErr w:type="spellStart"/>
+            <w:r>
+              <w:rPr>
+                <w:rFonts w:ascii="Times New Roman" w:eastAsiaTheme="minorEastAsia" w:hAnsi="Times New Roman"/>
+                <w:bCs/>
+                <w:sz w:val="22"/>
+                <w:szCs w:val="22"/>
+                <w:lang w:eastAsia="zh-CN"/>
+              </w:rPr>
+              <w:t>incubation_time</w:t>
+            </w:r>
+            <w:proofErr w:type="spellEnd"/>
+            <w:r>
+              <w:rPr>
+                <w:rFonts w:ascii="Times New Roman" w:eastAsiaTheme="minorEastAsia" w:hAnsi="Times New Roman"/>
+                <w:bCs/>
+                <w:sz w:val="22"/>
+                <w:szCs w:val="22"/>
+                <w:lang w:eastAsia="zh-CN"/>
+              </w:rPr>
+              <w:t xml:space="preserve">}} of incubation), microbial growth was observed in </w:t>
+            </w:r>
+            <w:proofErr w:type="gramStart"/>
+            <w:r>
+              <w:rPr>
+                <w:rFonts w:ascii="Times New Roman" w:eastAsiaTheme="minorEastAsia" w:hAnsi="Times New Roman"/>
+                <w:bCs/>
+                <w:sz w:val="22"/>
+                <w:szCs w:val="22"/>
+                <w:lang w:eastAsia="zh-CN"/>
+              </w:rPr>
+              <w:t xml:space="preserve">{{ </w:t>
+            </w:r>
+            <w:proofErr w:type="spellStart"/>
+            <w:r>
+              <w:rPr>
+                <w:rFonts w:ascii="Times New Roman" w:eastAsiaTheme="minorEastAsia" w:hAnsi="Times New Roman"/>
+                <w:bCs/>
+                <w:sz w:val="22"/>
+                <w:szCs w:val="22"/>
+                <w:lang w:eastAsia="zh-CN"/>
+              </w:rPr>
+              <w:t>positive</w:t>
+            </w:r>
+            <w:proofErr w:type="gramEnd"/>
+            <w:r>
+              <w:rPr>
+                <w:rFonts w:ascii="Times New Roman" w:eastAsiaTheme="minorEastAsia" w:hAnsi="Times New Roman"/>
+                <w:bCs/>
+                <w:sz w:val="22"/>
+                <w:szCs w:val="22"/>
+                <w:lang w:eastAsia="zh-CN"/>
+              </w:rPr>
+              <w:t>_media</w:t>
+            </w:r>
+            <w:proofErr w:type="spellEnd"/>
+            <w:r>
+              <w:rPr>
+                <w:rFonts w:ascii="Times New Roman" w:eastAsiaTheme="minorEastAsia" w:hAnsi="Times New Roman"/>
+                <w:bCs/>
+                <w:sz w:val="22"/>
+                <w:szCs w:val="22"/>
+                <w:lang w:eastAsia="zh-CN"/>
+              </w:rPr>
+              <w:t xml:space="preserve">}} media bottle by analyst </w:t>
+            </w:r>
+            <w:proofErr w:type="gramStart"/>
+            <w:r>
+              <w:rPr>
+                <w:rFonts w:ascii="Times New Roman" w:eastAsiaTheme="minorEastAsia" w:hAnsi="Times New Roman"/>
+                <w:bCs/>
+                <w:sz w:val="22"/>
+                <w:szCs w:val="22"/>
+                <w:lang w:eastAsia="zh-CN"/>
+              </w:rPr>
+              <w:t xml:space="preserve">{{ </w:t>
+            </w:r>
+            <w:proofErr w:type="spellStart"/>
+            <w:r>
+              <w:rPr>
+                <w:rFonts w:ascii="Times New Roman" w:eastAsiaTheme="minorEastAsia" w:hAnsi="Times New Roman"/>
+                <w:bCs/>
+                <w:sz w:val="22"/>
+                <w:szCs w:val="22"/>
+                <w:lang w:eastAsia="zh-CN"/>
+              </w:rPr>
+              <w:t>reading</w:t>
+            </w:r>
+            <w:proofErr w:type="gramEnd"/>
+            <w:r>
+              <w:rPr>
+                <w:rFonts w:ascii="Times New Roman" w:eastAsiaTheme="minorEastAsia" w:hAnsi="Times New Roman"/>
+                <w:bCs/>
+                <w:sz w:val="22"/>
+                <w:szCs w:val="22"/>
+                <w:lang w:eastAsia="zh-CN"/>
+              </w:rPr>
+              <w:t>_</w:t>
+            </w:r>
+            <w:proofErr w:type="gramStart"/>
+            <w:r>
+              <w:rPr>
+                <w:rFonts w:ascii="Times New Roman" w:eastAsiaTheme="minorEastAsia" w:hAnsi="Times New Roman"/>
+                <w:bCs/>
+                <w:sz w:val="22"/>
+                <w:szCs w:val="22"/>
+                <w:lang w:eastAsia="zh-CN"/>
+              </w:rPr>
+              <w:t>name</w:t>
+            </w:r>
+            <w:proofErr w:type="spellEnd"/>
+            <w:r>
+              <w:rPr>
+                <w:rFonts w:ascii="Times New Roman" w:eastAsiaTheme="minorEastAsia" w:hAnsi="Times New Roman"/>
+                <w:bCs/>
+                <w:sz w:val="22"/>
+                <w:szCs w:val="22"/>
+                <w:lang w:eastAsia="zh-CN"/>
+              </w:rPr>
+              <w:t xml:space="preserve"> }</w:t>
+            </w:r>
+            <w:proofErr w:type="gramEnd"/>
+            <w:r>
+              <w:rPr>
+                <w:rFonts w:ascii="Times New Roman" w:eastAsiaTheme="minorEastAsia" w:hAnsi="Times New Roman"/>
+                <w:bCs/>
+                <w:sz w:val="22"/>
+                <w:szCs w:val="22"/>
+                <w:lang w:eastAsia="zh-CN"/>
+              </w:rPr>
+              <w:t xml:space="preserve">} and confirmed by Microbiology Lab Supervisor Robin Seymour. The organism was identified as </w:t>
+            </w:r>
+            <w:proofErr w:type="gramStart"/>
+            <w:r>
+              <w:rPr>
+                <w:rFonts w:ascii="Times New Roman" w:eastAsiaTheme="minorEastAsia" w:hAnsi="Times New Roman"/>
+                <w:bCs/>
+                <w:sz w:val="22"/>
+                <w:szCs w:val="22"/>
+                <w:lang w:eastAsia="zh-CN"/>
+              </w:rPr>
+              <w:t xml:space="preserve">{{ </w:t>
+            </w:r>
+            <w:proofErr w:type="spellStart"/>
+            <w:r>
+              <w:rPr>
+                <w:rFonts w:ascii="Times New Roman" w:eastAsiaTheme="minorEastAsia" w:hAnsi="Times New Roman"/>
+                <w:bCs/>
+                <w:sz w:val="22"/>
+                <w:szCs w:val="22"/>
+                <w:lang w:eastAsia="zh-CN"/>
+              </w:rPr>
+              <w:t>positive</w:t>
+            </w:r>
+            <w:proofErr w:type="gramEnd"/>
+            <w:r>
+              <w:rPr>
+                <w:rFonts w:ascii="Times New Roman" w:eastAsiaTheme="minorEastAsia" w:hAnsi="Times New Roman"/>
+                <w:bCs/>
+                <w:sz w:val="22"/>
+                <w:szCs w:val="22"/>
+                <w:lang w:eastAsia="zh-CN"/>
+              </w:rPr>
+              <w:t>_</w:t>
+            </w:r>
+            <w:proofErr w:type="gramStart"/>
+            <w:r>
+              <w:rPr>
+                <w:rFonts w:ascii="Times New Roman" w:eastAsiaTheme="minorEastAsia" w:hAnsi="Times New Roman"/>
+                <w:bCs/>
+                <w:sz w:val="22"/>
+                <w:szCs w:val="22"/>
+                <w:lang w:eastAsia="zh-CN"/>
+              </w:rPr>
+              <w:t>org</w:t>
+            </w:r>
+            <w:proofErr w:type="spellEnd"/>
+            <w:r>
+              <w:rPr>
+                <w:rFonts w:ascii="Times New Roman" w:eastAsiaTheme="minorEastAsia" w:hAnsi="Times New Roman"/>
+                <w:bCs/>
+                <w:sz w:val="22"/>
+                <w:szCs w:val="22"/>
+                <w:lang w:eastAsia="zh-CN"/>
+              </w:rPr>
+              <w:t xml:space="preserve"> }</w:t>
+            </w:r>
+            <w:proofErr w:type="gramEnd"/>
+            <w:r>
+              <w:rPr>
+                <w:rFonts w:ascii="Times New Roman" w:eastAsiaTheme="minorEastAsia" w:hAnsi="Times New Roman"/>
+                <w:bCs/>
+                <w:sz w:val="22"/>
+                <w:szCs w:val="22"/>
+                <w:lang w:eastAsia="zh-CN"/>
+              </w:rPr>
+              <w:t>} (see Table 1).</w:t>
+            </w:r>
+          </w:p>
+          <w:p>
+            <w:pPr>
+              <w:outlineLvl w:val="0"/>
+              <w:rPr>
+                <w:rFonts w:ascii="Times New Roman" w:eastAsiaTheme="minorEastAsia" w:hAnsi="Times New Roman"/>
+                <w:bCs/>
+                <w:sz w:val="22"/>
+                <w:szCs w:val="22"/>
+                <w:lang w:eastAsia="zh-CN"/>
+              </w:rPr>
+            </w:pPr>
+            <w:r>
+              <w:rPr>
+                <w:rFonts w:ascii="Times New Roman" w:eastAsiaTheme="minorEastAsia" w:hAnsi="Times New Roman"/>
+                <w:bCs/>
+                <w:sz w:val="22"/>
+                <w:szCs w:val="22"/>
+                <w:lang w:eastAsia="zh-CN"/>
+              </w:rPr>
+              <w:t xml:space="preserve"> </w:t>
+            </w:r>
+          </w:p>
+          <w:p>
+            <w:pPr>
+              <w:outlineLvl w:val="0"/>
+              <w:rPr>
+                <w:rFonts w:ascii="Times New Roman" w:eastAsiaTheme="minorEastAsia" w:hAnsi="Times New Roman"/>
+                <w:bCs/>
+                <w:sz w:val="22"/>
+                <w:szCs w:val="22"/>
+                <w:lang w:eastAsia="zh-CN"/>
+              </w:rPr>
+            </w:pPr>
+            <w:r>
+              <w:rPr>
+                <w:rFonts w:ascii="Times New Roman" w:eastAsiaTheme="minorEastAsia" w:hAnsi="Times New Roman"/>
+                <w:bCs/>
+                <w:sz w:val="22"/>
+                <w:szCs w:val="22"/>
+                <w:lang w:eastAsia="zh-CN"/>
+              </w:rPr>
+              <w:t>The culture media used were within expiry. Negative control media bottles were processed and incubated under identical conditions and showed no microbial growth, confirming the integrity of the test procedure.</w:t>
+            </w:r>
+          </w:p>
+          <w:p>
+            <w:pPr>
+              <w:outlineLvl w:val="0"/>
+              <w:rPr>
+                <w:rFonts w:ascii="Times New Roman" w:eastAsiaTheme="minorEastAsia" w:hAnsi="Times New Roman"/>
+                <w:bCs/>
+                <w:sz w:val="22"/>
+                <w:szCs w:val="22"/>
+                <w:lang w:eastAsia="zh-CN"/>
+              </w:rPr>
+            </w:pPr>
+          </w:p>
+          <w:p>
+            <w:pPr>
+              <w:outlineLvl w:val="0"/>
+              <w:rPr>
+                <w:rFonts w:ascii="Times New Roman" w:eastAsiaTheme="minorEastAsia" w:hAnsi="Times New Roman"/>
+                <w:bCs/>
+                <w:sz w:val="22"/>
+                <w:szCs w:val="22"/>
+                <w:lang w:eastAsia="zh-CN"/>
+              </w:rPr>
+            </w:pPr>
+            <w:proofErr w:type="gramStart"/>
+            <w:r>
+              <w:rPr>
+                <w:rFonts w:ascii="Times New Roman" w:eastAsiaTheme="minorEastAsia" w:hAnsi="Times New Roman"/>
+                <w:bCs/>
+                <w:sz w:val="22"/>
+                <w:szCs w:val="22"/>
+                <w:lang w:eastAsia="zh-CN"/>
+              </w:rPr>
+              <w:t xml:space="preserve">{{ </w:t>
+            </w:r>
+            <w:proofErr w:type="spellStart"/>
+            <w:r>
+              <w:rPr>
+                <w:rFonts w:ascii="Times New Roman" w:eastAsiaTheme="minorEastAsia" w:hAnsi="Times New Roman"/>
+                <w:bCs/>
+                <w:sz w:val="22"/>
+                <w:szCs w:val="22"/>
+                <w:lang w:eastAsia="zh-CN"/>
+              </w:rPr>
+              <w:t>narrative</w:t>
+            </w:r>
+            <w:proofErr w:type="gramEnd"/>
+            <w:r>
+              <w:rPr>
+                <w:rFonts w:ascii="Times New Roman" w:eastAsiaTheme="minorEastAsia" w:hAnsi="Times New Roman"/>
+                <w:bCs/>
+                <w:sz w:val="22"/>
+                <w:szCs w:val="22"/>
+                <w:lang w:eastAsia="zh-CN"/>
+              </w:rPr>
+              <w:t>_</w:t>
+            </w:r>
+            <w:proofErr w:type="gramStart"/>
+            <w:r>
+              <w:rPr>
+                <w:rFonts w:ascii="Times New Roman" w:eastAsiaTheme="minorEastAsia" w:hAnsi="Times New Roman"/>
+                <w:bCs/>
+                <w:sz w:val="22"/>
+                <w:szCs w:val="22"/>
+                <w:lang w:eastAsia="zh-CN"/>
+              </w:rPr>
+              <w:t>summary</w:t>
+            </w:r>
+            <w:proofErr w:type="spellEnd"/>
+            <w:r>
+              <w:rPr>
+                <w:rFonts w:ascii="Times New Roman" w:eastAsiaTheme="minorEastAsia" w:hAnsi="Times New Roman"/>
+                <w:bCs/>
+                <w:sz w:val="22"/>
+                <w:szCs w:val="22"/>
+                <w:lang w:eastAsia="zh-CN"/>
+              </w:rPr>
+              <w:t xml:space="preserve"> }</w:t>
+            </w:r>
+            <w:proofErr w:type="gramEnd"/>
+            <w:r>
+              <w:rPr>
+                <w:rFonts w:ascii="Times New Roman" w:eastAsiaTheme="minorEastAsia" w:hAnsi="Times New Roman"/>
+                <w:bCs/>
+                <w:sz w:val="22"/>
+                <w:szCs w:val="22"/>
+                <w:lang w:eastAsia="zh-CN"/>
+              </w:rPr>
+              <w:t xml:space="preserve">} </w:t>
+            </w:r>
+          </w:p>
+          <w:p>
+            <w:pPr>
+              <w:outlineLvl w:val="0"/>
+              <w:rPr>
+                <w:rFonts w:ascii="Times New Roman" w:eastAsiaTheme="minorEastAsia" w:hAnsi="Times New Roman"/>
+                <w:bCs/>
+                <w:sz w:val="22"/>
+                <w:szCs w:val="22"/>
+                <w:lang w:eastAsia="zh-CN"/>
+              </w:rPr>
+            </w:pPr>
+          </w:p>
+          <w:p>
+            <w:pPr>
+              <w:outlineLvl w:val="0"/>
+              <w:rPr>
+                <w:rFonts w:ascii="Times New Roman" w:eastAsiaTheme="minorEastAsia" w:hAnsi="Times New Roman"/>
+                <w:bCs/>
+                <w:sz w:val="22"/>
+                <w:szCs w:val="22"/>
+                <w:lang w:eastAsia="zh-CN"/>
+              </w:rPr>
+            </w:pPr>
+            <w:r>
+              <w:rPr>
+                <w:rFonts w:ascii="Times New Roman" w:eastAsiaTheme="minorEastAsia" w:hAnsi="Times New Roman"/>
+                <w:bCs/>
+                <w:sz w:val="22"/>
+                <w:szCs w:val="22"/>
+                <w:lang w:eastAsia="zh-CN"/>
+              </w:rPr>
+              <w:t xml:space="preserve">The analysts confirmed full compliance with cleaning procedures as outlined in SOPs 2.600.018 (Cleaning and Disinfecting Procedure for Microbiology) and 2.600.008 (USP &lt;71&gt; / EP 2.6.1 Sterility Test). </w:t>
+            </w:r>
+          </w:p>
+          <w:p>
+            <w:pPr>
+              <w:outlineLvl w:val="0"/>
+              <w:rPr>
+                <w:rFonts w:ascii="Times New Roman" w:eastAsiaTheme="minorEastAsia" w:hAnsi="Times New Roman"/>
+                <w:bCs/>
+                <w:sz w:val="22"/>
+                <w:szCs w:val="22"/>
+                <w:lang w:eastAsia="zh-CN"/>
+              </w:rPr>
+            </w:pPr>
+          </w:p>
+          <w:p>
+            <w:pPr>
+              <w:outlineLvl w:val="0"/>
+              <w:rPr>
+                <w:rFonts w:ascii="Times New Roman" w:eastAsiaTheme="minorEastAsia" w:hAnsi="Times New Roman"/>
+                <w:bCs/>
+                <w:sz w:val="22"/>
+                <w:szCs w:val="22"/>
+                <w:lang w:eastAsia="zh-CN"/>
+              </w:rPr>
+            </w:pPr>
+            <w:r>
+              <w:rPr>
+                <w:rFonts w:ascii="Times New Roman" w:eastAsiaTheme="minorEastAsia" w:hAnsi="Times New Roman"/>
+                <w:bCs/>
+                <w:sz w:val="22"/>
+                <w:szCs w:val="22"/>
+                <w:lang w:eastAsia="zh-CN"/>
+              </w:rPr>
+              <w:t xml:space="preserve">Monthly cleaning and disinfection of the outermost ISO 8 Anteroom, the middle ISO 7 Buffer room, the innermost ISO 7 cleanroom, and its containing ISO 5 Biosafety Cabinets for CR </w:t>
+            </w:r>
+            <w:proofErr w:type="gramStart"/>
+            <w:r>
+              <w:rPr>
+                <w:rFonts w:ascii="Times New Roman" w:eastAsiaTheme="minorEastAsia" w:hAnsi="Times New Roman"/>
+                <w:bCs/>
+                <w:sz w:val="22"/>
+                <w:szCs w:val="22"/>
+                <w:lang w:eastAsia="zh-CN"/>
+              </w:rPr>
+              <w:t xml:space="preserve">{{ </w:t>
+            </w:r>
+            <w:proofErr w:type="spellStart"/>
+            <w:r>
+              <w:rPr>
+                <w:rFonts w:ascii="Times New Roman" w:eastAsiaTheme="minorEastAsia" w:hAnsi="Times New Roman"/>
+                <w:bCs/>
+                <w:sz w:val="22"/>
+                <w:szCs w:val="22"/>
+                <w:lang w:eastAsia="zh-CN"/>
+              </w:rPr>
+              <w:t>cr</w:t>
+            </w:r>
+            <w:proofErr w:type="gramEnd"/>
+            <w:r>
+              <w:rPr>
+                <w:rFonts w:ascii="Times New Roman" w:eastAsiaTheme="minorEastAsia" w:hAnsi="Times New Roman"/>
+                <w:bCs/>
+                <w:sz w:val="22"/>
+                <w:szCs w:val="22"/>
+                <w:lang w:eastAsia="zh-CN"/>
+              </w:rPr>
+              <w:t>_</w:t>
+            </w:r>
+            <w:proofErr w:type="gramStart"/>
+            <w:r>
+              <w:rPr>
+                <w:rFonts w:ascii="Times New Roman" w:eastAsiaTheme="minorEastAsia" w:hAnsi="Times New Roman"/>
+                <w:bCs/>
+                <w:sz w:val="22"/>
+                <w:szCs w:val="22"/>
+                <w:lang w:eastAsia="zh-CN"/>
+              </w:rPr>
+              <w:t>suit</w:t>
+            </w:r>
+            <w:proofErr w:type="spellEnd"/>
+            <w:r>
+              <w:rPr>
+                <w:rFonts w:ascii="Times New Roman" w:eastAsiaTheme="minorEastAsia" w:hAnsi="Times New Roman"/>
+                <w:bCs/>
+                <w:sz w:val="22"/>
+                <w:szCs w:val="22"/>
+                <w:lang w:eastAsia="zh-CN"/>
+              </w:rPr>
+              <w:t xml:space="preserve"> }</w:t>
+            </w:r>
+            <w:proofErr w:type="gramEnd"/>
+            <w:r>
+              <w:rPr>
+                <w:rFonts w:ascii="Times New Roman" w:eastAsiaTheme="minorEastAsia" w:hAnsi="Times New Roman"/>
+                <w:bCs/>
+                <w:sz w:val="22"/>
+                <w:szCs w:val="22"/>
+                <w:lang w:eastAsia="zh-CN"/>
+              </w:rPr>
+              <w:t xml:space="preserve">} was performed on </w:t>
+            </w:r>
+            <w:proofErr w:type="gramStart"/>
+            <w:r>
+              <w:rPr>
+                <w:rFonts w:ascii="Times New Roman" w:eastAsiaTheme="minorEastAsia" w:hAnsi="Times New Roman"/>
+                <w:bCs/>
+                <w:sz w:val="22"/>
+                <w:szCs w:val="22"/>
+                <w:lang w:eastAsia="zh-CN"/>
+              </w:rPr>
+              <w:t xml:space="preserve">{{ </w:t>
+            </w:r>
+            <w:proofErr w:type="spellStart"/>
+            <w:r>
+              <w:rPr>
+                <w:rFonts w:ascii="Times New Roman" w:eastAsiaTheme="minorEastAsia" w:hAnsi="Times New Roman"/>
+                <w:bCs/>
+                <w:sz w:val="22"/>
+                <w:szCs w:val="22"/>
+                <w:lang w:eastAsia="zh-CN"/>
+              </w:rPr>
+              <w:t>monthly</w:t>
+            </w:r>
+            <w:proofErr w:type="gramEnd"/>
+            <w:r>
+              <w:rPr>
+                <w:rFonts w:ascii="Times New Roman" w:eastAsiaTheme="minorEastAsia" w:hAnsi="Times New Roman"/>
+                <w:bCs/>
+                <w:sz w:val="22"/>
+                <w:szCs w:val="22"/>
+                <w:lang w:eastAsia="zh-CN"/>
+              </w:rPr>
+              <w:t>_cleaning_</w:t>
+            </w:r>
+            <w:proofErr w:type="gramStart"/>
+            <w:r>
+              <w:rPr>
+                <w:rFonts w:ascii="Times New Roman" w:eastAsiaTheme="minorEastAsia" w:hAnsi="Times New Roman"/>
+                <w:bCs/>
+                <w:sz w:val="22"/>
+                <w:szCs w:val="22"/>
+                <w:lang w:eastAsia="zh-CN"/>
+              </w:rPr>
+              <w:t>date</w:t>
+            </w:r>
+            <w:proofErr w:type="spellEnd"/>
+            <w:r>
+              <w:rPr>
+                <w:rFonts w:ascii="Times New Roman" w:eastAsiaTheme="minorEastAsia" w:hAnsi="Times New Roman"/>
+                <w:bCs/>
+                <w:sz w:val="22"/>
+                <w:szCs w:val="22"/>
+                <w:lang w:eastAsia="zh-CN"/>
+              </w:rPr>
+              <w:t xml:space="preserve"> }</w:t>
+            </w:r>
+            <w:proofErr w:type="gramEnd"/>
+            <w:r>
+              <w:rPr>
+                <w:rFonts w:ascii="Times New Roman" w:eastAsiaTheme="minorEastAsia" w:hAnsi="Times New Roman"/>
+                <w:bCs/>
+                <w:sz w:val="22"/>
+                <w:szCs w:val="22"/>
+                <w:lang w:eastAsia="zh-CN"/>
+              </w:rPr>
+              <w:t xml:space="preserve">}, as per SOP 2.600.018 (Cleaning and Disinfecting Procedure for Microbiology) During </w:t>
+            </w:r>
+            <w:r>
+              <w:rPr>
+                <w:rFonts w:ascii="Times New Roman" w:eastAsiaTheme="minorEastAsia" w:hAnsi="Times New Roman"/>
+                <w:bCs/>
+                <w:sz w:val="22"/>
+                <w:szCs w:val="22"/>
+                <w:lang w:eastAsia="zh-CN"/>
+              </w:rPr>
               <w:lastRenderedPageBreak/>
-              <w:t xml:space="preserve">All the analysts involved in the testing, the processing analyst ({{ analyst_name }}) and the reading analyst who confirmed the positive result ({{ reading_name }}), were interviewed comprehensively. Their answers are recorded throughout this document. </w:t>
-            </w:r>
-          </w:p>
-          <w:p>
-            <w:pPr>
-              <w:outlineLvl w:val="0"/>
-              <w:rPr>
-                <w:rFonts w:ascii="Times New Roman" w:eastAsiaTheme="minorEastAsia" w:hAnsi="Times New Roman"/>
-                <w:bCs/>
-                <w:sz w:val="22"/>
-                <w:szCs w:val="22"/>
-                <w:lang w:eastAsia="zh-CN"/>
-              </w:rPr>
-            </w:pPr>
-          </w:p>
-          <w:p>
-            <w:pPr>
-              <w:outlineLvl w:val="0"/>
-              <w:rPr>
-                <w:rFonts w:ascii="Times New Roman" w:eastAsiaTheme="minorEastAsia" w:hAnsi="Times New Roman"/>
-                <w:bCs/>
-                <w:sz w:val="22"/>
-                <w:szCs w:val="22"/>
-                <w:lang w:eastAsia="zh-CN"/>
-              </w:rPr>
-            </w:pPr>
-            <w:r>
-              <w:rPr>
-                <w:rFonts w:ascii="Times New Roman" w:eastAsiaTheme="minorEastAsia" w:hAnsi="Times New Roman"/>
-                <w:bCs/>
-                <w:sz w:val="22"/>
-                <w:szCs w:val="22"/>
-                <w:lang w:eastAsia="zh-CN"/>
-              </w:rPr>
-              <w:t>Upon arrival, the sample was stored in accordance with the Client’s instructions. Analyst {{ prepper_name }} verified the sample’s integrity throughout both the preparation and processing stages. No leaks or turbidity were observed at any point, verifying the integrity of the sample.</w:t>
-            </w:r>
-          </w:p>
-          <w:p>
-            <w:pPr>
-              <w:outlineLvl w:val="0"/>
-              <w:rPr>
-                <w:rFonts w:ascii="Times New Roman" w:eastAsiaTheme="minorEastAsia" w:hAnsi="Times New Roman"/>
-                <w:bCs/>
-                <w:sz w:val="22"/>
-                <w:szCs w:val="22"/>
-                <w:lang w:eastAsia="zh-CN"/>
-              </w:rPr>
-            </w:pPr>
-          </w:p>
-          <w:p>
-            <w:pPr>
-              <w:outlineLvl w:val="0"/>
-              <w:rPr>
-                <w:rFonts w:ascii="Times New Roman" w:eastAsiaTheme="minorEastAsia" w:hAnsi="Times New Roman"/>
-                <w:bCs/>
-                <w:sz w:val="22"/>
-                <w:szCs w:val="22"/>
-                <w:lang w:eastAsia="zh-CN"/>
-              </w:rPr>
-            </w:pPr>
-            <w:r>
-              <w:rPr>
-                <w:rFonts w:ascii="Times New Roman" w:eastAsiaTheme="minorEastAsia" w:hAnsi="Times New Roman"/>
-                <w:bCs/>
-                <w:sz w:val="22"/>
-                <w:szCs w:val="22"/>
-                <w:lang w:eastAsia="zh-CN"/>
-              </w:rPr>
-              <w:t>All reagents and supplies mentioned in the material section above were stored according to the suppliers’ recommendations, and their integrity was visually verified before utilization. Moreover, all reagents and supplies had valid expiration dates. The functionality of all equipment was confirmed by reviewing data generated by our comprehensive in-house continuous monitoring system.</w:t>
-            </w:r>
-          </w:p>
-          <w:p>
-            <w:pPr>
-              <w:outlineLvl w:val="0"/>
-              <w:rPr>
-                <w:rFonts w:ascii="Times New Roman" w:eastAsiaTheme="minorEastAsia" w:hAnsi="Times New Roman"/>
-                <w:bCs/>
-                <w:sz w:val="22"/>
-                <w:szCs w:val="22"/>
-                <w:lang w:eastAsia="zh-CN"/>
-              </w:rPr>
-            </w:pPr>
-            <w:r>
-              <w:rPr>
-                <w:rFonts w:ascii="Times New Roman" w:eastAsiaTheme="minorEastAsia" w:hAnsi="Times New Roman"/>
-                <w:bCs/>
-                <w:sz w:val="22"/>
-                <w:szCs w:val="22"/>
-                <w:lang w:eastAsia="zh-CN"/>
-              </w:rPr>
-              <w:t>{{ equipment_summary }}</w:t>
-            </w:r>
-          </w:p>
-          <w:p>
-            <w:pPr>
-              <w:outlineLvl w:val="0"/>
-              <w:rPr>
-                <w:rFonts w:ascii="Times New Roman" w:eastAsiaTheme="minorEastAsia" w:hAnsi="Times New Roman"/>
-                <w:bCs/>
-                <w:sz w:val="22"/>
-                <w:szCs w:val="22"/>
-                <w:lang w:eastAsia="zh-CN"/>
-              </w:rPr>
-            </w:pPr>
-          </w:p>
-          <w:p>
-            <w:pPr>
-              <w:outlineLvl w:val="0"/>
-              <w:rPr>
-                <w:rFonts w:ascii="Times New Roman" w:eastAsiaTheme="minorEastAsia" w:hAnsi="Times New Roman"/>
-                <w:bCs/>
-                <w:sz w:val="22"/>
-                <w:szCs w:val="22"/>
-                <w:lang w:eastAsia="zh-CN"/>
-              </w:rPr>
-            </w:pPr>
-            <w:r>
-              <w:rPr>
-                <w:rFonts w:ascii="Times New Roman" w:eastAsiaTheme="minorEastAsia" w:hAnsi="Times New Roman"/>
-                <w:bCs/>
-                <w:sz w:val="22"/>
-                <w:szCs w:val="22"/>
-                <w:lang w:eastAsia="zh-CN"/>
-              </w:rPr>
-              <w:t>On {{received_data}}, the sample vials for {{ sample_id }} were received from the Sample Submissions team and brought into the Sterile Microbiology lab. Upon arrival, each sample vial was sprayed with an acidified bleach disinfectant, placed into pre-disinfected bins, and allowed a 10-minute contact time. The secondary disinfection happened in the ISO 8 anteroom (Suite {{ cr_suit }})), where the vials were again treated with acidified bleach and provided a 10‑minute contact time before processing. Subsequently, the vials were moved into the ISO 7 cleanroom Suite {{ cr_suit }}({{ suit }}). Inside this cleanroom, the processing analyst, {{ analyst_name }}, performed a final disinfection step, allowing an additional 10-minute contact time. Once fully disinfected, the vials were transferred into the ISO 5 BSC E00{{bsc_id}}.</w:t>
-            </w:r>
-          </w:p>
-          <w:p>
-            <w:pPr>
-              <w:outlineLvl w:val="0"/>
-              <w:rPr>
-                <w:rFonts w:ascii="Times New Roman" w:eastAsiaTheme="minorEastAsia" w:hAnsi="Times New Roman"/>
-                <w:bCs/>
-                <w:sz w:val="22"/>
-                <w:szCs w:val="22"/>
-                <w:lang w:eastAsia="zh-CN"/>
-              </w:rPr>
-            </w:pPr>
-          </w:p>
-          <w:p>
-            <w:pPr>
-              <w:outlineLvl w:val="0"/>
-              <w:rPr>
-                <w:rFonts w:ascii="Times New Roman" w:eastAsiaTheme="minorEastAsia" w:hAnsi="Times New Roman"/>
-                <w:bCs/>
-                <w:sz w:val="22"/>
-                <w:szCs w:val="22"/>
-                <w:lang w:eastAsia="zh-CN"/>
-              </w:rPr>
-            </w:pPr>
-            <w:r>
-              <w:rPr>
-                <w:rFonts w:ascii="Times New Roman" w:eastAsiaTheme="minorEastAsia" w:hAnsi="Times New Roman"/>
-                <w:bCs/>
-                <w:sz w:val="22"/>
-                <w:szCs w:val="22"/>
-                <w:lang w:eastAsia="zh-CN"/>
-              </w:rPr>
-              <w:t xml:space="preserve">Once transferred into the ISO 5 BSC, the vials were placed on the disinfected working surface of the BSC E00{{bsc_id}} and aseptically opened and tested in accordance with SOP 2.600.008 (USP / EP 2.6.1 Sterility Test). Following testing, the media bottles were subsequently transferred into designated incubators, E001356 and E001357, to initiate incubation. </w:t>
-            </w:r>
-          </w:p>
-          <w:p>
-            <w:pPr>
-              <w:outlineLvl w:val="0"/>
-              <w:rPr>
-                <w:rFonts w:ascii="Times New Roman" w:eastAsiaTheme="minorEastAsia" w:hAnsi="Times New Roman"/>
-                <w:bCs/>
-                <w:sz w:val="22"/>
-                <w:szCs w:val="22"/>
-                <w:lang w:eastAsia="zh-CN"/>
-              </w:rPr>
-            </w:pPr>
-          </w:p>
-          <w:p>
-            <w:pPr>
-              <w:outlineLvl w:val="0"/>
-              <w:rPr>
-                <w:rFonts w:ascii="Times New Roman" w:eastAsiaTheme="minorEastAsia" w:hAnsi="Times New Roman"/>
-                <w:bCs/>
-                <w:sz w:val="22"/>
-                <w:szCs w:val="22"/>
-                <w:lang w:eastAsia="zh-CN"/>
-              </w:rPr>
-            </w:pPr>
-            <w:r>
-              <w:rPr>
-                <w:rFonts w:ascii="Times New Roman" w:eastAsiaTheme="minorEastAsia" w:hAnsi="Times New Roman"/>
-                <w:bCs/>
-                <w:sz w:val="22"/>
-                <w:szCs w:val="22"/>
-                <w:lang w:eastAsia="zh-CN"/>
-              </w:rPr>
-              <w:t>On {{ test_date }} (Day {{incubation_time}} of incubation), microbial growth was observed in {{ positive_media}} media bottle by analyst {{ reading_name }} and confirmed by Microbiology Lab Supervisor Robin Seymour. The organism was identified as {{ positive_org }} (see Table 1).</w:t>
-            </w:r>
-          </w:p>
-          <w:p>
-            <w:pPr>
-              <w:outlineLvl w:val="0"/>
-              <w:rPr>
-                <w:rFonts w:ascii="Times New Roman" w:eastAsiaTheme="minorEastAsia" w:hAnsi="Times New Roman"/>
-                <w:bCs/>
-                <w:sz w:val="22"/>
-                <w:szCs w:val="22"/>
-                <w:lang w:eastAsia="zh-CN"/>
-              </w:rPr>
-            </w:pPr>
-            <w:r>
-              <w:rPr>
-                <w:rFonts w:ascii="Times New Roman" w:eastAsiaTheme="minorEastAsia" w:hAnsi="Times New Roman"/>
-                <w:bCs/>
-                <w:sz w:val="22"/>
-                <w:szCs w:val="22"/>
-                <w:lang w:eastAsia="zh-CN"/>
-              </w:rPr>
-              <w:t xml:space="preserve"> </w:t>
-            </w:r>
-          </w:p>
-          <w:p>
-            <w:pPr>
-              <w:outlineLvl w:val="0"/>
-              <w:rPr>
-                <w:rFonts w:ascii="Times New Roman" w:eastAsiaTheme="minorEastAsia" w:hAnsi="Times New Roman"/>
-                <w:bCs/>
-                <w:sz w:val="22"/>
-                <w:szCs w:val="22"/>
-                <w:lang w:eastAsia="zh-CN"/>
-              </w:rPr>
-            </w:pPr>
-            <w:r>
-              <w:rPr>
-                <w:rFonts w:ascii="Times New Roman" w:eastAsiaTheme="minorEastAsia" w:hAnsi="Times New Roman"/>
-                <w:bCs/>
-                <w:sz w:val="22"/>
-                <w:szCs w:val="22"/>
-                <w:lang w:eastAsia="zh-CN"/>
-              </w:rPr>
-              <w:t>The culture media used were within expiry. Negative control media bottles were processed and incubated under identical conditions and showed no microbial growth, confirming the integrity of the test procedure.</w:t>
-            </w:r>
-          </w:p>
-          <w:p>
-            <w:pPr>
-              <w:outlineLvl w:val="0"/>
-              <w:rPr>
-                <w:rFonts w:ascii="Times New Roman" w:eastAsiaTheme="minorEastAsia" w:hAnsi="Times New Roman"/>
-                <w:bCs/>
-                <w:sz w:val="22"/>
-                <w:szCs w:val="22"/>
-                <w:lang w:eastAsia="zh-CN"/>
-              </w:rPr>
-            </w:pPr>
-          </w:p>
-          <w:p>
-            <w:pPr>
-              <w:outlineLvl w:val="0"/>
-              <w:rPr>
-                <w:rFonts w:ascii="Times New Roman" w:eastAsiaTheme="minorEastAsia" w:hAnsi="Times New Roman"/>
-                <w:bCs/>
-                <w:sz w:val="22"/>
-                <w:szCs w:val="22"/>
-                <w:lang w:eastAsia="zh-CN"/>
-              </w:rPr>
-            </w:pPr>
-            <w:r>
-              <w:rPr>
-                <w:rFonts w:ascii="Times New Roman" w:eastAsiaTheme="minorEastAsia" w:hAnsi="Times New Roman"/>
-                <w:bCs/>
-                <w:sz w:val="22"/>
-                <w:szCs w:val="22"/>
-                <w:lang w:eastAsia="zh-CN"/>
-              </w:rPr>
-              <w:t xml:space="preserve">{{ narrative_summary }} </w:t>
-            </w:r>
-          </w:p>
-          <w:p>
-            <w:pPr>
-              <w:outlineLvl w:val="0"/>
-              <w:rPr>
-                <w:rFonts w:ascii="Times New Roman" w:eastAsiaTheme="minorEastAsia" w:hAnsi="Times New Roman"/>
-                <w:bCs/>
-                <w:sz w:val="22"/>
-                <w:szCs w:val="22"/>
-                <w:lang w:eastAsia="zh-CN"/>
-              </w:rPr>
-            </w:pPr>
-          </w:p>
-          <w:p>
-            <w:pPr>
-              <w:outlineLvl w:val="0"/>
-              <w:rPr>
-                <w:rFonts w:ascii="Times New Roman" w:eastAsiaTheme="minorEastAsia" w:hAnsi="Times New Roman"/>
-                <w:bCs/>
-                <w:sz w:val="22"/>
-                <w:szCs w:val="22"/>
-                <w:lang w:eastAsia="zh-CN"/>
-              </w:rPr>
-            </w:pPr>
-            <w:r>
-              <w:rPr>
-                <w:rFonts w:ascii="Times New Roman" w:eastAsiaTheme="minorEastAsia" w:hAnsi="Times New Roman"/>
-                <w:bCs/>
-                <w:sz w:val="22"/>
-                <w:szCs w:val="22"/>
-                <w:lang w:eastAsia="zh-CN"/>
-              </w:rPr>
-              <w:t xml:space="preserve">The analysts confirmed full compliance with cleaning procedures as outlined in SOPs 2.600.018 (Cleaning and Disinfecting Procedure for Microbiology) and 2.600.008 (USP &lt;71&gt; / EP 2.6.1 Sterility Test). </w:t>
-            </w:r>
-          </w:p>
-          <w:p>
-            <w:pPr>
-              <w:outlineLvl w:val="0"/>
-              <w:rPr>
-                <w:rFonts w:ascii="Times New Roman" w:eastAsiaTheme="minorEastAsia" w:hAnsi="Times New Roman"/>
-                <w:bCs/>
-                <w:sz w:val="22"/>
-                <w:szCs w:val="22"/>
-                <w:lang w:eastAsia="zh-CN"/>
-              </w:rPr>
-            </w:pPr>
-          </w:p>
-          <w:p>
-            <w:pPr>
-              <w:outlineLvl w:val="0"/>
-              <w:rPr>
-                <w:rFonts w:ascii="Times New Roman" w:eastAsiaTheme="minorEastAsia" w:hAnsi="Times New Roman"/>
-                <w:bCs/>
-                <w:sz w:val="22"/>
-                <w:szCs w:val="22"/>
-                <w:lang w:eastAsia="zh-CN"/>
-              </w:rPr>
-            </w:pPr>
-            <w:r>
-              <w:rPr>
-                <w:rFonts w:ascii="Times New Roman" w:eastAsiaTheme="minorEastAsia" w:hAnsi="Times New Roman"/>
-                <w:bCs/>
-                <w:sz w:val="22"/>
-                <w:szCs w:val="22"/>
-                <w:lang w:eastAsia="zh-CN"/>
-              </w:rPr>
-              <w:t xml:space="preserve">Monthly cleaning and disinfection of the outermost ISO 8 Anteroom, the middle ISO 7 Buffer room, the innermost ISO 7 cleanroom, and its containing ISO 5 Biosafety Cabinets for CR {{ cr_suit }} was performed on {{ monthly_cleaning_date }}, as per SOP 2.600.018 (Cleaning and Disinfecting Procedure for Microbiology) During both cleaning cycles, it was documented that all H₂O₂ indicators passed. This confirms the efficient monthly cleaning of all three parts of Cleanrooms {{ cr_suit }}. </w:t>
-            </w:r>
-          </w:p>
-          <w:p>
-            <w:pPr>
-              <w:outlineLvl w:val="0"/>
-              <w:rPr>
-                <w:rFonts w:ascii="Times New Roman" w:eastAsiaTheme="minorEastAsia" w:hAnsi="Times New Roman"/>
-                <w:bCs/>
-                <w:sz w:val="22"/>
-                <w:szCs w:val="22"/>
-                <w:lang w:eastAsia="zh-CN"/>
-              </w:rPr>
-            </w:pPr>
-          </w:p>
-          <w:p>
-            <w:pPr>
-              <w:outlineLvl w:val="0"/>
-              <w:rPr>
-                <w:rFonts w:ascii="Times New Roman" w:eastAsiaTheme="minorEastAsia" w:hAnsi="Times New Roman"/>
-                <w:bCs/>
-                <w:sz w:val="22"/>
-                <w:szCs w:val="22"/>
-                <w:lang w:eastAsia="zh-CN"/>
-              </w:rPr>
-            </w:pPr>
-            <w:r>
-              <w:rPr>
-                <w:rFonts w:ascii="Times New Roman" w:eastAsiaTheme="minorEastAsia" w:hAnsi="Times New Roman"/>
-                <w:bCs/>
-                <w:sz w:val="22"/>
-                <w:szCs w:val="22"/>
-                <w:lang w:eastAsia="zh-CN"/>
-              </w:rPr>
-              <w:t>{{ sample_history_paragraph }}</w:t>
-            </w:r>
-          </w:p>
-          <w:p>
-            <w:pPr>
-              <w:outlineLvl w:val="0"/>
-              <w:rPr>
-                <w:rFonts w:ascii="Times New Roman" w:eastAsiaTheme="minorEastAsia" w:hAnsi="Times New Roman"/>
-                <w:bCs/>
-                <w:sz w:val="22"/>
-                <w:szCs w:val="22"/>
-                <w:lang w:eastAsia="zh-CN"/>
-              </w:rPr>
-            </w:pPr>
-          </w:p>
-          <w:p>
-            <w:pPr>
-              <w:outlineLvl w:val="0"/>
-              <w:rPr>
-                <w:rFonts w:ascii="Times New Roman" w:eastAsiaTheme="minorEastAsia" w:hAnsi="Times New Roman"/>
-                <w:bCs/>
-                <w:sz w:val="22"/>
-                <w:szCs w:val="22"/>
-                <w:lang w:eastAsia="zh-CN"/>
-              </w:rPr>
-            </w:pPr>
-            <w:r>
-              <w:rPr>
-                <w:rFonts w:ascii="Times New Roman" w:eastAsiaTheme="minorEastAsia" w:hAnsi="Times New Roman"/>
-                <w:bCs/>
-                <w:sz w:val="22"/>
-                <w:szCs w:val="22"/>
-                <w:lang w:eastAsia="zh-CN"/>
-              </w:rPr>
-              <w:t>To assess the potential for sample-to-sample contamination contributing to the positive results, a comprehensive review was conducted of all samples processed on the same day. {{ cross_contamination_summary }}</w:t>
+              <w:t xml:space="preserve">both cleaning cycles, it was documented that all H₂O₂ indicators passed. This confirms the efficient monthly cleaning of all three parts of Cleanrooms </w:t>
+            </w:r>
+            <w:proofErr w:type="gramStart"/>
+            <w:r>
+              <w:rPr>
+                <w:rFonts w:ascii="Times New Roman" w:eastAsiaTheme="minorEastAsia" w:hAnsi="Times New Roman"/>
+                <w:bCs/>
+                <w:sz w:val="22"/>
+                <w:szCs w:val="22"/>
+                <w:lang w:eastAsia="zh-CN"/>
+              </w:rPr>
+              <w:t xml:space="preserve">{{ </w:t>
+            </w:r>
+            <w:proofErr w:type="spellStart"/>
+            <w:r>
+              <w:rPr>
+                <w:rFonts w:ascii="Times New Roman" w:eastAsiaTheme="minorEastAsia" w:hAnsi="Times New Roman"/>
+                <w:bCs/>
+                <w:sz w:val="22"/>
+                <w:szCs w:val="22"/>
+                <w:lang w:eastAsia="zh-CN"/>
+              </w:rPr>
+              <w:t>cr</w:t>
+            </w:r>
+            <w:proofErr w:type="gramEnd"/>
+            <w:r>
+              <w:rPr>
+                <w:rFonts w:ascii="Times New Roman" w:eastAsiaTheme="minorEastAsia" w:hAnsi="Times New Roman"/>
+                <w:bCs/>
+                <w:sz w:val="22"/>
+                <w:szCs w:val="22"/>
+                <w:lang w:eastAsia="zh-CN"/>
+              </w:rPr>
+              <w:t>_</w:t>
+            </w:r>
+            <w:proofErr w:type="gramStart"/>
+            <w:r>
+              <w:rPr>
+                <w:rFonts w:ascii="Times New Roman" w:eastAsiaTheme="minorEastAsia" w:hAnsi="Times New Roman"/>
+                <w:bCs/>
+                <w:sz w:val="22"/>
+                <w:szCs w:val="22"/>
+                <w:lang w:eastAsia="zh-CN"/>
+              </w:rPr>
+              <w:t>suit</w:t>
+            </w:r>
+            <w:proofErr w:type="spellEnd"/>
+            <w:r>
+              <w:rPr>
+                <w:rFonts w:ascii="Times New Roman" w:eastAsiaTheme="minorEastAsia" w:hAnsi="Times New Roman"/>
+                <w:bCs/>
+                <w:sz w:val="22"/>
+                <w:szCs w:val="22"/>
+                <w:lang w:eastAsia="zh-CN"/>
+              </w:rPr>
+              <w:t xml:space="preserve"> }</w:t>
+            </w:r>
+            <w:proofErr w:type="gramEnd"/>
+            <w:r>
+              <w:rPr>
+                <w:rFonts w:ascii="Times New Roman" w:eastAsiaTheme="minorEastAsia" w:hAnsi="Times New Roman"/>
+                <w:bCs/>
+                <w:sz w:val="22"/>
+                <w:szCs w:val="22"/>
+                <w:lang w:eastAsia="zh-CN"/>
+              </w:rPr>
+              <w:t xml:space="preserve">}. </w:t>
+            </w:r>
+          </w:p>
+          <w:p>
+            <w:pPr>
+              <w:outlineLvl w:val="0"/>
+              <w:rPr>
+                <w:rFonts w:ascii="Times New Roman" w:eastAsiaTheme="minorEastAsia" w:hAnsi="Times New Roman"/>
+                <w:bCs/>
+                <w:sz w:val="22"/>
+                <w:szCs w:val="22"/>
+                <w:lang w:eastAsia="zh-CN"/>
+              </w:rPr>
+            </w:pPr>
+          </w:p>
+          <w:p>
+            <w:pPr>
+              <w:outlineLvl w:val="0"/>
+              <w:rPr>
+                <w:rFonts w:ascii="Times New Roman" w:eastAsiaTheme="minorEastAsia" w:hAnsi="Times New Roman"/>
+                <w:bCs/>
+                <w:sz w:val="22"/>
+                <w:szCs w:val="22"/>
+                <w:lang w:eastAsia="zh-CN"/>
+              </w:rPr>
+            </w:pPr>
+            <w:proofErr w:type="gramStart"/>
+            <w:r>
+              <w:rPr>
+                <w:rFonts w:ascii="Times New Roman" w:eastAsiaTheme="minorEastAsia" w:hAnsi="Times New Roman"/>
+                <w:bCs/>
+                <w:sz w:val="22"/>
+                <w:szCs w:val="22"/>
+                <w:lang w:eastAsia="zh-CN"/>
+              </w:rPr>
+              <w:t xml:space="preserve">{{ </w:t>
+            </w:r>
+            <w:proofErr w:type="spellStart"/>
+            <w:r>
+              <w:rPr>
+                <w:rFonts w:ascii="Times New Roman" w:eastAsiaTheme="minorEastAsia" w:hAnsi="Times New Roman"/>
+                <w:bCs/>
+                <w:sz w:val="22"/>
+                <w:szCs w:val="22"/>
+                <w:lang w:eastAsia="zh-CN"/>
+              </w:rPr>
+              <w:t>sample</w:t>
+            </w:r>
+            <w:proofErr w:type="gramEnd"/>
+            <w:r>
+              <w:rPr>
+                <w:rFonts w:ascii="Times New Roman" w:eastAsiaTheme="minorEastAsia" w:hAnsi="Times New Roman"/>
+                <w:bCs/>
+                <w:sz w:val="22"/>
+                <w:szCs w:val="22"/>
+                <w:lang w:eastAsia="zh-CN"/>
+              </w:rPr>
+              <w:t>_history_</w:t>
+            </w:r>
+            <w:proofErr w:type="gramStart"/>
+            <w:r>
+              <w:rPr>
+                <w:rFonts w:ascii="Times New Roman" w:eastAsiaTheme="minorEastAsia" w:hAnsi="Times New Roman"/>
+                <w:bCs/>
+                <w:sz w:val="22"/>
+                <w:szCs w:val="22"/>
+                <w:lang w:eastAsia="zh-CN"/>
+              </w:rPr>
+              <w:t>paragraph</w:t>
+            </w:r>
+            <w:proofErr w:type="spellEnd"/>
+            <w:r>
+              <w:rPr>
+                <w:rFonts w:ascii="Times New Roman" w:eastAsiaTheme="minorEastAsia" w:hAnsi="Times New Roman"/>
+                <w:bCs/>
+                <w:sz w:val="22"/>
+                <w:szCs w:val="22"/>
+                <w:lang w:eastAsia="zh-CN"/>
+              </w:rPr>
+              <w:t xml:space="preserve"> }</w:t>
+            </w:r>
+            <w:proofErr w:type="gramEnd"/>
+            <w:r>
+              <w:rPr>
+                <w:rFonts w:ascii="Times New Roman" w:eastAsiaTheme="minorEastAsia" w:hAnsi="Times New Roman"/>
+                <w:bCs/>
+                <w:sz w:val="22"/>
+                <w:szCs w:val="22"/>
+                <w:lang w:eastAsia="zh-CN"/>
+              </w:rPr>
+              <w:t>}</w:t>
+            </w:r>
+          </w:p>
+          <w:p>
+            <w:pPr>
+              <w:outlineLvl w:val="0"/>
+              <w:rPr>
+                <w:rFonts w:ascii="Times New Roman" w:eastAsiaTheme="minorEastAsia" w:hAnsi="Times New Roman"/>
+                <w:bCs/>
+                <w:sz w:val="22"/>
+                <w:szCs w:val="22"/>
+                <w:lang w:eastAsia="zh-CN"/>
+              </w:rPr>
+            </w:pPr>
+          </w:p>
+          <w:p>
+            <w:pPr>
+              <w:outlineLvl w:val="0"/>
+              <w:rPr>
+                <w:rFonts w:ascii="Times New Roman" w:eastAsiaTheme="minorEastAsia" w:hAnsi="Times New Roman"/>
+                <w:bCs/>
+                <w:sz w:val="22"/>
+                <w:szCs w:val="22"/>
+                <w:lang w:eastAsia="zh-CN"/>
+              </w:rPr>
+            </w:pPr>
+            <w:r>
+              <w:rPr>
+                <w:rFonts w:ascii="Times New Roman" w:eastAsiaTheme="minorEastAsia" w:hAnsi="Times New Roman"/>
+                <w:bCs/>
+                <w:sz w:val="22"/>
+                <w:szCs w:val="22"/>
+                <w:lang w:eastAsia="zh-CN"/>
+              </w:rPr>
+              <w:t xml:space="preserve">To assess the potential for sample-to-sample contamination contributing to the positive results, a comprehensive review was conducted of all samples processed on the same day. </w:t>
+            </w:r>
+            <w:proofErr w:type="gramStart"/>
+            <w:r>
+              <w:rPr>
+                <w:rFonts w:ascii="Times New Roman" w:eastAsiaTheme="minorEastAsia" w:hAnsi="Times New Roman"/>
+                <w:bCs/>
+                <w:sz w:val="22"/>
+                <w:szCs w:val="22"/>
+                <w:lang w:eastAsia="zh-CN"/>
+              </w:rPr>
+              <w:t xml:space="preserve">{{ </w:t>
+            </w:r>
+            <w:proofErr w:type="spellStart"/>
+            <w:r>
+              <w:rPr>
+                <w:rFonts w:ascii="Times New Roman" w:eastAsiaTheme="minorEastAsia" w:hAnsi="Times New Roman"/>
+                <w:bCs/>
+                <w:sz w:val="22"/>
+                <w:szCs w:val="22"/>
+                <w:lang w:eastAsia="zh-CN"/>
+              </w:rPr>
+              <w:t>cross</w:t>
+            </w:r>
+            <w:proofErr w:type="gramEnd"/>
+            <w:r>
+              <w:rPr>
+                <w:rFonts w:ascii="Times New Roman" w:eastAsiaTheme="minorEastAsia" w:hAnsi="Times New Roman"/>
+                <w:bCs/>
+                <w:sz w:val="22"/>
+                <w:szCs w:val="22"/>
+                <w:lang w:eastAsia="zh-CN"/>
+              </w:rPr>
+              <w:t>_contamination_</w:t>
+            </w:r>
+            <w:proofErr w:type="gramStart"/>
+            <w:r>
+              <w:rPr>
+                <w:rFonts w:ascii="Times New Roman" w:eastAsiaTheme="minorEastAsia" w:hAnsi="Times New Roman"/>
+                <w:bCs/>
+                <w:sz w:val="22"/>
+                <w:szCs w:val="22"/>
+                <w:lang w:eastAsia="zh-CN"/>
+              </w:rPr>
+              <w:t>summary</w:t>
+            </w:r>
+            <w:proofErr w:type="spellEnd"/>
+            <w:r>
+              <w:rPr>
+                <w:rFonts w:ascii="Times New Roman" w:eastAsiaTheme="minorEastAsia" w:hAnsi="Times New Roman"/>
+                <w:bCs/>
+                <w:sz w:val="22"/>
+                <w:szCs w:val="22"/>
+                <w:lang w:eastAsia="zh-CN"/>
+              </w:rPr>
+              <w:t xml:space="preserve"> }</w:t>
+            </w:r>
+            <w:proofErr w:type="gramEnd"/>
+            <w:r>
+              <w:rPr>
+                <w:rFonts w:ascii="Times New Roman" w:eastAsiaTheme="minorEastAsia" w:hAnsi="Times New Roman"/>
+                <w:bCs/>
+                <w:sz w:val="22"/>
+                <w:szCs w:val="22"/>
+                <w:lang w:eastAsia="zh-CN"/>
+              </w:rPr>
+              <w:t>}</w:t>
             </w:r>
           </w:p>
           <w:p>
@@ -12657,7 +15183,16 @@
               <w:b/>
               <w:sz w:val="24"/>
             </w:rPr>
-            <w:t>3.100.</w:t>
+            <w:t>3.</w:t>
+          </w:r>
+          <w:proofErr w:type="gramStart"/>
+          <w:r>
+            <w:rPr>
+              <w:rFonts w:ascii="Times New Roman" w:hAnsi="Times New Roman"/>
+              <w:b/>
+              <w:sz w:val="24"/>
+            </w:rPr>
+            <w:t>100.</w:t>
           </w:r>
           <w:r>
             <w:rPr>
@@ -12675,6 +15210,7 @@
             </w:rPr>
             <w:t>19.F</w:t>
           </w:r>
+          <w:proofErr w:type="gramEnd"/>
           <w:r>
             <w:rPr>
               <w:rFonts w:ascii="Times New Roman" w:hAnsi="Times New Roman"/>
@@ -13043,6 +15579,7 @@
       </w:rPr>
       <w:t xml:space="preserve"> OOS Number: OOS</w:t>
     </w:r>
+    <w:proofErr w:type="gramStart"/>
     <w:r>
       <w:rPr>
         <w:rFonts w:ascii="Times New Roman" w:hAnsi="Times New Roman"/>
@@ -13061,7 +15598,62 @@
         <w:sz w:val="22"/>
         <w:szCs w:val="22"/>
       </w:rPr>
-      <w:t>{{ oos_id }}</w:t>
+      <w:t xml:space="preserve">{{ </w:t>
+    </w:r>
+    <w:proofErr w:type="spellStart"/>
+    <w:r>
+      <w:rPr>
+        <w:rFonts w:ascii="Times New Roman" w:hAnsi="Times New Roman"/>
+        <w:b/>
+        <w:bCs/>
+        <w:sz w:val="22"/>
+        <w:szCs w:val="22"/>
+      </w:rPr>
+      <w:t>oos</w:t>
+    </w:r>
+    <w:proofErr w:type="gramEnd"/>
+    <w:r>
+      <w:rPr>
+        <w:rFonts w:ascii="Times New Roman" w:hAnsi="Times New Roman"/>
+        <w:b/>
+        <w:bCs/>
+        <w:sz w:val="22"/>
+        <w:szCs w:val="22"/>
+      </w:rPr>
+      <w:t>_</w:t>
+    </w:r>
+    <w:proofErr w:type="gramStart"/>
+    <w:r>
+      <w:rPr>
+        <w:rFonts w:ascii="Times New Roman" w:hAnsi="Times New Roman"/>
+        <w:b/>
+        <w:bCs/>
+        <w:sz w:val="22"/>
+        <w:szCs w:val="22"/>
+      </w:rPr>
+      <w:t>id</w:t>
+    </w:r>
+    <w:proofErr w:type="spellEnd"/>
+    <w:r>
+      <w:rPr>
+        <w:rFonts w:ascii="Times New Roman" w:hAnsi="Times New Roman"/>
+        <w:b/>
+        <w:bCs/>
+        <w:sz w:val="22"/>
+        <w:szCs w:val="22"/>
+      </w:rPr>
+      <w:t xml:space="preserve"> }</w:t>
+    </w:r>
+    <w:proofErr w:type="gramEnd"/>
+    <w:r>
+      <w:rPr>
+        <w:rFonts w:ascii="Times New Roman" w:hAnsi="Times New Roman"/>
+        <w:b/>
+        <w:bCs/>
+        <w:sz w:val="22"/>
+        <w:szCs w:val="22"/>
+      </w:rPr>
+      <w:t>}</w:t>
     </w:r>
   </w:p>
 </w:hdr>
@@ -14644,6 +17236,7 @@
   <w:style w:type="character" w:default="1" w:styleId="DefaultParagraphFont">
     <w:name w:val="Default Paragraph Font"/>
     <w:uiPriority w:val="1"/>
+    <w:semiHidden/>
     <w:unhideWhenUsed/>
   </w:style>
   <w:style w:type="table" w:default="1" w:styleId="TableNormal">
@@ -15314,12 +17907,19 @@
 </file>
 
 <file path=customXml/item1.xml><?xml version="1.0" encoding="utf-8"?>
-<p:properties xmlns:p="http://schemas.microsoft.com/office/2006/metadata/properties" xmlns:xsi="http://www.w3.org/2001/XMLSchema-instance" xmlns:pc="http://schemas.microsoft.com/office/infopath/2007/PartnerControls">
-  <documentManagement/>
-</p:properties>
+<?mso-contentType ?>
+<FormTemplates xmlns="http://schemas.microsoft.com/sharepoint/v3/contenttype/forms">
+  <Display>DocumentLibraryForm</Display>
+  <Edit>DocumentLibraryForm</Edit>
+  <New>DocumentLibraryForm</New>
+</FormTemplates>
 </file>
 
 <file path=customXml/item2.xml><?xml version="1.0" encoding="utf-8"?>
+<b:Sources xmlns:b="http://schemas.openxmlformats.org/officeDocument/2006/bibliography" xmlns="http://schemas.openxmlformats.org/officeDocument/2006/bibliography" SelectedStyle="\APA.XSL" StyleName="APA"/>
+</file>
+
+<file path=customXml/item3.xml><?xml version="1.0" encoding="utf-8"?>
 <ct:contentTypeSchema xmlns:ct="http://schemas.microsoft.com/office/2006/metadata/contentType" xmlns:ma="http://schemas.microsoft.com/office/2006/metadata/properties/metaAttributes" ct:_="" ma:_="" ma:contentTypeName="Document" ma:contentTypeID="0x010100FB737B7133867847B545A083BFAC78EF" ma:contentTypeVersion="12" ma:contentTypeDescription="Create a new document." ma:contentTypeScope="" ma:versionID="3a7982f5d2373b82eed64d91a9f1640e">
   <xsd:schema xmlns:xsd="http://www.w3.org/2001/XMLSchema" xmlns:xs="http://www.w3.org/2001/XMLSchema" xmlns:p="http://schemas.microsoft.com/office/2006/metadata/properties" xmlns:ns2="77e63d64-5ec0-4c26-bf73-c24d6b7abddf" xmlns:ns3="005d0a5f-c6b0-470f-85f2-ee975d36b3d6" targetNamespace="http://schemas.microsoft.com/office/2006/metadata/properties" ma:root="true" ma:fieldsID="2763948d00d98a9e1e6be9e3b1352800" ns2:_="" ns3:_="">
     <xsd:import namespace="77e63d64-5ec0-4c26-bf73-c24d6b7abddf"/>
@@ -15536,29 +18136,29 @@
 </ct:contentTypeSchema>
 </file>
 
-<file path=customXml/item3.xml><?xml version="1.0" encoding="utf-8"?>
-<b:Sources xmlns:b="http://schemas.openxmlformats.org/officeDocument/2006/bibliography" xmlns="http://schemas.openxmlformats.org/officeDocument/2006/bibliography" SelectedStyle="\APA.XSL" StyleName="APA"/>
-</file>
-
 <file path=customXml/item4.xml><?xml version="1.0" encoding="utf-8"?>
-<?mso-contentType ?>
-<FormTemplates xmlns="http://schemas.microsoft.com/sharepoint/v3/contenttype/forms">
-  <Display>DocumentLibraryForm</Display>
-  <Edit>DocumentLibraryForm</Edit>
-  <New>DocumentLibraryForm</New>
-</FormTemplates>
+<p:properties xmlns:p="http://schemas.microsoft.com/office/2006/metadata/properties" xmlns:xsi="http://www.w3.org/2001/XMLSchema-instance" xmlns:pc="http://schemas.microsoft.com/office/infopath/2007/PartnerControls">
+  <documentManagement/>
+</p:properties>
 </file>
 
 <file path=customXml/itemProps1.xml><?xml version="1.0" encoding="utf-8"?>
-<ds:datastoreItem xmlns:ds="http://schemas.openxmlformats.org/officeDocument/2006/customXml" ds:itemID="{DD86B631-EF59-42E0-AFBB-4D6A49D52145}">
+<ds:datastoreItem xmlns:ds="http://schemas.openxmlformats.org/officeDocument/2006/customXml" ds:itemID="{E711A312-DD48-45F6-BA88-B896F55D6DB7}">
   <ds:schemaRefs>
-    <ds:schemaRef ds:uri="http://schemas.microsoft.com/office/2006/metadata/properties"/>
-    <ds:schemaRef ds:uri="http://schemas.microsoft.com/office/infopath/2007/PartnerControls"/>
+    <ds:schemaRef ds:uri="http://schemas.microsoft.com/sharepoint/v3/contenttype/forms"/>
   </ds:schemaRefs>
 </ds:datastoreItem>
 </file>
 
 <file path=customXml/itemProps2.xml><?xml version="1.0" encoding="utf-8"?>
+<ds:datastoreItem xmlns:ds="http://schemas.openxmlformats.org/officeDocument/2006/customXml" ds:itemID="{308E1B35-0FAF-4A78-BEF3-82256463C83E}">
+  <ds:schemaRefs>
+    <ds:schemaRef ds:uri="http://schemas.openxmlformats.org/officeDocument/2006/bibliography"/>
+  </ds:schemaRefs>
+</ds:datastoreItem>
+</file>
+
+<file path=customXml/itemProps3.xml><?xml version="1.0" encoding="utf-8"?>
 <ds:datastoreItem xmlns:ds="http://schemas.openxmlformats.org/officeDocument/2006/customXml" ds:itemID="{F69EE333-7533-4C7F-8CBF-50CC15A694A4}">
   <ds:schemaRefs>
     <ds:schemaRef ds:uri="http://schemas.microsoft.com/office/2006/metadata/contentType"/>
@@ -15577,18 +18177,11 @@
 </ds:datastoreItem>
 </file>
 
-<file path=customXml/itemProps3.xml><?xml version="1.0" encoding="utf-8"?>
-<ds:datastoreItem xmlns:ds="http://schemas.openxmlformats.org/officeDocument/2006/customXml" ds:itemID="{308E1B35-0FAF-4A78-BEF3-82256463C83E}">
+<file path=customXml/itemProps4.xml><?xml version="1.0" encoding="utf-8"?>
+<ds:datastoreItem xmlns:ds="http://schemas.openxmlformats.org/officeDocument/2006/customXml" ds:itemID="{DD86B631-EF59-42E0-AFBB-4D6A49D52145}">
   <ds:schemaRefs>
-    <ds:schemaRef ds:uri="http://schemas.openxmlformats.org/officeDocument/2006/bibliography"/>
-  </ds:schemaRefs>
-</ds:datastoreItem>
-</file>
-
-<file path=customXml/itemProps4.xml><?xml version="1.0" encoding="utf-8"?>
-<ds:datastoreItem xmlns:ds="http://schemas.openxmlformats.org/officeDocument/2006/customXml" ds:itemID="{E711A312-DD48-45F6-BA88-B896F55D6DB7}">
-  <ds:schemaRefs>
-    <ds:schemaRef ds:uri="http://schemas.microsoft.com/sharepoint/v3/contenttype/forms"/>
+    <ds:schemaRef ds:uri="http://schemas.microsoft.com/office/2006/metadata/properties"/>
+    <ds:schemaRef ds:uri="http://schemas.microsoft.com/office/infopath/2007/PartnerControls"/>
   </ds:schemaRefs>
 </ds:datastoreItem>
 </file>
</xml_diff>

<commit_message>
fix(usp71): update generate_usp71_equipment_text to use a single step and date
</commit_message>
<xml_diff>
--- a/USP71 OOS P1 template 0.docx
+++ b/USP71 OOS P1 template 0.docx
@@ -171,65 +171,14 @@
                 <w:lang w:eastAsia="zh-CN"/>
               </w:rPr>
             </w:pPr>
-            <w:proofErr w:type="gramStart"/>
-            <w:r>
-              <w:rPr>
-                <w:rFonts w:ascii="Times New Roman" w:hAnsi="Times New Roman"/>
-                <w:bCs/>
-                <w:sz w:val="22"/>
-                <w:szCs w:val="22"/>
-              </w:rPr>
-              <w:t xml:space="preserve">{{ </w:t>
-            </w:r>
-            <w:proofErr w:type="spellStart"/>
-            <w:r>
-              <w:rPr>
-                <w:rFonts w:ascii="Times New Roman" w:hAnsi="Times New Roman"/>
-                <w:bCs/>
-                <w:sz w:val="22"/>
-                <w:szCs w:val="22"/>
-              </w:rPr>
-              <w:t>analyst</w:t>
-            </w:r>
-            <w:proofErr w:type="gramEnd"/>
-            <w:r>
-              <w:rPr>
-                <w:rFonts w:ascii="Times New Roman" w:hAnsi="Times New Roman"/>
-                <w:bCs/>
-                <w:sz w:val="22"/>
-                <w:szCs w:val="22"/>
-              </w:rPr>
-              <w:t>_</w:t>
-            </w:r>
-            <w:proofErr w:type="gramStart"/>
-            <w:r>
-              <w:rPr>
-                <w:rFonts w:ascii="Times New Roman" w:hAnsi="Times New Roman"/>
-                <w:bCs/>
-                <w:sz w:val="22"/>
-                <w:szCs w:val="22"/>
-              </w:rPr>
-              <w:t>name</w:t>
-            </w:r>
-            <w:proofErr w:type="spellEnd"/>
-            <w:r>
-              <w:rPr>
-                <w:rFonts w:ascii="Times New Roman" w:hAnsi="Times New Roman"/>
-                <w:bCs/>
-                <w:sz w:val="22"/>
-                <w:szCs w:val="22"/>
-              </w:rPr>
-              <w:t xml:space="preserve"> }</w:t>
-            </w:r>
-            <w:proofErr w:type="gramEnd"/>
-            <w:r>
-              <w:rPr>
-                <w:rFonts w:ascii="Times New Roman" w:hAnsi="Times New Roman"/>
-                <w:bCs/>
-                <w:sz w:val="22"/>
-                <w:szCs w:val="22"/>
-              </w:rPr>
-              <w:t>}</w:t>
+            <w:r>
+              <w:rPr>
+                <w:rFonts w:ascii="Times New Roman" w:hAnsi="Times New Roman"/>
+                <w:bCs/>
+                <w:sz w:val="22"/>
+                <w:szCs w:val="22"/>
+              </w:rPr>
+              <w:t>{{ analyst_name }}</w:t>
             </w:r>
           </w:p>
           <w:p>
@@ -307,7 +256,6 @@
                 <w:szCs w:val="22"/>
               </w:rPr>
             </w:pPr>
-            <w:proofErr w:type="gramStart"/>
             <w:r>
               <w:rPr>
                 <w:rFonts w:ascii="Times New Roman" w:hAnsi="Times New Roman"/>
@@ -317,7 +265,6 @@
               </w:rPr>
               <w:t xml:space="preserve">{{ </w:t>
             </w:r>
-            <w:proofErr w:type="spellStart"/>
             <w:r>
               <w:rPr>
                 <w:rFonts w:ascii="Times New Roman" w:hAnsi="Times New Roman"/>
@@ -327,45 +274,14 @@
               </w:rPr>
               <w:t>process</w:t>
             </w:r>
-            <w:proofErr w:type="gramEnd"/>
-            <w:r>
-              <w:rPr>
-                <w:rFonts w:ascii="Times New Roman" w:hAnsi="Times New Roman"/>
-                <w:bCs/>
-                <w:sz w:val="22"/>
-                <w:szCs w:val="22"/>
-              </w:rPr>
-              <w:t>_</w:t>
-            </w:r>
-            <w:proofErr w:type="gramStart"/>
-            <w:r>
-              <w:rPr>
-                <w:rFonts w:ascii="Times New Roman" w:hAnsi="Times New Roman"/>
-                <w:bCs/>
-                <w:sz w:val="22"/>
-                <w:szCs w:val="22"/>
-              </w:rPr>
-              <w:t>date</w:t>
-            </w:r>
-            <w:proofErr w:type="spellEnd"/>
-            <w:r>
-              <w:rPr>
-                <w:rFonts w:ascii="Times New Roman" w:hAnsi="Times New Roman"/>
-                <w:bCs/>
-                <w:sz w:val="22"/>
-                <w:szCs w:val="22"/>
-              </w:rPr>
-              <w:t xml:space="preserve"> }</w:t>
-            </w:r>
-            <w:proofErr w:type="gramEnd"/>
-            <w:r>
-              <w:rPr>
-                <w:rFonts w:ascii="Times New Roman" w:hAnsi="Times New Roman"/>
-                <w:bCs/>
-                <w:sz w:val="22"/>
-                <w:szCs w:val="22"/>
-              </w:rPr>
-              <w:t>}</w:t>
+            <w:r>
+              <w:rPr>
+                <w:rFonts w:ascii="Times New Roman" w:hAnsi="Times New Roman"/>
+                <w:bCs/>
+                <w:sz w:val="22"/>
+                <w:szCs w:val="22"/>
+              </w:rPr>
+              <w:t>_date }}</w:t>
             </w:r>
           </w:p>
           <w:p>
@@ -423,65 +339,14 @@
               </w:rPr>
             </w:pPr>
             <w:bookmarkStart w:id="0" w:name="OLE_LINK17"/>
-            <w:proofErr w:type="gramStart"/>
-            <w:r>
-              <w:rPr>
-                <w:rFonts w:ascii="Times New Roman" w:hAnsi="Times New Roman"/>
-                <w:bCs/>
-                <w:sz w:val="22"/>
-                <w:szCs w:val="22"/>
-              </w:rPr>
-              <w:t xml:space="preserve">{{ </w:t>
-            </w:r>
-            <w:proofErr w:type="spellStart"/>
-            <w:r>
-              <w:rPr>
-                <w:rFonts w:ascii="Times New Roman" w:hAnsi="Times New Roman"/>
-                <w:bCs/>
-                <w:sz w:val="22"/>
-                <w:szCs w:val="22"/>
-              </w:rPr>
-              <w:t>test</w:t>
-            </w:r>
-            <w:proofErr w:type="gramEnd"/>
-            <w:r>
-              <w:rPr>
-                <w:rFonts w:ascii="Times New Roman" w:hAnsi="Times New Roman"/>
-                <w:bCs/>
-                <w:sz w:val="22"/>
-                <w:szCs w:val="22"/>
-              </w:rPr>
-              <w:t>_</w:t>
-            </w:r>
-            <w:proofErr w:type="gramStart"/>
-            <w:r>
-              <w:rPr>
-                <w:rFonts w:ascii="Times New Roman" w:hAnsi="Times New Roman"/>
-                <w:bCs/>
-                <w:sz w:val="22"/>
-                <w:szCs w:val="22"/>
-              </w:rPr>
-              <w:t>date</w:t>
-            </w:r>
-            <w:proofErr w:type="spellEnd"/>
-            <w:r>
-              <w:rPr>
-                <w:rFonts w:ascii="Times New Roman" w:hAnsi="Times New Roman"/>
-                <w:bCs/>
-                <w:sz w:val="22"/>
-                <w:szCs w:val="22"/>
-              </w:rPr>
-              <w:t xml:space="preserve"> }</w:t>
-            </w:r>
-            <w:proofErr w:type="gramEnd"/>
-            <w:r>
-              <w:rPr>
-                <w:rFonts w:ascii="Times New Roman" w:hAnsi="Times New Roman"/>
-                <w:bCs/>
-                <w:sz w:val="22"/>
-                <w:szCs w:val="22"/>
-              </w:rPr>
-              <w:t>}</w:t>
+            <w:r>
+              <w:rPr>
+                <w:rFonts w:ascii="Times New Roman" w:hAnsi="Times New Roman"/>
+                <w:bCs/>
+                <w:sz w:val="22"/>
+                <w:szCs w:val="22"/>
+              </w:rPr>
+              <w:t>{{ test_date }}</w:t>
             </w:r>
           </w:p>
           <w:bookmarkEnd w:id="0"/>
@@ -542,65 +407,14 @@
                 <w:szCs w:val="22"/>
               </w:rPr>
             </w:pPr>
-            <w:proofErr w:type="gramStart"/>
-            <w:r>
-              <w:rPr>
-                <w:rFonts w:ascii="Times New Roman" w:hAnsi="Times New Roman"/>
-                <w:bCs/>
-                <w:sz w:val="22"/>
-                <w:szCs w:val="22"/>
-              </w:rPr>
-              <w:t xml:space="preserve">{{ </w:t>
-            </w:r>
-            <w:proofErr w:type="spellStart"/>
-            <w:r>
-              <w:rPr>
-                <w:rFonts w:ascii="Times New Roman" w:hAnsi="Times New Roman"/>
-                <w:bCs/>
-                <w:sz w:val="22"/>
-                <w:szCs w:val="22"/>
-              </w:rPr>
-              <w:t>test</w:t>
-            </w:r>
-            <w:proofErr w:type="gramEnd"/>
-            <w:r>
-              <w:rPr>
-                <w:rFonts w:ascii="Times New Roman" w:hAnsi="Times New Roman"/>
-                <w:bCs/>
-                <w:sz w:val="22"/>
-                <w:szCs w:val="22"/>
-              </w:rPr>
-              <w:t>_</w:t>
-            </w:r>
-            <w:proofErr w:type="gramStart"/>
-            <w:r>
-              <w:rPr>
-                <w:rFonts w:ascii="Times New Roman" w:hAnsi="Times New Roman"/>
-                <w:bCs/>
-                <w:sz w:val="22"/>
-                <w:szCs w:val="22"/>
-              </w:rPr>
-              <w:t>date</w:t>
-            </w:r>
-            <w:proofErr w:type="spellEnd"/>
-            <w:r>
-              <w:rPr>
-                <w:rFonts w:ascii="Times New Roman" w:hAnsi="Times New Roman"/>
-                <w:bCs/>
-                <w:sz w:val="22"/>
-                <w:szCs w:val="22"/>
-              </w:rPr>
-              <w:t xml:space="preserve"> }</w:t>
-            </w:r>
-            <w:proofErr w:type="gramEnd"/>
-            <w:r>
-              <w:rPr>
-                <w:rFonts w:ascii="Times New Roman" w:hAnsi="Times New Roman"/>
-                <w:bCs/>
-                <w:sz w:val="22"/>
-                <w:szCs w:val="22"/>
-              </w:rPr>
-              <w:t>}</w:t>
+            <w:r>
+              <w:rPr>
+                <w:rFonts w:ascii="Times New Roman" w:hAnsi="Times New Roman"/>
+                <w:bCs/>
+                <w:sz w:val="22"/>
+                <w:szCs w:val="22"/>
+              </w:rPr>
+              <w:t>{{ test_date }}</w:t>
             </w:r>
           </w:p>
           <w:p>
@@ -713,65 +527,14 @@
               </w:rPr>
             </w:pPr>
             <w:bookmarkStart w:id="1" w:name="OLE_LINK16"/>
-            <w:proofErr w:type="gramStart"/>
-            <w:r>
-              <w:rPr>
-                <w:rFonts w:ascii="Times New Roman" w:hAnsi="Times New Roman"/>
-                <w:bCs/>
-                <w:sz w:val="22"/>
-                <w:szCs w:val="22"/>
-              </w:rPr>
-              <w:t xml:space="preserve">{{ </w:t>
-            </w:r>
-            <w:proofErr w:type="spellStart"/>
-            <w:r>
-              <w:rPr>
-                <w:rFonts w:ascii="Times New Roman" w:hAnsi="Times New Roman"/>
-                <w:bCs/>
-                <w:sz w:val="22"/>
-                <w:szCs w:val="22"/>
-              </w:rPr>
-              <w:t>sample</w:t>
-            </w:r>
-            <w:proofErr w:type="gramEnd"/>
-            <w:r>
-              <w:rPr>
-                <w:rFonts w:ascii="Times New Roman" w:hAnsi="Times New Roman"/>
-                <w:bCs/>
-                <w:sz w:val="22"/>
-                <w:szCs w:val="22"/>
-              </w:rPr>
-              <w:t>_</w:t>
-            </w:r>
-            <w:proofErr w:type="gramStart"/>
-            <w:r>
-              <w:rPr>
-                <w:rFonts w:ascii="Times New Roman" w:hAnsi="Times New Roman"/>
-                <w:bCs/>
-                <w:sz w:val="22"/>
-                <w:szCs w:val="22"/>
-              </w:rPr>
-              <w:t>id</w:t>
-            </w:r>
-            <w:proofErr w:type="spellEnd"/>
-            <w:r>
-              <w:rPr>
-                <w:rFonts w:ascii="Times New Roman" w:hAnsi="Times New Roman"/>
-                <w:bCs/>
-                <w:sz w:val="22"/>
-                <w:szCs w:val="22"/>
-              </w:rPr>
-              <w:t xml:space="preserve"> }</w:t>
-            </w:r>
-            <w:proofErr w:type="gramEnd"/>
-            <w:r>
-              <w:rPr>
-                <w:rFonts w:ascii="Times New Roman" w:hAnsi="Times New Roman"/>
-                <w:bCs/>
-                <w:sz w:val="22"/>
-                <w:szCs w:val="22"/>
-              </w:rPr>
-              <w:t>}</w:t>
+            <w:r>
+              <w:rPr>
+                <w:rFonts w:ascii="Times New Roman" w:hAnsi="Times New Roman"/>
+                <w:bCs/>
+                <w:sz w:val="22"/>
+                <w:szCs w:val="22"/>
+              </w:rPr>
+              <w:t>{{ sample_id }}</w:t>
             </w:r>
           </w:p>
           <w:bookmarkEnd w:id="1"/>
@@ -798,7 +561,6 @@
                 <w:lang w:eastAsia="zh-CN"/>
               </w:rPr>
             </w:pPr>
-            <w:proofErr w:type="gramStart"/>
             <w:r>
               <w:rPr>
                 <w:rFonts w:ascii="Times New Roman" w:eastAsiaTheme="minorEastAsia" w:hAnsi="Times New Roman"/>
@@ -807,40 +569,7 @@
                 <w:szCs w:val="22"/>
                 <w:lang w:eastAsia="zh-CN"/>
               </w:rPr>
-              <w:t xml:space="preserve">{{ </w:t>
-            </w:r>
-            <w:proofErr w:type="spellStart"/>
-            <w:r>
-              <w:rPr>
-                <w:rFonts w:ascii="Times New Roman" w:eastAsiaTheme="minorEastAsia" w:hAnsi="Times New Roman"/>
-                <w:bCs/>
-                <w:sz w:val="22"/>
-                <w:szCs w:val="22"/>
-                <w:lang w:eastAsia="zh-CN"/>
-              </w:rPr>
-              <w:t>client</w:t>
-            </w:r>
-            <w:proofErr w:type="gramEnd"/>
-            <w:r>
-              <w:rPr>
-                <w:rFonts w:ascii="Times New Roman" w:eastAsiaTheme="minorEastAsia" w:hAnsi="Times New Roman"/>
-                <w:bCs/>
-                <w:sz w:val="22"/>
-                <w:szCs w:val="22"/>
-                <w:lang w:eastAsia="zh-CN"/>
-              </w:rPr>
-              <w:t>_name</w:t>
-            </w:r>
-            <w:proofErr w:type="spellEnd"/>
-            <w:r>
-              <w:rPr>
-                <w:rFonts w:ascii="Times New Roman" w:eastAsiaTheme="minorEastAsia" w:hAnsi="Times New Roman"/>
-                <w:bCs/>
-                <w:sz w:val="22"/>
-                <w:szCs w:val="22"/>
-                <w:lang w:eastAsia="zh-CN"/>
-              </w:rPr>
-              <w:t xml:space="preserve"> }}</w:t>
+              <w:t>{{ client_name }}</w:t>
             </w:r>
           </w:p>
         </w:tc>
@@ -911,7 +640,33 @@
                 <w:szCs w:val="22"/>
               </w:rPr>
             </w:pPr>
-            <w:proofErr w:type="gramStart"/>
+            <w:r>
+              <w:rPr>
+                <w:rFonts w:ascii="Times New Roman" w:hAnsi="Times New Roman"/>
+                <w:bCs/>
+                <w:sz w:val="22"/>
+                <w:szCs w:val="22"/>
+              </w:rPr>
+              <w:t>{{ prepper_name }}</w:t>
+            </w:r>
+            <w:r>
+              <w:rPr>
+                <w:rFonts w:ascii="Times New Roman" w:hAnsi="Times New Roman"/>
+                <w:bCs/>
+                <w:sz w:val="22"/>
+                <w:szCs w:val="22"/>
+              </w:rPr>
+              <w:t xml:space="preserve"> </w:t>
+            </w:r>
+            <w:r>
+              <w:rPr>
+                <w:rFonts w:ascii="Times New Roman" w:hAnsi="Times New Roman"/>
+                <w:bCs/>
+                <w:sz w:val="22"/>
+                <w:szCs w:val="22"/>
+              </w:rPr>
+              <w:t>(</w:t>
+            </w:r>
             <w:r>
               <w:rPr>
                 <w:rFonts w:ascii="Times New Roman" w:hAnsi="Times New Roman"/>
@@ -921,7 +676,6 @@
               </w:rPr>
               <w:t xml:space="preserve">{{ </w:t>
             </w:r>
-            <w:proofErr w:type="spellStart"/>
             <w:r>
               <w:rPr>
                 <w:rFonts w:ascii="Times New Roman" w:hAnsi="Times New Roman"/>
@@ -931,45 +685,224 @@
               </w:rPr>
               <w:t>prepper</w:t>
             </w:r>
-            <w:proofErr w:type="gramEnd"/>
-            <w:r>
-              <w:rPr>
-                <w:rFonts w:ascii="Times New Roman" w:hAnsi="Times New Roman"/>
-                <w:bCs/>
-                <w:sz w:val="22"/>
-                <w:szCs w:val="22"/>
-              </w:rPr>
-              <w:t>_</w:t>
-            </w:r>
-            <w:proofErr w:type="gramStart"/>
-            <w:r>
-              <w:rPr>
-                <w:rFonts w:ascii="Times New Roman" w:hAnsi="Times New Roman"/>
-                <w:bCs/>
-                <w:sz w:val="22"/>
-                <w:szCs w:val="22"/>
-              </w:rPr>
-              <w:t>name</w:t>
-            </w:r>
-            <w:proofErr w:type="spellEnd"/>
-            <w:r>
-              <w:rPr>
-                <w:rFonts w:ascii="Times New Roman" w:hAnsi="Times New Roman"/>
-                <w:bCs/>
-                <w:sz w:val="22"/>
-                <w:szCs w:val="22"/>
-              </w:rPr>
-              <w:t xml:space="preserve"> }</w:t>
-            </w:r>
-            <w:proofErr w:type="gramEnd"/>
-            <w:r>
-              <w:rPr>
-                <w:rFonts w:ascii="Times New Roman" w:hAnsi="Times New Roman"/>
-                <w:bCs/>
-                <w:sz w:val="22"/>
-                <w:szCs w:val="22"/>
-              </w:rPr>
-              <w:t>}</w:t>
+            <w:r>
+              <w:rPr>
+                <w:rFonts w:ascii="Times New Roman" w:hAnsi="Times New Roman"/>
+                <w:bCs/>
+                <w:sz w:val="22"/>
+                <w:szCs w:val="22"/>
+              </w:rPr>
+              <w:t>_initial }})</w:t>
+            </w:r>
+          </w:p>
+          <w:p>
+            <w:pPr>
+              <w:outlineLvl w:val="0"/>
+              <w:rPr>
+                <w:rFonts w:ascii="Times New Roman" w:hAnsi="Times New Roman"/>
+                <w:bCs/>
+                <w:sz w:val="22"/>
+                <w:szCs w:val="22"/>
+              </w:rPr>
+            </w:pPr>
+          </w:p>
+          <w:p>
+            <w:pPr>
+              <w:outlineLvl w:val="0"/>
+              <w:rPr>
+                <w:rFonts w:ascii="Times New Roman" w:hAnsi="Times New Roman"/>
+                <w:bCs/>
+                <w:sz w:val="22"/>
+                <w:szCs w:val="22"/>
+              </w:rPr>
+            </w:pPr>
+            <w:r>
+              <w:rPr>
+                <w:rFonts w:ascii="Times New Roman" w:hAnsi="Times New Roman"/>
+                <w:bCs/>
+                <w:sz w:val="22"/>
+                <w:szCs w:val="22"/>
+              </w:rPr>
+              <w:t>Processor:</w:t>
+            </w:r>
+          </w:p>
+          <w:p>
+            <w:pPr>
+              <w:rPr>
+                <w:rFonts w:ascii="Times New Roman" w:hAnsi="Times New Roman"/>
+                <w:bCs/>
+                <w:sz w:val="22"/>
+                <w:szCs w:val="22"/>
+              </w:rPr>
+            </w:pPr>
+            <w:r>
+              <w:rPr>
+                <w:rFonts w:ascii="Times New Roman" w:hAnsi="Times New Roman"/>
+                <w:bCs/>
+                <w:sz w:val="22"/>
+                <w:szCs w:val="22"/>
+              </w:rPr>
+              <w:t>{{ analyst_name }}</w:t>
+            </w:r>
+            <w:r>
+              <w:rPr>
+                <w:rFonts w:ascii="Times New Roman" w:hAnsi="Times New Roman"/>
+                <w:bCs/>
+                <w:sz w:val="22"/>
+                <w:szCs w:val="22"/>
+              </w:rPr>
+              <w:t xml:space="preserve"> (</w:t>
+            </w:r>
+            <w:r>
+              <w:rPr>
+                <w:rFonts w:ascii="Times New Roman" w:hAnsi="Times New Roman"/>
+                <w:bCs/>
+                <w:sz w:val="22"/>
+                <w:szCs w:val="22"/>
+              </w:rPr>
+              <w:t>{{ analyst_initial }})</w:t>
+            </w:r>
+          </w:p>
+          <w:p>
+            <w:pPr>
+              <w:outlineLvl w:val="0"/>
+              <w:rPr>
+                <w:rFonts w:ascii="Times New Roman" w:eastAsiaTheme="minorEastAsia" w:hAnsi="Times New Roman"/>
+                <w:bCs/>
+                <w:sz w:val="22"/>
+                <w:szCs w:val="22"/>
+                <w:lang w:eastAsia="zh-CN"/>
+              </w:rPr>
+            </w:pPr>
+          </w:p>
+          <w:p>
+            <w:pPr>
+              <w:outlineLvl w:val="0"/>
+              <w:rPr>
+                <w:rFonts w:ascii="Times New Roman" w:hAnsi="Times New Roman"/>
+                <w:bCs/>
+                <w:sz w:val="22"/>
+                <w:szCs w:val="22"/>
+              </w:rPr>
+            </w:pPr>
+            <w:r>
+              <w:rPr>
+                <w:rFonts w:ascii="Times New Roman" w:eastAsiaTheme="minorEastAsia" w:hAnsi="Times New Roman" w:hint="eastAsia"/>
+                <w:bCs/>
+                <w:sz w:val="22"/>
+                <w:szCs w:val="22"/>
+                <w:lang w:eastAsia="zh-CN"/>
+              </w:rPr>
+              <w:t xml:space="preserve">Subculture </w:t>
+            </w:r>
+            <w:r>
+              <w:rPr>
+                <w:rFonts w:ascii="Times New Roman" w:hAnsi="Times New Roman"/>
+                <w:bCs/>
+                <w:sz w:val="22"/>
+                <w:szCs w:val="22"/>
+              </w:rPr>
+              <w:t>Processor:</w:t>
+            </w:r>
+          </w:p>
+          <w:p>
+            <w:pPr>
+              <w:rPr>
+                <w:rFonts w:ascii="Times New Roman" w:hAnsi="Times New Roman"/>
+                <w:bCs/>
+                <w:sz w:val="22"/>
+                <w:szCs w:val="22"/>
+              </w:rPr>
+            </w:pPr>
+            <w:r>
+              <w:rPr>
+                <w:rFonts w:ascii="Times New Roman" w:hAnsi="Times New Roman"/>
+                <w:bCs/>
+                <w:sz w:val="22"/>
+                <w:szCs w:val="22"/>
+              </w:rPr>
+              <w:t xml:space="preserve">{{ </w:t>
+            </w:r>
+            <w:bookmarkStart w:id="2" w:name="OLE_LINK19"/>
+            <w:r>
+              <w:rPr>
+                <w:rFonts w:ascii="Times New Roman" w:eastAsiaTheme="minorEastAsia" w:hAnsi="Times New Roman" w:hint="eastAsia"/>
+                <w:bCs/>
+                <w:sz w:val="22"/>
+                <w:szCs w:val="22"/>
+                <w:lang w:eastAsia="zh-CN"/>
+              </w:rPr>
+              <w:t>subculture</w:t>
+            </w:r>
+            <w:bookmarkEnd w:id="2"/>
+            <w:r>
+              <w:rPr>
+                <w:rFonts w:ascii="Times New Roman" w:hAnsi="Times New Roman"/>
+                <w:bCs/>
+                <w:sz w:val="22"/>
+                <w:szCs w:val="22"/>
+              </w:rPr>
+              <w:t>_name }} (</w:t>
+            </w:r>
+            <w:r>
+              <w:rPr>
+                <w:rFonts w:ascii="Times New Roman" w:hAnsi="Times New Roman"/>
+                <w:bCs/>
+                <w:sz w:val="22"/>
+                <w:szCs w:val="22"/>
+              </w:rPr>
+              <w:t>{{</w:t>
+            </w:r>
+            <w:r>
+              <w:rPr>
+                <w:rFonts w:ascii="Times New Roman" w:eastAsiaTheme="minorEastAsia" w:hAnsi="Times New Roman" w:hint="eastAsia"/>
+                <w:bCs/>
+                <w:sz w:val="22"/>
+                <w:szCs w:val="22"/>
+                <w:lang w:eastAsia="zh-CN"/>
+              </w:rPr>
+              <w:t>subculture</w:t>
+            </w:r>
+            <w:r>
+              <w:rPr>
+                <w:rFonts w:ascii="Times New Roman" w:hAnsi="Times New Roman"/>
+                <w:bCs/>
+                <w:sz w:val="22"/>
+                <w:szCs w:val="22"/>
+              </w:rPr>
+              <w:t xml:space="preserve"> _initial }})</w:t>
+            </w:r>
+          </w:p>
+          <w:p>
+            <w:pPr>
+              <w:outlineLvl w:val="0"/>
+              <w:rPr>
+                <w:rFonts w:ascii="Times New Roman" w:eastAsiaTheme="minorEastAsia" w:hAnsi="Times New Roman"/>
+                <w:bCs/>
+                <w:sz w:val="22"/>
+                <w:szCs w:val="22"/>
+                <w:lang w:eastAsia="zh-CN"/>
+              </w:rPr>
+            </w:pPr>
+          </w:p>
+          <w:p>
+            <w:pPr>
+              <w:outlineLvl w:val="0"/>
+              <w:rPr>
+                <w:rFonts w:ascii="Times New Roman" w:hAnsi="Times New Roman"/>
+                <w:bCs/>
+                <w:sz w:val="22"/>
+                <w:szCs w:val="22"/>
+              </w:rPr>
+            </w:pPr>
+            <w:r>
+              <w:rPr>
+                <w:rFonts w:ascii="Times New Roman" w:hAnsi="Times New Roman"/>
+                <w:bCs/>
+                <w:sz w:val="22"/>
+                <w:szCs w:val="22"/>
+              </w:rPr>
+              <w:t>Reading</w:t>
             </w:r>
             <w:r>
               <w:rPr>
@@ -982,6 +915,84 @@
             </w:r>
             <w:r>
               <w:rPr>
+                <w:rFonts w:ascii="Times New Roman" w:eastAsiaTheme="minorEastAsia" w:hAnsi="Times New Roman" w:hint="eastAsia"/>
+                <w:bCs/>
+                <w:sz w:val="22"/>
+                <w:szCs w:val="22"/>
+                <w:lang w:eastAsia="zh-CN"/>
+              </w:rPr>
+              <w:t>Analyst</w:t>
+            </w:r>
+            <w:r>
+              <w:rPr>
+                <w:rFonts w:ascii="Times New Roman" w:hAnsi="Times New Roman"/>
+                <w:bCs/>
+                <w:sz w:val="22"/>
+                <w:szCs w:val="22"/>
+              </w:rPr>
+              <w:t>:</w:t>
+            </w:r>
+          </w:p>
+          <w:p>
+            <w:pPr>
+              <w:outlineLvl w:val="0"/>
+              <w:rPr>
+                <w:rFonts w:ascii="Times New Roman" w:eastAsiaTheme="minorEastAsia" w:hAnsi="Times New Roman"/>
+                <w:bCs/>
+                <w:sz w:val="22"/>
+                <w:szCs w:val="22"/>
+                <w:lang w:eastAsia="zh-CN"/>
+              </w:rPr>
+            </w:pPr>
+            <w:bookmarkStart w:id="3" w:name="OLE_LINK18"/>
+            <w:r>
+              <w:rPr>
+                <w:rFonts w:ascii="Times New Roman" w:hAnsi="Times New Roman"/>
+                <w:bCs/>
+                <w:sz w:val="22"/>
+                <w:szCs w:val="22"/>
+              </w:rPr>
+              <w:t xml:space="preserve">{{ </w:t>
+            </w:r>
+            <w:r>
+              <w:rPr>
+                <w:rFonts w:ascii="Times New Roman" w:hAnsi="Times New Roman"/>
+                <w:bCs/>
+                <w:sz w:val="22"/>
+                <w:szCs w:val="22"/>
+              </w:rPr>
+              <w:t>reading</w:t>
+            </w:r>
+            <w:r>
+              <w:rPr>
+                <w:rFonts w:ascii="Times New Roman" w:hAnsi="Times New Roman"/>
+                <w:bCs/>
+                <w:sz w:val="22"/>
+                <w:szCs w:val="22"/>
+              </w:rPr>
+              <w:t>_name</w:t>
+            </w:r>
+            <w:r>
+              <w:rPr>
+                <w:rFonts w:ascii="Times New Roman" w:hAnsi="Times New Roman"/>
+                <w:bCs/>
+                <w:sz w:val="22"/>
+                <w:szCs w:val="22"/>
+              </w:rPr>
+              <w:t xml:space="preserve"> }}</w:t>
+            </w:r>
+            <w:r>
+              <w:rPr>
+                <w:rFonts w:ascii="Times New Roman" w:hAnsi="Times New Roman"/>
+                <w:bCs/>
+                <w:sz w:val="22"/>
+                <w:szCs w:val="22"/>
+              </w:rPr>
+              <w:t xml:space="preserve"> </w:t>
+            </w:r>
+            <w:bookmarkEnd w:id="3"/>
+            <w:r>
+              <w:rPr>
                 <w:rFonts w:ascii="Times New Roman" w:hAnsi="Times New Roman"/>
                 <w:bCs/>
                 <w:sz w:val="22"/>
@@ -989,7 +1000,6 @@
               </w:rPr>
               <w:t>(</w:t>
             </w:r>
-            <w:proofErr w:type="gramStart"/>
             <w:r>
               <w:rPr>
                 <w:rFonts w:ascii="Times New Roman" w:hAnsi="Times New Roman"/>
@@ -999,473 +1009,6 @@
               </w:rPr>
               <w:t xml:space="preserve">{{ </w:t>
             </w:r>
-            <w:proofErr w:type="spellStart"/>
-            <w:r>
-              <w:rPr>
-                <w:rFonts w:ascii="Times New Roman" w:hAnsi="Times New Roman"/>
-                <w:bCs/>
-                <w:sz w:val="22"/>
-                <w:szCs w:val="22"/>
-              </w:rPr>
-              <w:t>prepper</w:t>
-            </w:r>
-            <w:proofErr w:type="gramEnd"/>
-            <w:r>
-              <w:rPr>
-                <w:rFonts w:ascii="Times New Roman" w:hAnsi="Times New Roman"/>
-                <w:bCs/>
-                <w:sz w:val="22"/>
-                <w:szCs w:val="22"/>
-              </w:rPr>
-              <w:t>_</w:t>
-            </w:r>
-            <w:proofErr w:type="gramStart"/>
-            <w:r>
-              <w:rPr>
-                <w:rFonts w:ascii="Times New Roman" w:hAnsi="Times New Roman"/>
-                <w:bCs/>
-                <w:sz w:val="22"/>
-                <w:szCs w:val="22"/>
-              </w:rPr>
-              <w:t>initial</w:t>
-            </w:r>
-            <w:proofErr w:type="spellEnd"/>
-            <w:r>
-              <w:rPr>
-                <w:rFonts w:ascii="Times New Roman" w:hAnsi="Times New Roman"/>
-                <w:bCs/>
-                <w:sz w:val="22"/>
-                <w:szCs w:val="22"/>
-              </w:rPr>
-              <w:t xml:space="preserve"> }</w:t>
-            </w:r>
-            <w:proofErr w:type="gramEnd"/>
-            <w:r>
-              <w:rPr>
-                <w:rFonts w:ascii="Times New Roman" w:hAnsi="Times New Roman"/>
-                <w:bCs/>
-                <w:sz w:val="22"/>
-                <w:szCs w:val="22"/>
-              </w:rPr>
-              <w:t>})</w:t>
-            </w:r>
-          </w:p>
-          <w:p>
-            <w:pPr>
-              <w:outlineLvl w:val="0"/>
-              <w:rPr>
-                <w:rFonts w:ascii="Times New Roman" w:hAnsi="Times New Roman"/>
-                <w:bCs/>
-                <w:sz w:val="22"/>
-                <w:szCs w:val="22"/>
-              </w:rPr>
-            </w:pPr>
-          </w:p>
-          <w:p>
-            <w:pPr>
-              <w:outlineLvl w:val="0"/>
-              <w:rPr>
-                <w:rFonts w:ascii="Times New Roman" w:hAnsi="Times New Roman"/>
-                <w:bCs/>
-                <w:sz w:val="22"/>
-                <w:szCs w:val="22"/>
-              </w:rPr>
-            </w:pPr>
-            <w:r>
-              <w:rPr>
-                <w:rFonts w:ascii="Times New Roman" w:hAnsi="Times New Roman"/>
-                <w:bCs/>
-                <w:sz w:val="22"/>
-                <w:szCs w:val="22"/>
-              </w:rPr>
-              <w:t>Processor:</w:t>
-            </w:r>
-          </w:p>
-          <w:p>
-            <w:pPr>
-              <w:rPr>
-                <w:rFonts w:ascii="Times New Roman" w:hAnsi="Times New Roman"/>
-                <w:bCs/>
-                <w:sz w:val="22"/>
-                <w:szCs w:val="22"/>
-              </w:rPr>
-            </w:pPr>
-            <w:proofErr w:type="gramStart"/>
-            <w:r>
-              <w:rPr>
-                <w:rFonts w:ascii="Times New Roman" w:hAnsi="Times New Roman"/>
-                <w:bCs/>
-                <w:sz w:val="22"/>
-                <w:szCs w:val="22"/>
-              </w:rPr>
-              <w:t xml:space="preserve">{{ </w:t>
-            </w:r>
-            <w:proofErr w:type="spellStart"/>
-            <w:r>
-              <w:rPr>
-                <w:rFonts w:ascii="Times New Roman" w:hAnsi="Times New Roman"/>
-                <w:bCs/>
-                <w:sz w:val="22"/>
-                <w:szCs w:val="22"/>
-              </w:rPr>
-              <w:t>analyst</w:t>
-            </w:r>
-            <w:proofErr w:type="gramEnd"/>
-            <w:r>
-              <w:rPr>
-                <w:rFonts w:ascii="Times New Roman" w:hAnsi="Times New Roman"/>
-                <w:bCs/>
-                <w:sz w:val="22"/>
-                <w:szCs w:val="22"/>
-              </w:rPr>
-              <w:t>_</w:t>
-            </w:r>
-            <w:proofErr w:type="gramStart"/>
-            <w:r>
-              <w:rPr>
-                <w:rFonts w:ascii="Times New Roman" w:hAnsi="Times New Roman"/>
-                <w:bCs/>
-                <w:sz w:val="22"/>
-                <w:szCs w:val="22"/>
-              </w:rPr>
-              <w:t>name</w:t>
-            </w:r>
-            <w:proofErr w:type="spellEnd"/>
-            <w:r>
-              <w:rPr>
-                <w:rFonts w:ascii="Times New Roman" w:hAnsi="Times New Roman"/>
-                <w:bCs/>
-                <w:sz w:val="22"/>
-                <w:szCs w:val="22"/>
-              </w:rPr>
-              <w:t xml:space="preserve"> }</w:t>
-            </w:r>
-            <w:proofErr w:type="gramEnd"/>
-            <w:r>
-              <w:rPr>
-                <w:rFonts w:ascii="Times New Roman" w:hAnsi="Times New Roman"/>
-                <w:bCs/>
-                <w:sz w:val="22"/>
-                <w:szCs w:val="22"/>
-              </w:rPr>
-              <w:t>}</w:t>
-            </w:r>
-            <w:r>
-              <w:rPr>
-                <w:rFonts w:ascii="Times New Roman" w:hAnsi="Times New Roman"/>
-                <w:bCs/>
-                <w:sz w:val="22"/>
-                <w:szCs w:val="22"/>
-              </w:rPr>
-              <w:t xml:space="preserve"> (</w:t>
-            </w:r>
-            <w:proofErr w:type="gramStart"/>
-            <w:r>
-              <w:rPr>
-                <w:rFonts w:ascii="Times New Roman" w:hAnsi="Times New Roman"/>
-                <w:bCs/>
-                <w:sz w:val="22"/>
-                <w:szCs w:val="22"/>
-              </w:rPr>
-              <w:t xml:space="preserve">{{ </w:t>
-            </w:r>
-            <w:proofErr w:type="spellStart"/>
-            <w:r>
-              <w:rPr>
-                <w:rFonts w:ascii="Times New Roman" w:hAnsi="Times New Roman"/>
-                <w:bCs/>
-                <w:sz w:val="22"/>
-                <w:szCs w:val="22"/>
-              </w:rPr>
-              <w:t>analyst</w:t>
-            </w:r>
-            <w:proofErr w:type="gramEnd"/>
-            <w:r>
-              <w:rPr>
-                <w:rFonts w:ascii="Times New Roman" w:hAnsi="Times New Roman"/>
-                <w:bCs/>
-                <w:sz w:val="22"/>
-                <w:szCs w:val="22"/>
-              </w:rPr>
-              <w:t>_</w:t>
-            </w:r>
-            <w:proofErr w:type="gramStart"/>
-            <w:r>
-              <w:rPr>
-                <w:rFonts w:ascii="Times New Roman" w:hAnsi="Times New Roman"/>
-                <w:bCs/>
-                <w:sz w:val="22"/>
-                <w:szCs w:val="22"/>
-              </w:rPr>
-              <w:t>initial</w:t>
-            </w:r>
-            <w:proofErr w:type="spellEnd"/>
-            <w:r>
-              <w:rPr>
-                <w:rFonts w:ascii="Times New Roman" w:hAnsi="Times New Roman"/>
-                <w:bCs/>
-                <w:sz w:val="22"/>
-                <w:szCs w:val="22"/>
-              </w:rPr>
-              <w:t xml:space="preserve"> }</w:t>
-            </w:r>
-            <w:proofErr w:type="gramEnd"/>
-            <w:r>
-              <w:rPr>
-                <w:rFonts w:ascii="Times New Roman" w:hAnsi="Times New Roman"/>
-                <w:bCs/>
-                <w:sz w:val="22"/>
-                <w:szCs w:val="22"/>
-              </w:rPr>
-              <w:t>})</w:t>
-            </w:r>
-          </w:p>
-          <w:p>
-            <w:pPr>
-              <w:outlineLvl w:val="0"/>
-              <w:rPr>
-                <w:rFonts w:ascii="Times New Roman" w:eastAsiaTheme="minorEastAsia" w:hAnsi="Times New Roman"/>
-                <w:bCs/>
-                <w:sz w:val="22"/>
-                <w:szCs w:val="22"/>
-                <w:lang w:eastAsia="zh-CN"/>
-              </w:rPr>
-            </w:pPr>
-          </w:p>
-          <w:p>
-            <w:pPr>
-              <w:outlineLvl w:val="0"/>
-              <w:rPr>
-                <w:rFonts w:ascii="Times New Roman" w:hAnsi="Times New Roman"/>
-                <w:bCs/>
-                <w:sz w:val="22"/>
-                <w:szCs w:val="22"/>
-              </w:rPr>
-            </w:pPr>
-            <w:r>
-              <w:rPr>
-                <w:rFonts w:ascii="Times New Roman" w:eastAsiaTheme="minorEastAsia" w:hAnsi="Times New Roman" w:hint="eastAsia"/>
-                <w:bCs/>
-                <w:sz w:val="22"/>
-                <w:szCs w:val="22"/>
-                <w:lang w:eastAsia="zh-CN"/>
-              </w:rPr>
-              <w:t xml:space="preserve">Subculture </w:t>
-            </w:r>
-            <w:r>
-              <w:rPr>
-                <w:rFonts w:ascii="Times New Roman" w:hAnsi="Times New Roman"/>
-                <w:bCs/>
-                <w:sz w:val="22"/>
-                <w:szCs w:val="22"/>
-              </w:rPr>
-              <w:t>Processor:</w:t>
-            </w:r>
-          </w:p>
-          <w:p>
-            <w:pPr>
-              <w:rPr>
-                <w:rFonts w:ascii="Times New Roman" w:hAnsi="Times New Roman"/>
-                <w:bCs/>
-                <w:sz w:val="22"/>
-                <w:szCs w:val="22"/>
-              </w:rPr>
-            </w:pPr>
-            <w:proofErr w:type="gramStart"/>
-            <w:r>
-              <w:rPr>
-                <w:rFonts w:ascii="Times New Roman" w:hAnsi="Times New Roman"/>
-                <w:bCs/>
-                <w:sz w:val="22"/>
-                <w:szCs w:val="22"/>
-              </w:rPr>
-              <w:t xml:space="preserve">{{ </w:t>
-            </w:r>
-            <w:bookmarkStart w:id="2" w:name="OLE_LINK19"/>
-            <w:proofErr w:type="spellStart"/>
-            <w:r>
-              <w:rPr>
-                <w:rFonts w:ascii="Times New Roman" w:eastAsiaTheme="minorEastAsia" w:hAnsi="Times New Roman" w:hint="eastAsia"/>
-                <w:bCs/>
-                <w:sz w:val="22"/>
-                <w:szCs w:val="22"/>
-                <w:lang w:eastAsia="zh-CN"/>
-              </w:rPr>
-              <w:t>subculture</w:t>
-            </w:r>
-            <w:bookmarkEnd w:id="2"/>
-            <w:proofErr w:type="gramEnd"/>
-            <w:r>
-              <w:rPr>
-                <w:rFonts w:ascii="Times New Roman" w:hAnsi="Times New Roman"/>
-                <w:bCs/>
-                <w:sz w:val="22"/>
-                <w:szCs w:val="22"/>
-              </w:rPr>
-              <w:t>_</w:t>
-            </w:r>
-            <w:proofErr w:type="gramStart"/>
-            <w:r>
-              <w:rPr>
-                <w:rFonts w:ascii="Times New Roman" w:hAnsi="Times New Roman"/>
-                <w:bCs/>
-                <w:sz w:val="22"/>
-                <w:szCs w:val="22"/>
-              </w:rPr>
-              <w:t>name</w:t>
-            </w:r>
-            <w:proofErr w:type="spellEnd"/>
-            <w:r>
-              <w:rPr>
-                <w:rFonts w:ascii="Times New Roman" w:hAnsi="Times New Roman"/>
-                <w:bCs/>
-                <w:sz w:val="22"/>
-                <w:szCs w:val="22"/>
-              </w:rPr>
-              <w:t xml:space="preserve"> }</w:t>
-            </w:r>
-            <w:proofErr w:type="gramEnd"/>
-            <w:r>
-              <w:rPr>
-                <w:rFonts w:ascii="Times New Roman" w:hAnsi="Times New Roman"/>
-                <w:bCs/>
-                <w:sz w:val="22"/>
-                <w:szCs w:val="22"/>
-              </w:rPr>
-              <w:t>} (</w:t>
-            </w:r>
-            <w:r>
-              <w:rPr>
-                <w:rFonts w:ascii="Times New Roman" w:hAnsi="Times New Roman"/>
-                <w:bCs/>
-                <w:sz w:val="22"/>
-                <w:szCs w:val="22"/>
-              </w:rPr>
-              <w:t>{{</w:t>
-            </w:r>
-            <w:r>
-              <w:rPr>
-                <w:rFonts w:ascii="Times New Roman" w:eastAsiaTheme="minorEastAsia" w:hAnsi="Times New Roman" w:hint="eastAsia"/>
-                <w:bCs/>
-                <w:sz w:val="22"/>
-                <w:szCs w:val="22"/>
-                <w:lang w:eastAsia="zh-CN"/>
-              </w:rPr>
-              <w:t>subculture</w:t>
-            </w:r>
-            <w:r>
-              <w:rPr>
-                <w:rFonts w:ascii="Times New Roman" w:hAnsi="Times New Roman"/>
-                <w:bCs/>
-                <w:sz w:val="22"/>
-                <w:szCs w:val="22"/>
-              </w:rPr>
-              <w:t xml:space="preserve"> _</w:t>
-            </w:r>
-            <w:proofErr w:type="gramStart"/>
-            <w:r>
-              <w:rPr>
-                <w:rFonts w:ascii="Times New Roman" w:hAnsi="Times New Roman"/>
-                <w:bCs/>
-                <w:sz w:val="22"/>
-                <w:szCs w:val="22"/>
-              </w:rPr>
-              <w:t>initial }</w:t>
-            </w:r>
-            <w:proofErr w:type="gramEnd"/>
-            <w:r>
-              <w:rPr>
-                <w:rFonts w:ascii="Times New Roman" w:hAnsi="Times New Roman"/>
-                <w:bCs/>
-                <w:sz w:val="22"/>
-                <w:szCs w:val="22"/>
-              </w:rPr>
-              <w:t>})</w:t>
-            </w:r>
-          </w:p>
-          <w:p>
-            <w:pPr>
-              <w:outlineLvl w:val="0"/>
-              <w:rPr>
-                <w:rFonts w:ascii="Times New Roman" w:eastAsiaTheme="minorEastAsia" w:hAnsi="Times New Roman"/>
-                <w:bCs/>
-                <w:sz w:val="22"/>
-                <w:szCs w:val="22"/>
-                <w:lang w:eastAsia="zh-CN"/>
-              </w:rPr>
-            </w:pPr>
-          </w:p>
-          <w:p>
-            <w:pPr>
-              <w:outlineLvl w:val="0"/>
-              <w:rPr>
-                <w:rFonts w:ascii="Times New Roman" w:hAnsi="Times New Roman"/>
-                <w:bCs/>
-                <w:sz w:val="22"/>
-                <w:szCs w:val="22"/>
-              </w:rPr>
-            </w:pPr>
-            <w:r>
-              <w:rPr>
-                <w:rFonts w:ascii="Times New Roman" w:hAnsi="Times New Roman"/>
-                <w:bCs/>
-                <w:sz w:val="22"/>
-                <w:szCs w:val="22"/>
-              </w:rPr>
-              <w:t>Reading</w:t>
-            </w:r>
-            <w:r>
-              <w:rPr>
-                <w:rFonts w:ascii="Times New Roman" w:hAnsi="Times New Roman"/>
-                <w:bCs/>
-                <w:sz w:val="22"/>
-                <w:szCs w:val="22"/>
-              </w:rPr>
-              <w:t xml:space="preserve"> </w:t>
-            </w:r>
-            <w:r>
-              <w:rPr>
-                <w:rFonts w:ascii="Times New Roman" w:eastAsiaTheme="minorEastAsia" w:hAnsi="Times New Roman" w:hint="eastAsia"/>
-                <w:bCs/>
-                <w:sz w:val="22"/>
-                <w:szCs w:val="22"/>
-                <w:lang w:eastAsia="zh-CN"/>
-              </w:rPr>
-              <w:t>Analyst</w:t>
-            </w:r>
-            <w:r>
-              <w:rPr>
-                <w:rFonts w:ascii="Times New Roman" w:hAnsi="Times New Roman"/>
-                <w:bCs/>
-                <w:sz w:val="22"/>
-                <w:szCs w:val="22"/>
-              </w:rPr>
-              <w:t>:</w:t>
-            </w:r>
-          </w:p>
-          <w:p>
-            <w:pPr>
-              <w:outlineLvl w:val="0"/>
-              <w:rPr>
-                <w:rFonts w:ascii="Times New Roman" w:eastAsiaTheme="minorEastAsia" w:hAnsi="Times New Roman"/>
-                <w:bCs/>
-                <w:sz w:val="22"/>
-                <w:szCs w:val="22"/>
-                <w:lang w:eastAsia="zh-CN"/>
-              </w:rPr>
-            </w:pPr>
-            <w:bookmarkStart w:id="3" w:name="OLE_LINK18"/>
-            <w:proofErr w:type="gramStart"/>
-            <w:r>
-              <w:rPr>
-                <w:rFonts w:ascii="Times New Roman" w:hAnsi="Times New Roman"/>
-                <w:bCs/>
-                <w:sz w:val="22"/>
-                <w:szCs w:val="22"/>
-              </w:rPr>
-              <w:t xml:space="preserve">{{ </w:t>
-            </w:r>
-            <w:proofErr w:type="spellStart"/>
             <w:r>
               <w:rPr>
                 <w:rFonts w:ascii="Times New Roman" w:hAnsi="Times New Roman"/>
@@ -1475,86 +1018,6 @@
               </w:rPr>
               <w:t>reading</w:t>
             </w:r>
-            <w:proofErr w:type="gramEnd"/>
-            <w:r>
-              <w:rPr>
-                <w:rFonts w:ascii="Times New Roman" w:hAnsi="Times New Roman"/>
-                <w:bCs/>
-                <w:sz w:val="22"/>
-                <w:szCs w:val="22"/>
-              </w:rPr>
-              <w:t>_</w:t>
-            </w:r>
-            <w:proofErr w:type="gramStart"/>
-            <w:r>
-              <w:rPr>
-                <w:rFonts w:ascii="Times New Roman" w:hAnsi="Times New Roman"/>
-                <w:bCs/>
-                <w:sz w:val="22"/>
-                <w:szCs w:val="22"/>
-              </w:rPr>
-              <w:t>name</w:t>
-            </w:r>
-            <w:proofErr w:type="spellEnd"/>
-            <w:r>
-              <w:rPr>
-                <w:rFonts w:ascii="Times New Roman" w:hAnsi="Times New Roman"/>
-                <w:bCs/>
-                <w:sz w:val="22"/>
-                <w:szCs w:val="22"/>
-              </w:rPr>
-              <w:t xml:space="preserve"> }</w:t>
-            </w:r>
-            <w:proofErr w:type="gramEnd"/>
-            <w:r>
-              <w:rPr>
-                <w:rFonts w:ascii="Times New Roman" w:hAnsi="Times New Roman"/>
-                <w:bCs/>
-                <w:sz w:val="22"/>
-                <w:szCs w:val="22"/>
-              </w:rPr>
-              <w:t>}</w:t>
-            </w:r>
-            <w:r>
-              <w:rPr>
-                <w:rFonts w:ascii="Times New Roman" w:hAnsi="Times New Roman"/>
-                <w:bCs/>
-                <w:sz w:val="22"/>
-                <w:szCs w:val="22"/>
-              </w:rPr>
-              <w:t xml:space="preserve"> </w:t>
-            </w:r>
-            <w:bookmarkEnd w:id="3"/>
-            <w:r>
-              <w:rPr>
-                <w:rFonts w:ascii="Times New Roman" w:hAnsi="Times New Roman"/>
-                <w:bCs/>
-                <w:sz w:val="22"/>
-                <w:szCs w:val="22"/>
-              </w:rPr>
-              <w:t>(</w:t>
-            </w:r>
-            <w:proofErr w:type="gramStart"/>
-            <w:r>
-              <w:rPr>
-                <w:rFonts w:ascii="Times New Roman" w:hAnsi="Times New Roman"/>
-                <w:bCs/>
-                <w:sz w:val="22"/>
-                <w:szCs w:val="22"/>
-              </w:rPr>
-              <w:t xml:space="preserve">{{ </w:t>
-            </w:r>
-            <w:proofErr w:type="spellStart"/>
-            <w:r>
-              <w:rPr>
-                <w:rFonts w:ascii="Times New Roman" w:hAnsi="Times New Roman"/>
-                <w:bCs/>
-                <w:sz w:val="22"/>
-                <w:szCs w:val="22"/>
-              </w:rPr>
-              <w:t>reading</w:t>
-            </w:r>
-            <w:proofErr w:type="gramEnd"/>
             <w:r>
               <w:rPr>
                 <w:rFonts w:ascii="Times New Roman" w:hAnsi="Times New Roman"/>
@@ -1564,7 +1027,6 @@
               </w:rPr>
               <w:t>_initial</w:t>
             </w:r>
-            <w:proofErr w:type="spellEnd"/>
             <w:r>
               <w:rPr>
                 <w:rFonts w:ascii="Times New Roman" w:hAnsi="Times New Roman"/>
@@ -1618,45 +1080,14 @@
                 <w:szCs w:val="22"/>
               </w:rPr>
             </w:pPr>
-            <w:proofErr w:type="gramStart"/>
-            <w:r>
-              <w:rPr>
-                <w:rFonts w:ascii="Times New Roman" w:hAnsi="Times New Roman"/>
-                <w:bCs/>
-                <w:sz w:val="22"/>
-                <w:szCs w:val="22"/>
-              </w:rPr>
-              <w:t xml:space="preserve">{{ </w:t>
-            </w:r>
-            <w:proofErr w:type="spellStart"/>
-            <w:r>
-              <w:rPr>
-                <w:rFonts w:ascii="Times New Roman" w:hAnsi="Times New Roman"/>
-                <w:bCs/>
-                <w:sz w:val="22"/>
-                <w:szCs w:val="22"/>
-              </w:rPr>
-              <w:t>sample</w:t>
-            </w:r>
-            <w:proofErr w:type="gramEnd"/>
-            <w:r>
-              <w:rPr>
-                <w:rFonts w:ascii="Times New Roman" w:hAnsi="Times New Roman"/>
-                <w:bCs/>
-                <w:sz w:val="22"/>
-                <w:szCs w:val="22"/>
-              </w:rPr>
-              <w:t>_name</w:t>
-            </w:r>
-            <w:proofErr w:type="spellEnd"/>
-            <w:r>
-              <w:rPr>
-                <w:rFonts w:ascii="Times New Roman" w:hAnsi="Times New Roman"/>
-                <w:bCs/>
-                <w:sz w:val="22"/>
-                <w:szCs w:val="22"/>
-              </w:rPr>
-              <w:t xml:space="preserve"> }}</w:t>
+            <w:r>
+              <w:rPr>
+                <w:rFonts w:ascii="Times New Roman" w:hAnsi="Times New Roman"/>
+                <w:bCs/>
+                <w:sz w:val="22"/>
+                <w:szCs w:val="22"/>
+              </w:rPr>
+              <w:t>{{ sample_name }}</w:t>
             </w:r>
           </w:p>
         </w:tc>
@@ -1704,45 +1135,14 @@
                 <w:szCs w:val="22"/>
               </w:rPr>
             </w:pPr>
-            <w:proofErr w:type="gramStart"/>
-            <w:r>
-              <w:rPr>
-                <w:rFonts w:ascii="Times New Roman" w:hAnsi="Times New Roman"/>
-                <w:bCs/>
-                <w:sz w:val="22"/>
-                <w:szCs w:val="22"/>
-              </w:rPr>
-              <w:t xml:space="preserve">{{ </w:t>
-            </w:r>
-            <w:proofErr w:type="spellStart"/>
-            <w:r>
-              <w:rPr>
-                <w:rFonts w:ascii="Times New Roman" w:hAnsi="Times New Roman"/>
-                <w:bCs/>
-                <w:sz w:val="22"/>
-                <w:szCs w:val="22"/>
-              </w:rPr>
-              <w:t>lot</w:t>
-            </w:r>
-            <w:proofErr w:type="gramEnd"/>
-            <w:r>
-              <w:rPr>
-                <w:rFonts w:ascii="Times New Roman" w:hAnsi="Times New Roman"/>
-                <w:bCs/>
-                <w:sz w:val="22"/>
-                <w:szCs w:val="22"/>
-              </w:rPr>
-              <w:t>_number</w:t>
-            </w:r>
-            <w:proofErr w:type="spellEnd"/>
-            <w:r>
-              <w:rPr>
-                <w:rFonts w:ascii="Times New Roman" w:hAnsi="Times New Roman"/>
-                <w:bCs/>
-                <w:sz w:val="22"/>
-                <w:szCs w:val="22"/>
-              </w:rPr>
-              <w:t xml:space="preserve"> }}</w:t>
+            <w:r>
+              <w:rPr>
+                <w:rFonts w:ascii="Times New Roman" w:hAnsi="Times New Roman"/>
+                <w:bCs/>
+                <w:sz w:val="22"/>
+                <w:szCs w:val="22"/>
+              </w:rPr>
+              <w:t>{{ lot_number }}</w:t>
             </w:r>
           </w:p>
         </w:tc>
@@ -1829,45 +1229,14 @@
                 <w:szCs w:val="22"/>
               </w:rPr>
             </w:pPr>
-            <w:proofErr w:type="gramStart"/>
-            <w:r>
-              <w:rPr>
-                <w:rFonts w:ascii="Times New Roman" w:hAnsi="Times New Roman"/>
-                <w:bCs/>
-                <w:sz w:val="22"/>
-                <w:szCs w:val="22"/>
-              </w:rPr>
-              <w:t xml:space="preserve">{{ </w:t>
-            </w:r>
-            <w:proofErr w:type="spellStart"/>
-            <w:r>
-              <w:rPr>
-                <w:rFonts w:ascii="Times New Roman" w:hAnsi="Times New Roman"/>
-                <w:bCs/>
-                <w:sz w:val="22"/>
-                <w:szCs w:val="22"/>
-              </w:rPr>
-              <w:t>dosage</w:t>
-            </w:r>
-            <w:proofErr w:type="gramEnd"/>
-            <w:r>
-              <w:rPr>
-                <w:rFonts w:ascii="Times New Roman" w:hAnsi="Times New Roman"/>
-                <w:bCs/>
-                <w:sz w:val="22"/>
-                <w:szCs w:val="22"/>
-              </w:rPr>
-              <w:t>_form</w:t>
-            </w:r>
-            <w:proofErr w:type="spellEnd"/>
-            <w:r>
-              <w:rPr>
-                <w:rFonts w:ascii="Times New Roman" w:hAnsi="Times New Roman"/>
-                <w:bCs/>
-                <w:sz w:val="22"/>
-                <w:szCs w:val="22"/>
-              </w:rPr>
-              <w:t>}}</w:t>
+            <w:r>
+              <w:rPr>
+                <w:rFonts w:ascii="Times New Roman" w:hAnsi="Times New Roman"/>
+                <w:bCs/>
+                <w:sz w:val="22"/>
+                <w:szCs w:val="22"/>
+              </w:rPr>
+              <w:t>{{ dosage_form}}</w:t>
             </w:r>
           </w:p>
         </w:tc>
@@ -1975,55 +1344,7 @@
               </w:rPr>
             </w:pPr>
             <w:r>
-              <w:t xml:space="preserve">On </w:t>
-            </w:r>
-            <w:proofErr w:type="gramStart"/>
-            <w:r>
-              <w:t xml:space="preserve">{{ </w:t>
-            </w:r>
-            <w:proofErr w:type="spellStart"/>
-            <w:r>
-              <w:t>test</w:t>
-            </w:r>
-            <w:proofErr w:type="gramEnd"/>
-            <w:r>
-              <w:t>_</w:t>
-            </w:r>
-            <w:proofErr w:type="gramStart"/>
-            <w:r>
-              <w:t>date</w:t>
-            </w:r>
-            <w:proofErr w:type="spellEnd"/>
-            <w:r>
-              <w:t xml:space="preserve"> }</w:t>
-            </w:r>
-            <w:proofErr w:type="gramEnd"/>
-            <w:r>
-              <w:t xml:space="preserve">}, sample </w:t>
-            </w:r>
-            <w:proofErr w:type="gramStart"/>
-            <w:r>
-              <w:t xml:space="preserve">{{ </w:t>
-            </w:r>
-            <w:proofErr w:type="spellStart"/>
-            <w:r>
-              <w:t>sample</w:t>
-            </w:r>
-            <w:proofErr w:type="gramEnd"/>
-            <w:r>
-              <w:t>_</w:t>
-            </w:r>
-            <w:proofErr w:type="gramStart"/>
-            <w:r>
-              <w:t>id</w:t>
-            </w:r>
-            <w:proofErr w:type="spellEnd"/>
-            <w:r>
-              <w:t xml:space="preserve"> }</w:t>
-            </w:r>
-            <w:proofErr w:type="gramEnd"/>
-            <w:r>
-              <w:t xml:space="preserve">} was found positive for viable microorganisms after USP &lt;71&gt; sterility testing. </w:t>
+              <w:t xml:space="preserve">On {{ test_date }}, sample {{ sample_id }} was found positive for viable microorganisms after USP &lt;71&gt; sterility testing. </w:t>
             </w:r>
           </w:p>
           <w:p>
@@ -2333,19 +1654,8 @@
                 <w:sz w:val="22"/>
                 <w:szCs w:val="22"/>
               </w:rPr>
-              <w:t xml:space="preserve">SOP / Test </w:t>
-            </w:r>
-            <w:proofErr w:type="gramStart"/>
-            <w:r>
-              <w:rPr>
-                <w:rFonts w:ascii="Times New Roman" w:hAnsi="Times New Roman"/>
-                <w:bCs/>
-                <w:sz w:val="22"/>
-                <w:szCs w:val="22"/>
-              </w:rPr>
-              <w:t>Method #:</w:t>
-            </w:r>
-            <w:proofErr w:type="gramEnd"/>
+              <w:t>SOP / Test Method #:</w:t>
+            </w:r>
           </w:p>
           <w:p>
             <w:pPr>
@@ -2661,65 +1971,14 @@
                 <w:szCs w:val="22"/>
               </w:rPr>
             </w:pPr>
-            <w:proofErr w:type="gramStart"/>
-            <w:r>
-              <w:rPr>
-                <w:rFonts w:ascii="Times New Roman" w:hAnsi="Times New Roman"/>
-                <w:bCs/>
-                <w:sz w:val="22"/>
-                <w:szCs w:val="22"/>
-              </w:rPr>
-              <w:t xml:space="preserve">{{ </w:t>
-            </w:r>
-            <w:proofErr w:type="spellStart"/>
-            <w:r>
-              <w:rPr>
-                <w:rFonts w:ascii="Times New Roman" w:hAnsi="Times New Roman"/>
-                <w:bCs/>
-                <w:sz w:val="22"/>
-                <w:szCs w:val="22"/>
-              </w:rPr>
-              <w:t>test</w:t>
-            </w:r>
-            <w:proofErr w:type="gramEnd"/>
-            <w:r>
-              <w:rPr>
-                <w:rFonts w:ascii="Times New Roman" w:hAnsi="Times New Roman"/>
-                <w:bCs/>
-                <w:sz w:val="22"/>
-                <w:szCs w:val="22"/>
-              </w:rPr>
-              <w:t>_</w:t>
-            </w:r>
-            <w:proofErr w:type="gramStart"/>
-            <w:r>
-              <w:rPr>
-                <w:rFonts w:ascii="Times New Roman" w:hAnsi="Times New Roman"/>
-                <w:bCs/>
-                <w:sz w:val="22"/>
-                <w:szCs w:val="22"/>
-              </w:rPr>
-              <w:t>date</w:t>
-            </w:r>
-            <w:proofErr w:type="spellEnd"/>
-            <w:r>
-              <w:rPr>
-                <w:rFonts w:ascii="Times New Roman" w:hAnsi="Times New Roman"/>
-                <w:bCs/>
-                <w:sz w:val="22"/>
-                <w:szCs w:val="22"/>
-              </w:rPr>
-              <w:t xml:space="preserve"> }</w:t>
-            </w:r>
-            <w:proofErr w:type="gramEnd"/>
-            <w:r>
-              <w:rPr>
-                <w:rFonts w:ascii="Times New Roman" w:hAnsi="Times New Roman"/>
-                <w:bCs/>
-                <w:sz w:val="22"/>
-                <w:szCs w:val="22"/>
-              </w:rPr>
-              <w:t>}</w:t>
+            <w:r>
+              <w:rPr>
+                <w:rFonts w:ascii="Times New Roman" w:hAnsi="Times New Roman"/>
+                <w:bCs/>
+                <w:sz w:val="22"/>
+                <w:szCs w:val="22"/>
+              </w:rPr>
+              <w:t>{{ test_date }}</w:t>
             </w:r>
           </w:p>
           <w:p>
@@ -3308,7 +2567,33 @@
               <w:t xml:space="preserve">analysts </w:t>
             </w:r>
             <w:bookmarkStart w:id="6" w:name="OLE_LINK25"/>
-            <w:proofErr w:type="gramStart"/>
+            <w:r>
+              <w:rPr>
+                <w:rFonts w:ascii="Times New Roman" w:hAnsi="Times New Roman"/>
+                <w:bCs/>
+                <w:sz w:val="22"/>
+                <w:szCs w:val="22"/>
+              </w:rPr>
+              <w:t xml:space="preserve">{{ prepper_name }}, </w:t>
+            </w:r>
+            <w:r>
+              <w:rPr>
+                <w:rFonts w:ascii="Times New Roman" w:hAnsi="Times New Roman"/>
+                <w:bCs/>
+                <w:sz w:val="22"/>
+                <w:szCs w:val="22"/>
+              </w:rPr>
+              <w:t>{{ analyst_name }}</w:t>
+            </w:r>
+            <w:r>
+              <w:rPr>
+                <w:rFonts w:ascii="Times New Roman" w:hAnsi="Times New Roman"/>
+                <w:bCs/>
+                <w:sz w:val="22"/>
+                <w:szCs w:val="22"/>
+              </w:rPr>
+              <w:t xml:space="preserve">, </w:t>
+            </w:r>
             <w:r>
               <w:rPr>
                 <w:rFonts w:ascii="Times New Roman" w:hAnsi="Times New Roman"/>
@@ -3318,57 +2603,45 @@
               </w:rPr>
               <w:t xml:space="preserve">{{ </w:t>
             </w:r>
-            <w:proofErr w:type="spellStart"/>
-            <w:r>
-              <w:rPr>
-                <w:rFonts w:ascii="Times New Roman" w:hAnsi="Times New Roman"/>
-                <w:bCs/>
-                <w:sz w:val="22"/>
-                <w:szCs w:val="22"/>
-              </w:rPr>
-              <w:t>prepper</w:t>
-            </w:r>
-            <w:proofErr w:type="gramEnd"/>
-            <w:r>
-              <w:rPr>
-                <w:rFonts w:ascii="Times New Roman" w:hAnsi="Times New Roman"/>
-                <w:bCs/>
-                <w:sz w:val="22"/>
-                <w:szCs w:val="22"/>
-              </w:rPr>
-              <w:t>_</w:t>
-            </w:r>
-            <w:proofErr w:type="gramStart"/>
-            <w:r>
-              <w:rPr>
-                <w:rFonts w:ascii="Times New Roman" w:hAnsi="Times New Roman"/>
-                <w:bCs/>
-                <w:sz w:val="22"/>
-                <w:szCs w:val="22"/>
-              </w:rPr>
-              <w:t>name</w:t>
-            </w:r>
-            <w:proofErr w:type="spellEnd"/>
-            <w:r>
-              <w:rPr>
-                <w:rFonts w:ascii="Times New Roman" w:hAnsi="Times New Roman"/>
-                <w:bCs/>
-                <w:sz w:val="22"/>
-                <w:szCs w:val="22"/>
-              </w:rPr>
-              <w:t xml:space="preserve"> }</w:t>
-            </w:r>
-            <w:proofErr w:type="gramEnd"/>
-            <w:r>
-              <w:rPr>
-                <w:rFonts w:ascii="Times New Roman" w:hAnsi="Times New Roman"/>
-                <w:bCs/>
-                <w:sz w:val="22"/>
-                <w:szCs w:val="22"/>
-              </w:rPr>
-              <w:t xml:space="preserve">}, </w:t>
-            </w:r>
-            <w:proofErr w:type="gramStart"/>
+            <w:r>
+              <w:rPr>
+                <w:rFonts w:ascii="Times New Roman" w:eastAsiaTheme="minorEastAsia" w:hAnsi="Times New Roman" w:hint="eastAsia"/>
+                <w:bCs/>
+                <w:sz w:val="22"/>
+                <w:szCs w:val="22"/>
+                <w:lang w:eastAsia="zh-CN"/>
+              </w:rPr>
+              <w:t>subculture</w:t>
+            </w:r>
+            <w:r>
+              <w:rPr>
+                <w:rFonts w:ascii="Times New Roman" w:hAnsi="Times New Roman"/>
+                <w:bCs/>
+                <w:sz w:val="22"/>
+                <w:szCs w:val="22"/>
+              </w:rPr>
+              <w:t>_name }}</w:t>
+            </w:r>
+            <w:r>
+              <w:rPr>
+                <w:rFonts w:ascii="Times New Roman" w:eastAsiaTheme="minorEastAsia" w:hAnsi="Times New Roman" w:hint="eastAsia"/>
+                <w:bCs/>
+                <w:sz w:val="22"/>
+                <w:szCs w:val="22"/>
+                <w:lang w:eastAsia="zh-CN"/>
+              </w:rPr>
+              <w:t xml:space="preserve">, </w:t>
+            </w:r>
+            <w:r>
+              <w:rPr>
+                <w:rFonts w:ascii="Times New Roman" w:eastAsiaTheme="minorEastAsia" w:hAnsi="Times New Roman" w:hint="eastAsia"/>
+                <w:bCs/>
+                <w:sz w:val="22"/>
+                <w:szCs w:val="22"/>
+                <w:lang w:eastAsia="zh-CN"/>
+              </w:rPr>
+              <w:t xml:space="preserve">and </w:t>
+            </w:r>
             <w:r>
               <w:rPr>
                 <w:rFonts w:ascii="Times New Roman" w:hAnsi="Times New Roman"/>
@@ -3378,157 +2651,6 @@
               </w:rPr>
               <w:t xml:space="preserve">{{ </w:t>
             </w:r>
-            <w:proofErr w:type="spellStart"/>
-            <w:r>
-              <w:rPr>
-                <w:rFonts w:ascii="Times New Roman" w:hAnsi="Times New Roman"/>
-                <w:bCs/>
-                <w:sz w:val="22"/>
-                <w:szCs w:val="22"/>
-              </w:rPr>
-              <w:t>analyst</w:t>
-            </w:r>
-            <w:proofErr w:type="gramEnd"/>
-            <w:r>
-              <w:rPr>
-                <w:rFonts w:ascii="Times New Roman" w:hAnsi="Times New Roman"/>
-                <w:bCs/>
-                <w:sz w:val="22"/>
-                <w:szCs w:val="22"/>
-              </w:rPr>
-              <w:t>_</w:t>
-            </w:r>
-            <w:proofErr w:type="gramStart"/>
-            <w:r>
-              <w:rPr>
-                <w:rFonts w:ascii="Times New Roman" w:hAnsi="Times New Roman"/>
-                <w:bCs/>
-                <w:sz w:val="22"/>
-                <w:szCs w:val="22"/>
-              </w:rPr>
-              <w:t>name</w:t>
-            </w:r>
-            <w:proofErr w:type="spellEnd"/>
-            <w:r>
-              <w:rPr>
-                <w:rFonts w:ascii="Times New Roman" w:hAnsi="Times New Roman"/>
-                <w:bCs/>
-                <w:sz w:val="22"/>
-                <w:szCs w:val="22"/>
-              </w:rPr>
-              <w:t xml:space="preserve"> }</w:t>
-            </w:r>
-            <w:proofErr w:type="gramEnd"/>
-            <w:r>
-              <w:rPr>
-                <w:rFonts w:ascii="Times New Roman" w:hAnsi="Times New Roman"/>
-                <w:bCs/>
-                <w:sz w:val="22"/>
-                <w:szCs w:val="22"/>
-              </w:rPr>
-              <w:t>}</w:t>
-            </w:r>
-            <w:r>
-              <w:rPr>
-                <w:rFonts w:ascii="Times New Roman" w:hAnsi="Times New Roman"/>
-                <w:bCs/>
-                <w:sz w:val="22"/>
-                <w:szCs w:val="22"/>
-              </w:rPr>
-              <w:t xml:space="preserve">, </w:t>
-            </w:r>
-            <w:proofErr w:type="gramStart"/>
-            <w:r>
-              <w:rPr>
-                <w:rFonts w:ascii="Times New Roman" w:hAnsi="Times New Roman"/>
-                <w:bCs/>
-                <w:sz w:val="22"/>
-                <w:szCs w:val="22"/>
-              </w:rPr>
-              <w:t xml:space="preserve">{{ </w:t>
-            </w:r>
-            <w:proofErr w:type="spellStart"/>
-            <w:r>
-              <w:rPr>
-                <w:rFonts w:ascii="Times New Roman" w:eastAsiaTheme="minorEastAsia" w:hAnsi="Times New Roman" w:hint="eastAsia"/>
-                <w:bCs/>
-                <w:sz w:val="22"/>
-                <w:szCs w:val="22"/>
-                <w:lang w:eastAsia="zh-CN"/>
-              </w:rPr>
-              <w:t>subculture</w:t>
-            </w:r>
-            <w:proofErr w:type="gramEnd"/>
-            <w:r>
-              <w:rPr>
-                <w:rFonts w:ascii="Times New Roman" w:hAnsi="Times New Roman"/>
-                <w:bCs/>
-                <w:sz w:val="22"/>
-                <w:szCs w:val="22"/>
-              </w:rPr>
-              <w:t>_</w:t>
-            </w:r>
-            <w:proofErr w:type="gramStart"/>
-            <w:r>
-              <w:rPr>
-                <w:rFonts w:ascii="Times New Roman" w:hAnsi="Times New Roman"/>
-                <w:bCs/>
-                <w:sz w:val="22"/>
-                <w:szCs w:val="22"/>
-              </w:rPr>
-              <w:t>name</w:t>
-            </w:r>
-            <w:proofErr w:type="spellEnd"/>
-            <w:r>
-              <w:rPr>
-                <w:rFonts w:ascii="Times New Roman" w:hAnsi="Times New Roman"/>
-                <w:bCs/>
-                <w:sz w:val="22"/>
-                <w:szCs w:val="22"/>
-              </w:rPr>
-              <w:t xml:space="preserve"> }</w:t>
-            </w:r>
-            <w:proofErr w:type="gramEnd"/>
-            <w:r>
-              <w:rPr>
-                <w:rFonts w:ascii="Times New Roman" w:hAnsi="Times New Roman"/>
-                <w:bCs/>
-                <w:sz w:val="22"/>
-                <w:szCs w:val="22"/>
-              </w:rPr>
-              <w:t>}</w:t>
-            </w:r>
-            <w:r>
-              <w:rPr>
-                <w:rFonts w:ascii="Times New Roman" w:eastAsiaTheme="minorEastAsia" w:hAnsi="Times New Roman" w:hint="eastAsia"/>
-                <w:bCs/>
-                <w:sz w:val="22"/>
-                <w:szCs w:val="22"/>
-                <w:lang w:eastAsia="zh-CN"/>
-              </w:rPr>
-              <w:t xml:space="preserve">, </w:t>
-            </w:r>
-            <w:r>
-              <w:rPr>
-                <w:rFonts w:ascii="Times New Roman" w:eastAsiaTheme="minorEastAsia" w:hAnsi="Times New Roman" w:hint="eastAsia"/>
-                <w:bCs/>
-                <w:sz w:val="22"/>
-                <w:szCs w:val="22"/>
-                <w:lang w:eastAsia="zh-CN"/>
-              </w:rPr>
-              <w:t xml:space="preserve">and </w:t>
-            </w:r>
-            <w:proofErr w:type="gramStart"/>
-            <w:r>
-              <w:rPr>
-                <w:rFonts w:ascii="Times New Roman" w:hAnsi="Times New Roman"/>
-                <w:bCs/>
-                <w:sz w:val="22"/>
-                <w:szCs w:val="22"/>
-              </w:rPr>
-              <w:t xml:space="preserve">{{ </w:t>
-            </w:r>
-            <w:proofErr w:type="spellStart"/>
             <w:r>
               <w:rPr>
                 <w:rFonts w:ascii="Times New Roman" w:hAnsi="Times New Roman"/>
@@ -3538,45 +2660,14 @@
               </w:rPr>
               <w:t>reading</w:t>
             </w:r>
-            <w:proofErr w:type="gramEnd"/>
-            <w:r>
-              <w:rPr>
-                <w:rFonts w:ascii="Times New Roman" w:hAnsi="Times New Roman"/>
-                <w:bCs/>
-                <w:sz w:val="22"/>
-                <w:szCs w:val="22"/>
-              </w:rPr>
-              <w:t>_</w:t>
-            </w:r>
-            <w:proofErr w:type="gramStart"/>
-            <w:r>
-              <w:rPr>
-                <w:rFonts w:ascii="Times New Roman" w:hAnsi="Times New Roman"/>
-                <w:bCs/>
-                <w:sz w:val="22"/>
-                <w:szCs w:val="22"/>
-              </w:rPr>
-              <w:t>name</w:t>
-            </w:r>
-            <w:proofErr w:type="spellEnd"/>
-            <w:r>
-              <w:rPr>
-                <w:rFonts w:ascii="Times New Roman" w:hAnsi="Times New Roman"/>
-                <w:bCs/>
-                <w:sz w:val="22"/>
-                <w:szCs w:val="22"/>
-              </w:rPr>
-              <w:t xml:space="preserve"> }</w:t>
-            </w:r>
-            <w:proofErr w:type="gramEnd"/>
-            <w:r>
-              <w:rPr>
-                <w:rFonts w:ascii="Times New Roman" w:hAnsi="Times New Roman"/>
-                <w:bCs/>
-                <w:sz w:val="22"/>
-                <w:szCs w:val="22"/>
-              </w:rPr>
-              <w:t xml:space="preserve">} </w:t>
+            <w:r>
+              <w:rPr>
+                <w:rFonts w:ascii="Times New Roman" w:hAnsi="Times New Roman"/>
+                <w:bCs/>
+                <w:sz w:val="22"/>
+                <w:szCs w:val="22"/>
+              </w:rPr>
+              <w:t xml:space="preserve">_name }} </w:t>
             </w:r>
             <w:bookmarkEnd w:id="5"/>
             <w:bookmarkEnd w:id="6"/>
@@ -3871,65 +2962,14 @@
               </w:rPr>
               <w:t xml:space="preserve">sample ID: </w:t>
             </w:r>
-            <w:proofErr w:type="gramStart"/>
-            <w:r>
-              <w:rPr>
-                <w:rFonts w:ascii="Times New Roman" w:hAnsi="Times New Roman"/>
-                <w:bCs/>
-                <w:sz w:val="22"/>
-                <w:szCs w:val="22"/>
-              </w:rPr>
-              <w:t xml:space="preserve">{{ </w:t>
-            </w:r>
-            <w:proofErr w:type="spellStart"/>
-            <w:r>
-              <w:rPr>
-                <w:rFonts w:ascii="Times New Roman" w:hAnsi="Times New Roman"/>
-                <w:bCs/>
-                <w:sz w:val="22"/>
-                <w:szCs w:val="22"/>
-              </w:rPr>
-              <w:t>sample</w:t>
-            </w:r>
-            <w:proofErr w:type="gramEnd"/>
-            <w:r>
-              <w:rPr>
-                <w:rFonts w:ascii="Times New Roman" w:hAnsi="Times New Roman"/>
-                <w:bCs/>
-                <w:sz w:val="22"/>
-                <w:szCs w:val="22"/>
-              </w:rPr>
-              <w:t>_</w:t>
-            </w:r>
-            <w:proofErr w:type="gramStart"/>
-            <w:r>
-              <w:rPr>
-                <w:rFonts w:ascii="Times New Roman" w:hAnsi="Times New Roman"/>
-                <w:bCs/>
-                <w:sz w:val="22"/>
-                <w:szCs w:val="22"/>
-              </w:rPr>
-              <w:t>id</w:t>
-            </w:r>
-            <w:proofErr w:type="spellEnd"/>
-            <w:r>
-              <w:rPr>
-                <w:rFonts w:ascii="Times New Roman" w:hAnsi="Times New Roman"/>
-                <w:bCs/>
-                <w:sz w:val="22"/>
-                <w:szCs w:val="22"/>
-              </w:rPr>
-              <w:t xml:space="preserve"> }</w:t>
-            </w:r>
-            <w:proofErr w:type="gramEnd"/>
-            <w:r>
-              <w:rPr>
-                <w:rFonts w:ascii="Times New Roman" w:hAnsi="Times New Roman"/>
-                <w:bCs/>
-                <w:sz w:val="22"/>
-                <w:szCs w:val="22"/>
-              </w:rPr>
-              <w:t>}</w:t>
+            <w:r>
+              <w:rPr>
+                <w:rFonts w:ascii="Times New Roman" w:hAnsi="Times New Roman"/>
+                <w:bCs/>
+                <w:sz w:val="22"/>
+                <w:szCs w:val="22"/>
+              </w:rPr>
+              <w:t>{{ sample_id }}</w:t>
             </w:r>
             <w:r>
               <w:rPr>
@@ -4527,25 +3567,7 @@
                 <w:sz w:val="22"/>
                 <w:szCs w:val="22"/>
               </w:rPr>
-              <w:t xml:space="preserve">Are the Test Result Records Attached &amp; Calculations </w:t>
-            </w:r>
-            <w:proofErr w:type="gramStart"/>
-            <w:r>
-              <w:rPr>
-                <w:rFonts w:ascii="Times New Roman" w:hAnsi="Times New Roman"/>
-                <w:sz w:val="22"/>
-                <w:szCs w:val="22"/>
-              </w:rPr>
-              <w:t>Verified</w:t>
-            </w:r>
-            <w:proofErr w:type="gramEnd"/>
-            <w:r>
-              <w:rPr>
-                <w:rFonts w:ascii="Times New Roman" w:hAnsi="Times New Roman"/>
-                <w:sz w:val="22"/>
-                <w:szCs w:val="22"/>
-              </w:rPr>
-              <w:t xml:space="preserve"> and Correct?</w:t>
+              <w:t>Are the Test Result Records Attached &amp; Calculations Verified and Correct?</w:t>
             </w:r>
           </w:p>
         </w:tc>
@@ -4777,25 +3799,7 @@
                 <w:sz w:val="22"/>
                 <w:szCs w:val="22"/>
               </w:rPr>
-              <w:t xml:space="preserve">Information is available in </w:t>
-            </w:r>
-            <w:proofErr w:type="spellStart"/>
-            <w:r>
-              <w:rPr>
-                <w:rFonts w:ascii="Times New Roman" w:hAnsi="Times New Roman"/>
-                <w:sz w:val="22"/>
-                <w:szCs w:val="22"/>
-              </w:rPr>
-              <w:t>EagleTrax</w:t>
-            </w:r>
-            <w:proofErr w:type="spellEnd"/>
-            <w:r>
-              <w:rPr>
-                <w:rFonts w:ascii="Times New Roman" w:hAnsi="Times New Roman"/>
-                <w:sz w:val="22"/>
-                <w:szCs w:val="22"/>
-              </w:rPr>
-              <w:t xml:space="preserve"> under</w:t>
+              <w:t>Information is available in EagleTrax under</w:t>
             </w:r>
             <w:r>
               <w:rPr>
@@ -4805,45 +3809,14 @@
               </w:rPr>
               <w:t xml:space="preserve"> </w:t>
             </w:r>
-            <w:proofErr w:type="gramStart"/>
-            <w:r>
-              <w:rPr>
-                <w:rFonts w:ascii="Times New Roman" w:hAnsi="Times New Roman"/>
-                <w:bCs/>
-                <w:sz w:val="22"/>
-                <w:szCs w:val="22"/>
-              </w:rPr>
-              <w:t xml:space="preserve">{{ </w:t>
-            </w:r>
-            <w:proofErr w:type="spellStart"/>
-            <w:r>
-              <w:rPr>
-                <w:rFonts w:ascii="Times New Roman" w:hAnsi="Times New Roman"/>
-                <w:bCs/>
-                <w:sz w:val="22"/>
-                <w:szCs w:val="22"/>
-              </w:rPr>
-              <w:t>sample</w:t>
-            </w:r>
-            <w:proofErr w:type="gramEnd"/>
-            <w:r>
-              <w:rPr>
-                <w:rFonts w:ascii="Times New Roman" w:hAnsi="Times New Roman"/>
-                <w:bCs/>
-                <w:sz w:val="22"/>
-                <w:szCs w:val="22"/>
-              </w:rPr>
-              <w:t>_id</w:t>
-            </w:r>
-            <w:proofErr w:type="spellEnd"/>
-            <w:r>
-              <w:rPr>
-                <w:rFonts w:ascii="Times New Roman" w:hAnsi="Times New Roman"/>
-                <w:bCs/>
-                <w:sz w:val="22"/>
-                <w:szCs w:val="22"/>
-              </w:rPr>
-              <w:t xml:space="preserve"> }}</w:t>
+            <w:r>
+              <w:rPr>
+                <w:rFonts w:ascii="Times New Roman" w:hAnsi="Times New Roman"/>
+                <w:bCs/>
+                <w:sz w:val="22"/>
+                <w:szCs w:val="22"/>
+              </w:rPr>
+              <w:t>{{ sample_id }}</w:t>
             </w:r>
           </w:p>
         </w:tc>
@@ -5416,25 +4389,7 @@
                 <w:sz w:val="22"/>
                 <w:szCs w:val="22"/>
               </w:rPr>
-              <w:t xml:space="preserve">Does the processing method/ </w:t>
-            </w:r>
-            <w:proofErr w:type="gramStart"/>
-            <w:r>
-              <w:rPr>
-                <w:rFonts w:ascii="Times New Roman" w:hAnsi="Times New Roman"/>
-                <w:sz w:val="22"/>
-                <w:szCs w:val="22"/>
-              </w:rPr>
-              <w:t>method set</w:t>
-            </w:r>
-            <w:proofErr w:type="gramEnd"/>
-            <w:r>
-              <w:rPr>
-                <w:rFonts w:ascii="Times New Roman" w:hAnsi="Times New Roman"/>
-                <w:sz w:val="22"/>
-                <w:szCs w:val="22"/>
-              </w:rPr>
-              <w:t xml:space="preserve"> conform to the required specification?</w:t>
+              <w:t>Does the processing method/ method set conform to the required specification?</w:t>
             </w:r>
           </w:p>
         </w:tc>
@@ -5938,25 +4893,7 @@
                 <w:sz w:val="22"/>
                 <w:szCs w:val="22"/>
               </w:rPr>
-              <w:t xml:space="preserve">Information is available in </w:t>
-            </w:r>
-            <w:proofErr w:type="spellStart"/>
-            <w:r>
-              <w:rPr>
-                <w:rFonts w:ascii="Times New Roman" w:hAnsi="Times New Roman"/>
-                <w:sz w:val="22"/>
-                <w:szCs w:val="22"/>
-              </w:rPr>
-              <w:t>EagleTrax</w:t>
-            </w:r>
-            <w:proofErr w:type="spellEnd"/>
-            <w:r>
-              <w:rPr>
-                <w:rFonts w:ascii="Times New Roman" w:hAnsi="Times New Roman"/>
-                <w:sz w:val="22"/>
-                <w:szCs w:val="22"/>
-              </w:rPr>
-              <w:t xml:space="preserve"> Sample</w:t>
+              <w:t>Information is available in EagleTrax Sample</w:t>
             </w:r>
             <w:bookmarkEnd w:id="7"/>
             <w:r>
@@ -5967,45 +4904,14 @@
               </w:rPr>
               <w:t xml:space="preserve"> Location History under </w:t>
             </w:r>
-            <w:proofErr w:type="gramStart"/>
-            <w:r>
-              <w:rPr>
-                <w:rFonts w:ascii="Times New Roman" w:hAnsi="Times New Roman"/>
-                <w:bCs/>
-                <w:sz w:val="22"/>
-                <w:szCs w:val="22"/>
-              </w:rPr>
-              <w:t xml:space="preserve">{{ </w:t>
-            </w:r>
-            <w:proofErr w:type="spellStart"/>
-            <w:r>
-              <w:rPr>
-                <w:rFonts w:ascii="Times New Roman" w:hAnsi="Times New Roman"/>
-                <w:bCs/>
-                <w:sz w:val="22"/>
-                <w:szCs w:val="22"/>
-              </w:rPr>
-              <w:t>sample</w:t>
-            </w:r>
-            <w:proofErr w:type="gramEnd"/>
-            <w:r>
-              <w:rPr>
-                <w:rFonts w:ascii="Times New Roman" w:hAnsi="Times New Roman"/>
-                <w:bCs/>
-                <w:sz w:val="22"/>
-                <w:szCs w:val="22"/>
-              </w:rPr>
-              <w:t>_id</w:t>
-            </w:r>
-            <w:proofErr w:type="spellEnd"/>
-            <w:r>
-              <w:rPr>
-                <w:rFonts w:ascii="Times New Roman" w:hAnsi="Times New Roman"/>
-                <w:bCs/>
-                <w:sz w:val="22"/>
-                <w:szCs w:val="22"/>
-              </w:rPr>
-              <w:t xml:space="preserve"> }}</w:t>
+            <w:r>
+              <w:rPr>
+                <w:rFonts w:ascii="Times New Roman" w:hAnsi="Times New Roman"/>
+                <w:bCs/>
+                <w:sz w:val="22"/>
+                <w:szCs w:val="22"/>
+              </w:rPr>
+              <w:t>{{ sample_id }}</w:t>
             </w:r>
           </w:p>
         </w:tc>
@@ -7165,25 +6071,7 @@
                 <w:sz w:val="22"/>
                 <w:szCs w:val="22"/>
               </w:rPr>
-              <w:t xml:space="preserve">Information is available in </w:t>
-            </w:r>
-            <w:proofErr w:type="spellStart"/>
-            <w:r>
-              <w:rPr>
-                <w:rFonts w:ascii="Times New Roman" w:hAnsi="Times New Roman"/>
-                <w:sz w:val="22"/>
-                <w:szCs w:val="22"/>
-              </w:rPr>
-              <w:t>EagleTrax</w:t>
-            </w:r>
-            <w:proofErr w:type="spellEnd"/>
-            <w:r>
-              <w:rPr>
-                <w:rFonts w:ascii="Times New Roman" w:hAnsi="Times New Roman"/>
-                <w:sz w:val="22"/>
-                <w:szCs w:val="22"/>
-              </w:rPr>
-              <w:t xml:space="preserve"> Sample</w:t>
+              <w:t>Information is available in EagleTrax Sample</w:t>
             </w:r>
             <w:r>
               <w:rPr>
@@ -7388,25 +6276,7 @@
                 <w:sz w:val="22"/>
                 <w:szCs w:val="22"/>
               </w:rPr>
-              <w:t xml:space="preserve">Information is available in </w:t>
-            </w:r>
-            <w:proofErr w:type="spellStart"/>
-            <w:r>
-              <w:rPr>
-                <w:rFonts w:ascii="Times New Roman" w:hAnsi="Times New Roman"/>
-                <w:sz w:val="22"/>
-                <w:szCs w:val="22"/>
-              </w:rPr>
-              <w:t>EagleTrax</w:t>
-            </w:r>
-            <w:proofErr w:type="spellEnd"/>
-            <w:r>
-              <w:rPr>
-                <w:rFonts w:ascii="Times New Roman" w:hAnsi="Times New Roman"/>
-                <w:sz w:val="22"/>
-                <w:szCs w:val="22"/>
-              </w:rPr>
-              <w:t xml:space="preserve"> Sample</w:t>
+              <w:t>Information is available in EagleTrax Sample</w:t>
             </w:r>
             <w:r>
               <w:rPr>
@@ -8769,29 +7639,7 @@
                 <w:szCs w:val="22"/>
                 <w:lang w:eastAsia="zh-CN"/>
               </w:rPr>
-              <w:t>{{</w:t>
-            </w:r>
-            <w:proofErr w:type="spellStart"/>
-            <w:r>
-              <w:rPr>
-                <w:rFonts w:ascii="Times New Roman" w:eastAsiaTheme="minorEastAsia" w:hAnsi="Times New Roman"/>
-                <w:bCs/>
-                <w:sz w:val="22"/>
-                <w:szCs w:val="22"/>
-                <w:lang w:eastAsia="zh-CN"/>
-              </w:rPr>
-              <w:t>bsc_id</w:t>
-            </w:r>
-            <w:proofErr w:type="spellEnd"/>
-            <w:r>
-              <w:rPr>
-                <w:rFonts w:ascii="Times New Roman" w:eastAsiaTheme="minorEastAsia" w:hAnsi="Times New Roman"/>
-                <w:bCs/>
-                <w:sz w:val="22"/>
-                <w:szCs w:val="22"/>
-                <w:lang w:eastAsia="zh-CN"/>
-              </w:rPr>
-              <w:t>}}</w:t>
+              <w:t>{{bsc_id}}</w:t>
             </w:r>
           </w:p>
         </w:tc>
@@ -9085,59 +7933,13 @@
               <w:t>E00</w:t>
             </w:r>
             <w:bookmarkStart w:id="11" w:name="OLE_LINK6"/>
-            <w:proofErr w:type="gramStart"/>
-            <w:r>
-              <w:rPr>
-                <w:rFonts w:ascii="Times New Roman" w:hAnsi="Times New Roman"/>
-                <w:sz w:val="22"/>
-                <w:szCs w:val="22"/>
-              </w:rPr>
-              <w:t xml:space="preserve">{{ </w:t>
-            </w:r>
-            <w:proofErr w:type="spellStart"/>
-            <w:r>
-              <w:rPr>
-                <w:rFonts w:ascii="Times New Roman" w:hAnsi="Times New Roman"/>
-                <w:sz w:val="22"/>
-                <w:szCs w:val="22"/>
-              </w:rPr>
-              <w:t>cr</w:t>
-            </w:r>
-            <w:proofErr w:type="gramEnd"/>
-            <w:r>
-              <w:rPr>
-                <w:rFonts w:ascii="Times New Roman" w:hAnsi="Times New Roman"/>
-                <w:sz w:val="22"/>
-                <w:szCs w:val="22"/>
-              </w:rPr>
-              <w:t>_</w:t>
-            </w:r>
-            <w:proofErr w:type="gramStart"/>
-            <w:r>
-              <w:rPr>
-                <w:rFonts w:ascii="Times New Roman" w:hAnsi="Times New Roman"/>
-                <w:sz w:val="22"/>
-                <w:szCs w:val="22"/>
-              </w:rPr>
-              <w:t>id</w:t>
-            </w:r>
-            <w:proofErr w:type="spellEnd"/>
-            <w:r>
-              <w:rPr>
-                <w:rFonts w:ascii="Times New Roman" w:hAnsi="Times New Roman"/>
-                <w:sz w:val="22"/>
-                <w:szCs w:val="22"/>
-              </w:rPr>
-              <w:t xml:space="preserve"> }</w:t>
-            </w:r>
-            <w:proofErr w:type="gramEnd"/>
-            <w:r>
-              <w:rPr>
-                <w:rFonts w:ascii="Times New Roman" w:hAnsi="Times New Roman"/>
-                <w:sz w:val="22"/>
-                <w:szCs w:val="22"/>
-              </w:rPr>
-              <w:t>}</w:t>
+            <w:r>
+              <w:rPr>
+                <w:rFonts w:ascii="Times New Roman" w:hAnsi="Times New Roman"/>
+                <w:sz w:val="22"/>
+                <w:szCs w:val="22"/>
+              </w:rPr>
+              <w:t>{{ cr_id }}</w:t>
             </w:r>
             <w:bookmarkEnd w:id="11"/>
             <w:r>
@@ -9155,16 +7957,7 @@
                 <w:sz w:val="22"/>
                 <w:szCs w:val="22"/>
               </w:rPr>
-              <w:t>(</w:t>
-            </w:r>
-            <w:proofErr w:type="gramStart"/>
-            <w:r>
-              <w:rPr>
-                <w:rFonts w:ascii="Times New Roman" w:hAnsi="Times New Roman"/>
-                <w:sz w:val="22"/>
-                <w:szCs w:val="22"/>
-              </w:rPr>
-              <w:t>CR</w:t>
+              <w:t>(CR</w:t>
             </w:r>
             <w:bookmarkStart w:id="13" w:name="OLE_LINK14"/>
             <w:r>
@@ -9173,52 +7966,7 @@
                 <w:sz w:val="22"/>
                 <w:szCs w:val="22"/>
               </w:rPr>
-              <w:t xml:space="preserve">{{ </w:t>
-            </w:r>
-            <w:proofErr w:type="spellStart"/>
-            <w:r>
-              <w:rPr>
-                <w:rFonts w:ascii="Times New Roman" w:hAnsi="Times New Roman"/>
-                <w:sz w:val="22"/>
-                <w:szCs w:val="22"/>
-              </w:rPr>
-              <w:t>cr</w:t>
-            </w:r>
-            <w:proofErr w:type="gramEnd"/>
-            <w:r>
-              <w:rPr>
-                <w:rFonts w:ascii="Times New Roman" w:hAnsi="Times New Roman"/>
-                <w:sz w:val="22"/>
-                <w:szCs w:val="22"/>
-              </w:rPr>
-              <w:t>_</w:t>
-            </w:r>
-            <w:proofErr w:type="gramStart"/>
-            <w:r>
-              <w:rPr>
-                <w:rFonts w:ascii="Times New Roman" w:hAnsi="Times New Roman"/>
-                <w:sz w:val="22"/>
-                <w:szCs w:val="22"/>
-              </w:rPr>
-              <w:t>suit</w:t>
-            </w:r>
-            <w:proofErr w:type="spellEnd"/>
-            <w:r>
-              <w:rPr>
-                <w:rFonts w:ascii="Times New Roman" w:hAnsi="Times New Roman"/>
-                <w:sz w:val="22"/>
-                <w:szCs w:val="22"/>
-              </w:rPr>
-              <w:t xml:space="preserve"> }</w:t>
-            </w:r>
-            <w:proofErr w:type="gramEnd"/>
-            <w:r>
-              <w:rPr>
-                <w:rFonts w:ascii="Times New Roman" w:hAnsi="Times New Roman"/>
-                <w:sz w:val="22"/>
-                <w:szCs w:val="22"/>
-              </w:rPr>
-              <w:t>}</w:t>
+              <w:t>{{ cr_suit }}</w:t>
             </w:r>
             <w:bookmarkEnd w:id="13"/>
             <w:r>
@@ -9918,27 +8666,7 @@
                 <w:sz w:val="22"/>
                 <w:szCs w:val="22"/>
               </w:rPr>
-              <w:t>System Suitability RSD &lt; 10% (</w:t>
-            </w:r>
-            <w:proofErr w:type="gramStart"/>
-            <w:r>
-              <w:rPr>
-                <w:rFonts w:ascii="Times New Roman" w:hAnsi="Times New Roman"/>
-                <w:color w:val="000000" w:themeColor="text1"/>
-                <w:sz w:val="22"/>
-                <w:szCs w:val="22"/>
-              </w:rPr>
-              <w:t>QDA,CAD</w:t>
-            </w:r>
-            <w:proofErr w:type="gramEnd"/>
-            <w:r>
-              <w:rPr>
-                <w:rFonts w:ascii="Times New Roman" w:hAnsi="Times New Roman"/>
-                <w:color w:val="000000" w:themeColor="text1"/>
-                <w:sz w:val="22"/>
-                <w:szCs w:val="22"/>
-              </w:rPr>
-              <w:t>)?</w:t>
+              <w:t>System Suitability RSD &lt; 10% (QDA,CAD)?</w:t>
             </w:r>
           </w:p>
         </w:tc>
@@ -10776,23 +9504,13 @@
                 <w:szCs w:val="22"/>
               </w:rPr>
             </w:pPr>
-            <w:proofErr w:type="gramStart"/>
-            <w:r>
-              <w:rPr>
-                <w:rFonts w:ascii="Times New Roman" w:hAnsi="Times New Roman"/>
-                <w:sz w:val="22"/>
-                <w:szCs w:val="22"/>
-              </w:rPr>
-              <w:t>Is</w:t>
-            </w:r>
-            <w:proofErr w:type="gramEnd"/>
-            <w:r>
-              <w:rPr>
-                <w:rFonts w:ascii="Times New Roman" w:hAnsi="Times New Roman"/>
-                <w:sz w:val="22"/>
-                <w:szCs w:val="22"/>
-              </w:rPr>
-              <w:t xml:space="preserve"> equipment/instrument functional and calibrated</w:t>
+            <w:r>
+              <w:rPr>
+                <w:rFonts w:ascii="Times New Roman" w:hAnsi="Times New Roman"/>
+                <w:sz w:val="22"/>
+                <w:szCs w:val="22"/>
+              </w:rPr>
+              <w:t>Is equipment/instrument functional and calibrated</w:t>
             </w:r>
             <w:r>
               <w:rPr>
@@ -11472,25 +10190,7 @@
                 <w:sz w:val="22"/>
                 <w:szCs w:val="22"/>
               </w:rPr>
-              <w:t xml:space="preserve">hromatogram/spectra/raw </w:t>
-            </w:r>
-            <w:proofErr w:type="gramStart"/>
-            <w:r>
-              <w:rPr>
-                <w:rFonts w:ascii="Times New Roman" w:hAnsi="Times New Roman"/>
-                <w:sz w:val="22"/>
-                <w:szCs w:val="22"/>
-              </w:rPr>
-              <w:t>data</w:t>
-            </w:r>
-            <w:proofErr w:type="gramEnd"/>
-            <w:r>
-              <w:rPr>
-                <w:rFonts w:ascii="Times New Roman" w:hAnsi="Times New Roman"/>
-                <w:sz w:val="22"/>
-                <w:szCs w:val="22"/>
-              </w:rPr>
-              <w:t xml:space="preserve"> correct?</w:t>
+              <w:t>hromatogram/spectra/raw data correct?</w:t>
             </w:r>
           </w:p>
         </w:tc>
@@ -12163,10 +10863,12 @@
                 <w:szCs w:val="22"/>
                 <w:lang w:eastAsia="zh-CN"/>
               </w:rPr>
-              <w:t>All the analysts involved in the testing, the processing analyst (</w:t>
-            </w:r>
-            <w:proofErr w:type="gramStart"/>
-            <w:r>
+              <w:t xml:space="preserve">All the analysts involved in the testing, the processing analyst ({{ analyst_name }}) and the reading analyst who confirmed the positive result ({{ reading_name }}), were interviewed comprehensively. Their answers are recorded throughout this document. </w:t>
+            </w:r>
+          </w:p>
+          <w:p>
+            <w:pPr>
+              <w:outlineLvl w:val="0"/>
               <w:rPr>
                 <w:rFonts w:ascii="Times New Roman" w:eastAsiaTheme="minorEastAsia" w:hAnsi="Times New Roman"/>
                 <w:bCs/>
@@ -12174,10 +10876,11 @@
                 <w:szCs w:val="22"/>
                 <w:lang w:eastAsia="zh-CN"/>
               </w:rPr>
-              <w:t xml:space="preserve">{{ </w:t>
-            </w:r>
-            <w:proofErr w:type="spellStart"/>
-            <w:r>
+            </w:pPr>
+          </w:p>
+          <w:p>
+            <w:pPr>
+              <w:outlineLvl w:val="0"/>
               <w:rPr>
                 <w:rFonts w:ascii="Times New Roman" w:eastAsiaTheme="minorEastAsia" w:hAnsi="Times New Roman"/>
                 <w:bCs/>
@@ -12185,9 +10888,7 @@
                 <w:szCs w:val="22"/>
                 <w:lang w:eastAsia="zh-CN"/>
               </w:rPr>
-              <w:t>analyst</w:t>
-            </w:r>
-            <w:proofErr w:type="gramEnd"/>
+            </w:pPr>
             <w:r>
               <w:rPr>
                 <w:rFonts w:ascii="Times New Roman" w:eastAsiaTheme="minorEastAsia" w:hAnsi="Times New Roman"/>
@@ -12196,10 +10897,12 @@
                 <w:szCs w:val="22"/>
                 <w:lang w:eastAsia="zh-CN"/>
               </w:rPr>
-              <w:t>_</w:t>
-            </w:r>
-            <w:proofErr w:type="gramStart"/>
-            <w:r>
+              <w:t>Upon arrival, the sample was stored in accordance with the Client’s instructions. Analyst {{ prepper_name }} verified the sample’s integrity throughout both the preparation and processing stages. No leaks or turbidity were observed at any point, verifying the integrity of the sample.</w:t>
+            </w:r>
+          </w:p>
+          <w:p>
+            <w:pPr>
+              <w:outlineLvl w:val="0"/>
               <w:rPr>
                 <w:rFonts w:ascii="Times New Roman" w:eastAsiaTheme="minorEastAsia" w:hAnsi="Times New Roman"/>
                 <w:bCs/>
@@ -12207,10 +10910,11 @@
                 <w:szCs w:val="22"/>
                 <w:lang w:eastAsia="zh-CN"/>
               </w:rPr>
-              <w:t>name</w:t>
-            </w:r>
-            <w:proofErr w:type="spellEnd"/>
-            <w:r>
+            </w:pPr>
+          </w:p>
+          <w:p>
+            <w:pPr>
+              <w:outlineLvl w:val="0"/>
               <w:rPr>
                 <w:rFonts w:ascii="Times New Roman" w:eastAsiaTheme="minorEastAsia" w:hAnsi="Times New Roman"/>
                 <w:bCs/>
@@ -12218,9 +10922,7 @@
                 <w:szCs w:val="22"/>
                 <w:lang w:eastAsia="zh-CN"/>
               </w:rPr>
-              <w:t xml:space="preserve"> }</w:t>
-            </w:r>
-            <w:proofErr w:type="gramEnd"/>
+            </w:pPr>
             <w:r>
               <w:rPr>
                 <w:rFonts w:ascii="Times New Roman" w:eastAsiaTheme="minorEastAsia" w:hAnsi="Times New Roman"/>
@@ -12229,10 +10931,12 @@
                 <w:szCs w:val="22"/>
                 <w:lang w:eastAsia="zh-CN"/>
               </w:rPr>
-              <w:t>}) and the reading analyst who confirmed the positive result (</w:t>
-            </w:r>
-            <w:proofErr w:type="gramStart"/>
-            <w:r>
+              <w:t>All reagents and supplies mentioned in the material section above were stored according to the suppliers’ recommendations, and their integrity was visually verified before utilization. Moreover, all reagents and supplies had valid expiration dates. The functionality of all equipment was confirmed by reviewing data generated by our comprehensive in-house continuous monitoring system.</w:t>
+            </w:r>
+          </w:p>
+          <w:p>
+            <w:pPr>
+              <w:outlineLvl w:val="0"/>
               <w:rPr>
                 <w:rFonts w:ascii="Times New Roman" w:eastAsiaTheme="minorEastAsia" w:hAnsi="Times New Roman"/>
                 <w:bCs/>
@@ -12240,10 +10944,11 @@
                 <w:szCs w:val="22"/>
                 <w:lang w:eastAsia="zh-CN"/>
               </w:rPr>
-              <w:t xml:space="preserve">{{ </w:t>
-            </w:r>
-            <w:proofErr w:type="spellStart"/>
-            <w:r>
+            </w:pPr>
+          </w:p>
+          <w:p>
+            <w:pPr>
+              <w:outlineLvl w:val="0"/>
               <w:rPr>
                 <w:rFonts w:ascii="Times New Roman" w:eastAsiaTheme="minorEastAsia" w:hAnsi="Times New Roman"/>
                 <w:bCs/>
@@ -12251,9 +10956,7 @@
                 <w:szCs w:val="22"/>
                 <w:lang w:eastAsia="zh-CN"/>
               </w:rPr>
-              <w:t>reading</w:t>
-            </w:r>
-            <w:proofErr w:type="gramEnd"/>
+            </w:pPr>
             <w:r>
               <w:rPr>
                 <w:rFonts w:ascii="Times New Roman" w:eastAsiaTheme="minorEastAsia" w:hAnsi="Times New Roman"/>
@@ -12262,10 +10965,12 @@
                 <w:szCs w:val="22"/>
                 <w:lang w:eastAsia="zh-CN"/>
               </w:rPr>
-              <w:t>_</w:t>
-            </w:r>
-            <w:proofErr w:type="gramStart"/>
-            <w:r>
+              <w:t>{{ equipment_summary }}</w:t>
+            </w:r>
+          </w:p>
+          <w:p>
+            <w:pPr>
+              <w:outlineLvl w:val="0"/>
               <w:rPr>
                 <w:rFonts w:ascii="Times New Roman" w:eastAsiaTheme="minorEastAsia" w:hAnsi="Times New Roman"/>
                 <w:bCs/>
@@ -12273,10 +10978,11 @@
                 <w:szCs w:val="22"/>
                 <w:lang w:eastAsia="zh-CN"/>
               </w:rPr>
-              <w:t>name</w:t>
-            </w:r>
-            <w:proofErr w:type="spellEnd"/>
-            <w:r>
+            </w:pPr>
+          </w:p>
+          <w:p>
+            <w:pPr>
+              <w:outlineLvl w:val="0"/>
               <w:rPr>
                 <w:rFonts w:ascii="Times New Roman" w:eastAsiaTheme="minorEastAsia" w:hAnsi="Times New Roman"/>
                 <w:bCs/>
@@ -12284,9 +10990,7 @@
                 <w:szCs w:val="22"/>
                 <w:lang w:eastAsia="zh-CN"/>
               </w:rPr>
-              <w:t xml:space="preserve"> }</w:t>
-            </w:r>
-            <w:proofErr w:type="gramEnd"/>
+            </w:pPr>
             <w:r>
               <w:rPr>
                 <w:rFonts w:ascii="Times New Roman" w:eastAsiaTheme="minorEastAsia" w:hAnsi="Times New Roman"/>
@@ -12295,7 +10999,7 @@
                 <w:szCs w:val="22"/>
                 <w:lang w:eastAsia="zh-CN"/>
               </w:rPr>
-              <w:t xml:space="preserve">}), were interviewed comprehensively. Their answers are recorded throughout this document. </w:t>
+              <w:t>On {{received_data}}, the sample vials for {{ sample_id }} were received from the Sample Submissions team and brought into the Sterile Microbiology lab. Upon arrival, each sample vial was sprayed with an acidified bleach disinfectant, placed into pre-disinfected bins, and allowed a 10-minute contact time. The secondary disinfection happened in the ISO 8 anteroom (Suite {{ cr_suit }})), where the vials were again treated with acidified bleach and provided a 10‑minute contact time before processing. Subsequently, the vials were moved into the ISO 7 cleanroom Suite {{ cr_suit }}({{ suit }}). Inside this cleanroom, the processing analyst, {{ analyst_name }}, performed a final disinfection step, allowing an additional 10-minute contact time. Once fully disinfected, the vials were transferred into the ISO 5 BSC E00{{bsc_id}}.</w:t>
             </w:r>
           </w:p>
           <w:p>
@@ -12329,10 +11033,12 @@
                 <w:szCs w:val="22"/>
                 <w:lang w:eastAsia="zh-CN"/>
               </w:rPr>
-              <w:t xml:space="preserve">Upon arrival, the sample was stored in accordance with the Client’s instructions. Analyst </w:t>
-            </w:r>
-            <w:proofErr w:type="gramStart"/>
-            <w:r>
+              <w:t xml:space="preserve">Once transferred into the ISO 5 BSC, the vials were placed on the disinfected working surface of the BSC E00{{bsc_id}} and aseptically opened and tested in accordance with SOP 2.600.008 (USP / EP 2.6.1 Sterility Test). Following testing, the media bottles were subsequently transferred into designated incubators, E001356 and E001357, to initiate incubation. </w:t>
+            </w:r>
+          </w:p>
+          <w:p>
+            <w:pPr>
+              <w:outlineLvl w:val="0"/>
               <w:rPr>
                 <w:rFonts w:ascii="Times New Roman" w:eastAsiaTheme="minorEastAsia" w:hAnsi="Times New Roman"/>
                 <w:bCs/>
@@ -12340,10 +11046,11 @@
                 <w:szCs w:val="22"/>
                 <w:lang w:eastAsia="zh-CN"/>
               </w:rPr>
-              <w:t xml:space="preserve">{{ </w:t>
-            </w:r>
-            <w:proofErr w:type="spellStart"/>
-            <w:r>
+            </w:pPr>
+          </w:p>
+          <w:p>
+            <w:pPr>
+              <w:outlineLvl w:val="0"/>
               <w:rPr>
                 <w:rFonts w:ascii="Times New Roman" w:eastAsiaTheme="minorEastAsia" w:hAnsi="Times New Roman"/>
                 <w:bCs/>
@@ -12351,9 +11058,7 @@
                 <w:szCs w:val="22"/>
                 <w:lang w:eastAsia="zh-CN"/>
               </w:rPr>
-              <w:t>prepper</w:t>
-            </w:r>
-            <w:proofErr w:type="gramEnd"/>
+            </w:pPr>
             <w:r>
               <w:rPr>
                 <w:rFonts w:ascii="Times New Roman" w:eastAsiaTheme="minorEastAsia" w:hAnsi="Times New Roman"/>
@@ -12362,10 +11067,12 @@
                 <w:szCs w:val="22"/>
                 <w:lang w:eastAsia="zh-CN"/>
               </w:rPr>
-              <w:t>_</w:t>
-            </w:r>
-            <w:proofErr w:type="gramStart"/>
-            <w:r>
+              <w:t>On {{ test_date }} (Day {{incubation_time}} of incubation), microbial growth was observed in {{ positive_media}} media bottle by analyst {{ reading_name }} and confirmed by Microbiology Lab Supervisor Robin Seymour. The organism was identified as {{ positive_org }} (see Table 1).</w:t>
+            </w:r>
+          </w:p>
+          <w:p>
+            <w:pPr>
+              <w:outlineLvl w:val="0"/>
               <w:rPr>
                 <w:rFonts w:ascii="Times New Roman" w:eastAsiaTheme="minorEastAsia" w:hAnsi="Times New Roman"/>
                 <w:bCs/>
@@ -12373,9 +11080,7 @@
                 <w:szCs w:val="22"/>
                 <w:lang w:eastAsia="zh-CN"/>
               </w:rPr>
-              <w:t>name</w:t>
-            </w:r>
-            <w:proofErr w:type="spellEnd"/>
+            </w:pPr>
             <w:r>
               <w:rPr>
                 <w:rFonts w:ascii="Times New Roman" w:eastAsiaTheme="minorEastAsia" w:hAnsi="Times New Roman"/>
@@ -12384,10 +11089,12 @@
                 <w:szCs w:val="22"/>
                 <w:lang w:eastAsia="zh-CN"/>
               </w:rPr>
-              <w:t xml:space="preserve"> }</w:t>
-            </w:r>
-            <w:proofErr w:type="gramEnd"/>
-            <w:r>
+              <w:t xml:space="preserve"> </w:t>
+            </w:r>
+          </w:p>
+          <w:p>
+            <w:pPr>
+              <w:outlineLvl w:val="0"/>
               <w:rPr>
                 <w:rFonts w:ascii="Times New Roman" w:eastAsiaTheme="minorEastAsia" w:hAnsi="Times New Roman"/>
                 <w:bCs/>
@@ -12395,12 +11102,8 @@
                 <w:szCs w:val="22"/>
                 <w:lang w:eastAsia="zh-CN"/>
               </w:rPr>
-              <w:t>} verified the sample’s integrity throughout both the preparation and processing stages. No leaks or turbidity were observed at any point, verifying the integrity of the sample.</w:t>
-            </w:r>
-          </w:p>
-          <w:p>
-            <w:pPr>
-              <w:outlineLvl w:val="0"/>
+            </w:pPr>
+            <w:r>
               <w:rPr>
                 <w:rFonts w:ascii="Times New Roman" w:eastAsiaTheme="minorEastAsia" w:hAnsi="Times New Roman"/>
                 <w:bCs/>
@@ -12408,7 +11111,8 @@
                 <w:szCs w:val="22"/>
                 <w:lang w:eastAsia="zh-CN"/>
               </w:rPr>
-            </w:pPr>
+              <w:t>The culture media used were within expiry. Negative control media bottles were processed and incubated under identical conditions and showed no microbial growth, confirming the integrity of the test procedure.</w:t>
+            </w:r>
           </w:p>
           <w:p>
             <w:pPr>
@@ -12421,7 +11125,10 @@
                 <w:lang w:eastAsia="zh-CN"/>
               </w:rPr>
             </w:pPr>
-            <w:r>
+          </w:p>
+          <w:p>
+            <w:pPr>
+              <w:outlineLvl w:val="0"/>
               <w:rPr>
                 <w:rFonts w:ascii="Times New Roman" w:eastAsiaTheme="minorEastAsia" w:hAnsi="Times New Roman"/>
                 <w:bCs/>
@@ -12429,12 +11136,8 @@
                 <w:szCs w:val="22"/>
                 <w:lang w:eastAsia="zh-CN"/>
               </w:rPr>
-              <w:t>All reagents and supplies mentioned in the material section above were stored according to the suppliers’ recommendations, and their integrity was visually verified before utilization. Moreover, all reagents and supplies had valid expiration dates. The functionality of all equipment was confirmed by reviewing data generated by our comprehensive in-house continuous monitoring system.</w:t>
-            </w:r>
-          </w:p>
-          <w:p>
-            <w:pPr>
-              <w:outlineLvl w:val="0"/>
+            </w:pPr>
+            <w:r>
               <w:rPr>
                 <w:rFonts w:ascii="Times New Roman" w:eastAsiaTheme="minorEastAsia" w:hAnsi="Times New Roman"/>
                 <w:bCs/>
@@ -12442,9 +11145,12 @@
                 <w:szCs w:val="22"/>
                 <w:lang w:eastAsia="zh-CN"/>
               </w:rPr>
-            </w:pPr>
-            <w:proofErr w:type="gramStart"/>
-            <w:r>
+              <w:t xml:space="preserve">{{ narrative_summary }} </w:t>
+            </w:r>
+          </w:p>
+          <w:p>
+            <w:pPr>
+              <w:outlineLvl w:val="0"/>
               <w:rPr>
                 <w:rFonts w:ascii="Times New Roman" w:eastAsiaTheme="minorEastAsia" w:hAnsi="Times New Roman"/>
                 <w:bCs/>
@@ -12452,10 +11158,11 @@
                 <w:szCs w:val="22"/>
                 <w:lang w:eastAsia="zh-CN"/>
               </w:rPr>
-              <w:t xml:space="preserve">{{ </w:t>
-            </w:r>
-            <w:proofErr w:type="spellStart"/>
-            <w:r>
+            </w:pPr>
+          </w:p>
+          <w:p>
+            <w:pPr>
+              <w:outlineLvl w:val="0"/>
               <w:rPr>
                 <w:rFonts w:ascii="Times New Roman" w:eastAsiaTheme="minorEastAsia" w:hAnsi="Times New Roman"/>
                 <w:bCs/>
@@ -12463,9 +11170,7 @@
                 <w:szCs w:val="22"/>
                 <w:lang w:eastAsia="zh-CN"/>
               </w:rPr>
-              <w:t>equipment</w:t>
-            </w:r>
-            <w:proofErr w:type="gramEnd"/>
+            </w:pPr>
             <w:r>
               <w:rPr>
                 <w:rFonts w:ascii="Times New Roman" w:eastAsiaTheme="minorEastAsia" w:hAnsi="Times New Roman"/>
@@ -12474,10 +11179,12 @@
                 <w:szCs w:val="22"/>
                 <w:lang w:eastAsia="zh-CN"/>
               </w:rPr>
-              <w:t>_</w:t>
-            </w:r>
-            <w:proofErr w:type="gramStart"/>
-            <w:r>
+              <w:t xml:space="preserve">The analysts confirmed full compliance with cleaning procedures as outlined in SOPs 2.600.018 (Cleaning and Disinfecting Procedure for Microbiology) and 2.600.008 (USP &lt;71&gt; / EP 2.6.1 Sterility Test). </w:t>
+            </w:r>
+          </w:p>
+          <w:p>
+            <w:pPr>
+              <w:outlineLvl w:val="0"/>
               <w:rPr>
                 <w:rFonts w:ascii="Times New Roman" w:eastAsiaTheme="minorEastAsia" w:hAnsi="Times New Roman"/>
                 <w:bCs/>
@@ -12485,10 +11192,11 @@
                 <w:szCs w:val="22"/>
                 <w:lang w:eastAsia="zh-CN"/>
               </w:rPr>
-              <w:t>summary</w:t>
-            </w:r>
-            <w:proofErr w:type="spellEnd"/>
-            <w:r>
+            </w:pPr>
+          </w:p>
+          <w:p>
+            <w:pPr>
+              <w:outlineLvl w:val="0"/>
               <w:rPr>
                 <w:rFonts w:ascii="Times New Roman" w:eastAsiaTheme="minorEastAsia" w:hAnsi="Times New Roman"/>
                 <w:bCs/>
@@ -12496,9 +11204,7 @@
                 <w:szCs w:val="22"/>
                 <w:lang w:eastAsia="zh-CN"/>
               </w:rPr>
-              <w:t xml:space="preserve"> }</w:t>
-            </w:r>
-            <w:proofErr w:type="gramEnd"/>
+            </w:pPr>
             <w:r>
               <w:rPr>
                 <w:rFonts w:ascii="Times New Roman" w:eastAsiaTheme="minorEastAsia" w:hAnsi="Times New Roman"/>
@@ -12507,12 +11213,9 @@
                 <w:szCs w:val="22"/>
                 <w:lang w:eastAsia="zh-CN"/>
               </w:rPr>
-              <w:t>}</w:t>
-            </w:r>
-          </w:p>
-          <w:p>
-            <w:pPr>
-              <w:outlineLvl w:val="0"/>
+              <w:t xml:space="preserve">Monthly cleaning and disinfection of the outermost ISO 8 Anteroom, the middle ISO 7 Buffer room, the innermost ISO 7 cleanroom, and its containing ISO 5 Biosafety Cabinets for CR {{ cr_suit }} was performed on {{ monthly_cleaning_date }}, as per SOP 2.600.018 (Cleaning and Disinfecting Procedure for Microbiology) During </w:t>
+            </w:r>
+            <w:r>
               <w:rPr>
                 <w:rFonts w:ascii="Times New Roman" w:eastAsiaTheme="minorEastAsia" w:hAnsi="Times New Roman"/>
                 <w:bCs/>
@@ -12520,7 +11223,9 @@
                 <w:szCs w:val="22"/>
                 <w:lang w:eastAsia="zh-CN"/>
               </w:rPr>
-            </w:pPr>
+              <w:lastRenderedPageBreak/>
+              <w:t xml:space="preserve">both cleaning cycles, it was documented that all H₂O₂ indicators passed. This confirms the efficient monthly cleaning of all three parts of Cleanrooms {{ cr_suit }}. </w:t>
+            </w:r>
           </w:p>
           <w:p>
             <w:pPr>
@@ -12533,7 +11238,10 @@
                 <w:lang w:eastAsia="zh-CN"/>
               </w:rPr>
             </w:pPr>
-            <w:r>
+          </w:p>
+          <w:p>
+            <w:pPr>
+              <w:outlineLvl w:val="0"/>
               <w:rPr>
                 <w:rFonts w:ascii="Times New Roman" w:eastAsiaTheme="minorEastAsia" w:hAnsi="Times New Roman"/>
                 <w:bCs/>
@@ -12541,9 +11249,7 @@
                 <w:szCs w:val="22"/>
                 <w:lang w:eastAsia="zh-CN"/>
               </w:rPr>
-              <w:t>On {{</w:t>
-            </w:r>
-            <w:proofErr w:type="spellStart"/>
+            </w:pPr>
             <w:r>
               <w:rPr>
                 <w:rFonts w:ascii="Times New Roman" w:eastAsiaTheme="minorEastAsia" w:hAnsi="Times New Roman"/>
@@ -12552,10 +11258,12 @@
                 <w:szCs w:val="22"/>
                 <w:lang w:eastAsia="zh-CN"/>
               </w:rPr>
-              <w:t>received_</w:t>
-            </w:r>
-            <w:proofErr w:type="gramStart"/>
-            <w:r>
+              <w:t>{{ sample_history_paragraph }}</w:t>
+            </w:r>
+          </w:p>
+          <w:p>
+            <w:pPr>
+              <w:outlineLvl w:val="0"/>
               <w:rPr>
                 <w:rFonts w:ascii="Times New Roman" w:eastAsiaTheme="minorEastAsia" w:hAnsi="Times New Roman"/>
                 <w:bCs/>
@@ -12563,10 +11271,11 @@
                 <w:szCs w:val="22"/>
                 <w:lang w:eastAsia="zh-CN"/>
               </w:rPr>
-              <w:t>data</w:t>
-            </w:r>
-            <w:proofErr w:type="spellEnd"/>
-            <w:r>
+            </w:pPr>
+          </w:p>
+          <w:p>
+            <w:pPr>
+              <w:outlineLvl w:val="0"/>
               <w:rPr>
                 <w:rFonts w:ascii="Times New Roman" w:eastAsiaTheme="minorEastAsia" w:hAnsi="Times New Roman"/>
                 <w:bCs/>
@@ -12574,9 +11283,7 @@
                 <w:szCs w:val="22"/>
                 <w:lang w:eastAsia="zh-CN"/>
               </w:rPr>
-              <w:t>}},</w:t>
-            </w:r>
-            <w:proofErr w:type="gramEnd"/>
+            </w:pPr>
             <w:r>
               <w:rPr>
                 <w:rFonts w:ascii="Times New Roman" w:eastAsiaTheme="minorEastAsia" w:hAnsi="Times New Roman"/>
@@ -12585,1248 +11292,7 @@
                 <w:szCs w:val="22"/>
                 <w:lang w:eastAsia="zh-CN"/>
               </w:rPr>
-              <w:t xml:space="preserve"> the sample vials for </w:t>
-            </w:r>
-            <w:proofErr w:type="gramStart"/>
-            <w:r>
-              <w:rPr>
-                <w:rFonts w:ascii="Times New Roman" w:eastAsiaTheme="minorEastAsia" w:hAnsi="Times New Roman"/>
-                <w:bCs/>
-                <w:sz w:val="22"/>
-                <w:szCs w:val="22"/>
-                <w:lang w:eastAsia="zh-CN"/>
-              </w:rPr>
-              <w:t xml:space="preserve">{{ </w:t>
-            </w:r>
-            <w:proofErr w:type="spellStart"/>
-            <w:r>
-              <w:rPr>
-                <w:rFonts w:ascii="Times New Roman" w:eastAsiaTheme="minorEastAsia" w:hAnsi="Times New Roman"/>
-                <w:bCs/>
-                <w:sz w:val="22"/>
-                <w:szCs w:val="22"/>
-                <w:lang w:eastAsia="zh-CN"/>
-              </w:rPr>
-              <w:t>sample</w:t>
-            </w:r>
-            <w:proofErr w:type="gramEnd"/>
-            <w:r>
-              <w:rPr>
-                <w:rFonts w:ascii="Times New Roman" w:eastAsiaTheme="minorEastAsia" w:hAnsi="Times New Roman"/>
-                <w:bCs/>
-                <w:sz w:val="22"/>
-                <w:szCs w:val="22"/>
-                <w:lang w:eastAsia="zh-CN"/>
-              </w:rPr>
-              <w:t>_</w:t>
-            </w:r>
-            <w:proofErr w:type="gramStart"/>
-            <w:r>
-              <w:rPr>
-                <w:rFonts w:ascii="Times New Roman" w:eastAsiaTheme="minorEastAsia" w:hAnsi="Times New Roman"/>
-                <w:bCs/>
-                <w:sz w:val="22"/>
-                <w:szCs w:val="22"/>
-                <w:lang w:eastAsia="zh-CN"/>
-              </w:rPr>
-              <w:t>id</w:t>
-            </w:r>
-            <w:proofErr w:type="spellEnd"/>
-            <w:r>
-              <w:rPr>
-                <w:rFonts w:ascii="Times New Roman" w:eastAsiaTheme="minorEastAsia" w:hAnsi="Times New Roman"/>
-                <w:bCs/>
-                <w:sz w:val="22"/>
-                <w:szCs w:val="22"/>
-                <w:lang w:eastAsia="zh-CN"/>
-              </w:rPr>
-              <w:t xml:space="preserve"> }</w:t>
-            </w:r>
-            <w:proofErr w:type="gramEnd"/>
-            <w:r>
-              <w:rPr>
-                <w:rFonts w:ascii="Times New Roman" w:eastAsiaTheme="minorEastAsia" w:hAnsi="Times New Roman"/>
-                <w:bCs/>
-                <w:sz w:val="22"/>
-                <w:szCs w:val="22"/>
-                <w:lang w:eastAsia="zh-CN"/>
-              </w:rPr>
-              <w:t xml:space="preserve">} were received from the Sample Submissions team and brought into the Sterile Microbiology lab. Upon arrival, each sample vial was sprayed with an acidified bleach disinfectant, placed into pre-disinfected bins, and allowed a 10-minute contact time. The secondary disinfection happened in the ISO 8 anteroom (Suite </w:t>
-            </w:r>
-            <w:proofErr w:type="gramStart"/>
-            <w:r>
-              <w:rPr>
-                <w:rFonts w:ascii="Times New Roman" w:eastAsiaTheme="minorEastAsia" w:hAnsi="Times New Roman"/>
-                <w:bCs/>
-                <w:sz w:val="22"/>
-                <w:szCs w:val="22"/>
-                <w:lang w:eastAsia="zh-CN"/>
-              </w:rPr>
-              <w:t xml:space="preserve">{{ </w:t>
-            </w:r>
-            <w:proofErr w:type="spellStart"/>
-            <w:r>
-              <w:rPr>
-                <w:rFonts w:ascii="Times New Roman" w:eastAsiaTheme="minorEastAsia" w:hAnsi="Times New Roman"/>
-                <w:bCs/>
-                <w:sz w:val="22"/>
-                <w:szCs w:val="22"/>
-                <w:lang w:eastAsia="zh-CN"/>
-              </w:rPr>
-              <w:t>cr</w:t>
-            </w:r>
-            <w:proofErr w:type="gramEnd"/>
-            <w:r>
-              <w:rPr>
-                <w:rFonts w:ascii="Times New Roman" w:eastAsiaTheme="minorEastAsia" w:hAnsi="Times New Roman"/>
-                <w:bCs/>
-                <w:sz w:val="22"/>
-                <w:szCs w:val="22"/>
-                <w:lang w:eastAsia="zh-CN"/>
-              </w:rPr>
-              <w:t>_</w:t>
-            </w:r>
-            <w:proofErr w:type="gramStart"/>
-            <w:r>
-              <w:rPr>
-                <w:rFonts w:ascii="Times New Roman" w:eastAsiaTheme="minorEastAsia" w:hAnsi="Times New Roman"/>
-                <w:bCs/>
-                <w:sz w:val="22"/>
-                <w:szCs w:val="22"/>
-                <w:lang w:eastAsia="zh-CN"/>
-              </w:rPr>
-              <w:t>suit</w:t>
-            </w:r>
-            <w:proofErr w:type="spellEnd"/>
-            <w:r>
-              <w:rPr>
-                <w:rFonts w:ascii="Times New Roman" w:eastAsiaTheme="minorEastAsia" w:hAnsi="Times New Roman"/>
-                <w:bCs/>
-                <w:sz w:val="22"/>
-                <w:szCs w:val="22"/>
-                <w:lang w:eastAsia="zh-CN"/>
-              </w:rPr>
-              <w:t xml:space="preserve"> }</w:t>
-            </w:r>
-            <w:proofErr w:type="gramEnd"/>
-            <w:r>
-              <w:rPr>
-                <w:rFonts w:ascii="Times New Roman" w:eastAsiaTheme="minorEastAsia" w:hAnsi="Times New Roman"/>
-                <w:bCs/>
-                <w:sz w:val="22"/>
-                <w:szCs w:val="22"/>
-                <w:lang w:eastAsia="zh-CN"/>
-              </w:rPr>
-              <w:t xml:space="preserve">})), where the vials were again treated with acidified bleach and provided a 10‑minute contact time before processing. Subsequently, the vials were moved into the ISO 7 cleanroom Suite </w:t>
-            </w:r>
-            <w:proofErr w:type="gramStart"/>
-            <w:r>
-              <w:rPr>
-                <w:rFonts w:ascii="Times New Roman" w:eastAsiaTheme="minorEastAsia" w:hAnsi="Times New Roman"/>
-                <w:bCs/>
-                <w:sz w:val="22"/>
-                <w:szCs w:val="22"/>
-                <w:lang w:eastAsia="zh-CN"/>
-              </w:rPr>
-              <w:t xml:space="preserve">{{ </w:t>
-            </w:r>
-            <w:proofErr w:type="spellStart"/>
-            <w:r>
-              <w:rPr>
-                <w:rFonts w:ascii="Times New Roman" w:eastAsiaTheme="minorEastAsia" w:hAnsi="Times New Roman"/>
-                <w:bCs/>
-                <w:sz w:val="22"/>
-                <w:szCs w:val="22"/>
-                <w:lang w:eastAsia="zh-CN"/>
-              </w:rPr>
-              <w:t>cr</w:t>
-            </w:r>
-            <w:proofErr w:type="gramEnd"/>
-            <w:r>
-              <w:rPr>
-                <w:rFonts w:ascii="Times New Roman" w:eastAsiaTheme="minorEastAsia" w:hAnsi="Times New Roman"/>
-                <w:bCs/>
-                <w:sz w:val="22"/>
-                <w:szCs w:val="22"/>
-                <w:lang w:eastAsia="zh-CN"/>
-              </w:rPr>
-              <w:t>_</w:t>
-            </w:r>
-            <w:proofErr w:type="gramStart"/>
-            <w:r>
-              <w:rPr>
-                <w:rFonts w:ascii="Times New Roman" w:eastAsiaTheme="minorEastAsia" w:hAnsi="Times New Roman"/>
-                <w:bCs/>
-                <w:sz w:val="22"/>
-                <w:szCs w:val="22"/>
-                <w:lang w:eastAsia="zh-CN"/>
-              </w:rPr>
-              <w:t>suit</w:t>
-            </w:r>
-            <w:proofErr w:type="spellEnd"/>
-            <w:r>
-              <w:rPr>
-                <w:rFonts w:ascii="Times New Roman" w:eastAsiaTheme="minorEastAsia" w:hAnsi="Times New Roman"/>
-                <w:bCs/>
-                <w:sz w:val="22"/>
-                <w:szCs w:val="22"/>
-                <w:lang w:eastAsia="zh-CN"/>
-              </w:rPr>
-              <w:t xml:space="preserve"> }}({{ suit</w:t>
-            </w:r>
-            <w:proofErr w:type="gramEnd"/>
-            <w:r>
-              <w:rPr>
-                <w:rFonts w:ascii="Times New Roman" w:eastAsiaTheme="minorEastAsia" w:hAnsi="Times New Roman"/>
-                <w:bCs/>
-                <w:sz w:val="22"/>
-                <w:szCs w:val="22"/>
-                <w:lang w:eastAsia="zh-CN"/>
-              </w:rPr>
-              <w:t xml:space="preserve"> }}). Inside this cleanroom, the processing analyst, </w:t>
-            </w:r>
-            <w:proofErr w:type="gramStart"/>
-            <w:r>
-              <w:rPr>
-                <w:rFonts w:ascii="Times New Roman" w:eastAsiaTheme="minorEastAsia" w:hAnsi="Times New Roman"/>
-                <w:bCs/>
-                <w:sz w:val="22"/>
-                <w:szCs w:val="22"/>
-                <w:lang w:eastAsia="zh-CN"/>
-              </w:rPr>
-              <w:t xml:space="preserve">{{ </w:t>
-            </w:r>
-            <w:proofErr w:type="spellStart"/>
-            <w:r>
-              <w:rPr>
-                <w:rFonts w:ascii="Times New Roman" w:eastAsiaTheme="minorEastAsia" w:hAnsi="Times New Roman"/>
-                <w:bCs/>
-                <w:sz w:val="22"/>
-                <w:szCs w:val="22"/>
-                <w:lang w:eastAsia="zh-CN"/>
-              </w:rPr>
-              <w:t>analyst</w:t>
-            </w:r>
-            <w:proofErr w:type="gramEnd"/>
-            <w:r>
-              <w:rPr>
-                <w:rFonts w:ascii="Times New Roman" w:eastAsiaTheme="minorEastAsia" w:hAnsi="Times New Roman"/>
-                <w:bCs/>
-                <w:sz w:val="22"/>
-                <w:szCs w:val="22"/>
-                <w:lang w:eastAsia="zh-CN"/>
-              </w:rPr>
-              <w:t>_</w:t>
-            </w:r>
-            <w:proofErr w:type="gramStart"/>
-            <w:r>
-              <w:rPr>
-                <w:rFonts w:ascii="Times New Roman" w:eastAsiaTheme="minorEastAsia" w:hAnsi="Times New Roman"/>
-                <w:bCs/>
-                <w:sz w:val="22"/>
-                <w:szCs w:val="22"/>
-                <w:lang w:eastAsia="zh-CN"/>
-              </w:rPr>
-              <w:t>name</w:t>
-            </w:r>
-            <w:proofErr w:type="spellEnd"/>
-            <w:r>
-              <w:rPr>
-                <w:rFonts w:ascii="Times New Roman" w:eastAsiaTheme="minorEastAsia" w:hAnsi="Times New Roman"/>
-                <w:bCs/>
-                <w:sz w:val="22"/>
-                <w:szCs w:val="22"/>
-                <w:lang w:eastAsia="zh-CN"/>
-              </w:rPr>
-              <w:t xml:space="preserve"> }</w:t>
-            </w:r>
-            <w:proofErr w:type="gramEnd"/>
-            <w:r>
-              <w:rPr>
-                <w:rFonts w:ascii="Times New Roman" w:eastAsiaTheme="minorEastAsia" w:hAnsi="Times New Roman"/>
-                <w:bCs/>
-                <w:sz w:val="22"/>
-                <w:szCs w:val="22"/>
-                <w:lang w:eastAsia="zh-CN"/>
-              </w:rPr>
-              <w:t>}, performed a final disinfection step, allowing an additional 10-minute contact time. Once fully disinfected, the vials were transferred into the ISO 5 BSC E00{{</w:t>
-            </w:r>
-            <w:proofErr w:type="spellStart"/>
-            <w:r>
-              <w:rPr>
-                <w:rFonts w:ascii="Times New Roman" w:eastAsiaTheme="minorEastAsia" w:hAnsi="Times New Roman"/>
-                <w:bCs/>
-                <w:sz w:val="22"/>
-                <w:szCs w:val="22"/>
-                <w:lang w:eastAsia="zh-CN"/>
-              </w:rPr>
-              <w:t>bsc_id</w:t>
-            </w:r>
-            <w:proofErr w:type="spellEnd"/>
-            <w:r>
-              <w:rPr>
-                <w:rFonts w:ascii="Times New Roman" w:eastAsiaTheme="minorEastAsia" w:hAnsi="Times New Roman"/>
-                <w:bCs/>
-                <w:sz w:val="22"/>
-                <w:szCs w:val="22"/>
-                <w:lang w:eastAsia="zh-CN"/>
-              </w:rPr>
-              <w:t>}}.</w:t>
-            </w:r>
-          </w:p>
-          <w:p>
-            <w:pPr>
-              <w:outlineLvl w:val="0"/>
-              <w:rPr>
-                <w:rFonts w:ascii="Times New Roman" w:eastAsiaTheme="minorEastAsia" w:hAnsi="Times New Roman"/>
-                <w:bCs/>
-                <w:sz w:val="22"/>
-                <w:szCs w:val="22"/>
-                <w:lang w:eastAsia="zh-CN"/>
-              </w:rPr>
-            </w:pPr>
-          </w:p>
-          <w:p>
-            <w:pPr>
-              <w:outlineLvl w:val="0"/>
-              <w:rPr>
-                <w:rFonts w:ascii="Times New Roman" w:eastAsiaTheme="minorEastAsia" w:hAnsi="Times New Roman"/>
-                <w:bCs/>
-                <w:sz w:val="22"/>
-                <w:szCs w:val="22"/>
-                <w:lang w:eastAsia="zh-CN"/>
-              </w:rPr>
-            </w:pPr>
-            <w:r>
-              <w:rPr>
-                <w:rFonts w:ascii="Times New Roman" w:eastAsiaTheme="minorEastAsia" w:hAnsi="Times New Roman"/>
-                <w:bCs/>
-                <w:sz w:val="22"/>
-                <w:szCs w:val="22"/>
-                <w:lang w:eastAsia="zh-CN"/>
-              </w:rPr>
-              <w:t>Once transferred into the ISO 5 BSC, the vials were placed on the disinfected working surface of the BSC E00{{</w:t>
-            </w:r>
-            <w:proofErr w:type="spellStart"/>
-            <w:r>
-              <w:rPr>
-                <w:rFonts w:ascii="Times New Roman" w:eastAsiaTheme="minorEastAsia" w:hAnsi="Times New Roman"/>
-                <w:bCs/>
-                <w:sz w:val="22"/>
-                <w:szCs w:val="22"/>
-                <w:lang w:eastAsia="zh-CN"/>
-              </w:rPr>
-              <w:t>bsc_id</w:t>
-            </w:r>
-            <w:proofErr w:type="spellEnd"/>
-            <w:r>
-              <w:rPr>
-                <w:rFonts w:ascii="Times New Roman" w:eastAsiaTheme="minorEastAsia" w:hAnsi="Times New Roman"/>
-                <w:bCs/>
-                <w:sz w:val="22"/>
-                <w:szCs w:val="22"/>
-                <w:lang w:eastAsia="zh-CN"/>
-              </w:rPr>
-              <w:t xml:space="preserve">}} and aseptically opened and tested in accordance with SOP 2.600.008 (USP / EP 2.6.1 Sterility Test). Following testing, the media bottles were subsequently transferred into designated incubators, E001356 and E001357, to initiate incubation. </w:t>
-            </w:r>
-          </w:p>
-          <w:p>
-            <w:pPr>
-              <w:outlineLvl w:val="0"/>
-              <w:rPr>
-                <w:rFonts w:ascii="Times New Roman" w:eastAsiaTheme="minorEastAsia" w:hAnsi="Times New Roman"/>
-                <w:bCs/>
-                <w:sz w:val="22"/>
-                <w:szCs w:val="22"/>
-                <w:lang w:eastAsia="zh-CN"/>
-              </w:rPr>
-            </w:pPr>
-          </w:p>
-          <w:p>
-            <w:pPr>
-              <w:outlineLvl w:val="0"/>
-              <w:rPr>
-                <w:rFonts w:ascii="Times New Roman" w:eastAsiaTheme="minorEastAsia" w:hAnsi="Times New Roman"/>
-                <w:bCs/>
-                <w:sz w:val="22"/>
-                <w:szCs w:val="22"/>
-                <w:lang w:eastAsia="zh-CN"/>
-              </w:rPr>
-            </w:pPr>
-            <w:r>
-              <w:rPr>
-                <w:rFonts w:ascii="Times New Roman" w:eastAsiaTheme="minorEastAsia" w:hAnsi="Times New Roman"/>
-                <w:bCs/>
-                <w:sz w:val="22"/>
-                <w:szCs w:val="22"/>
-                <w:lang w:eastAsia="zh-CN"/>
-              </w:rPr>
-              <w:t xml:space="preserve">On </w:t>
-            </w:r>
-            <w:proofErr w:type="gramStart"/>
-            <w:r>
-              <w:rPr>
-                <w:rFonts w:ascii="Times New Roman" w:eastAsiaTheme="minorEastAsia" w:hAnsi="Times New Roman"/>
-                <w:bCs/>
-                <w:sz w:val="22"/>
-                <w:szCs w:val="22"/>
-                <w:lang w:eastAsia="zh-CN"/>
-              </w:rPr>
-              <w:t xml:space="preserve">{{ </w:t>
-            </w:r>
-            <w:proofErr w:type="spellStart"/>
-            <w:r>
-              <w:rPr>
-                <w:rFonts w:ascii="Times New Roman" w:eastAsiaTheme="minorEastAsia" w:hAnsi="Times New Roman"/>
-                <w:bCs/>
-                <w:sz w:val="22"/>
-                <w:szCs w:val="22"/>
-                <w:lang w:eastAsia="zh-CN"/>
-              </w:rPr>
-              <w:t>test</w:t>
-            </w:r>
-            <w:proofErr w:type="gramEnd"/>
-            <w:r>
-              <w:rPr>
-                <w:rFonts w:ascii="Times New Roman" w:eastAsiaTheme="minorEastAsia" w:hAnsi="Times New Roman"/>
-                <w:bCs/>
-                <w:sz w:val="22"/>
-                <w:szCs w:val="22"/>
-                <w:lang w:eastAsia="zh-CN"/>
-              </w:rPr>
-              <w:t>_</w:t>
-            </w:r>
-            <w:proofErr w:type="gramStart"/>
-            <w:r>
-              <w:rPr>
-                <w:rFonts w:ascii="Times New Roman" w:eastAsiaTheme="minorEastAsia" w:hAnsi="Times New Roman"/>
-                <w:bCs/>
-                <w:sz w:val="22"/>
-                <w:szCs w:val="22"/>
-                <w:lang w:eastAsia="zh-CN"/>
-              </w:rPr>
-              <w:t>date</w:t>
-            </w:r>
-            <w:proofErr w:type="spellEnd"/>
-            <w:r>
-              <w:rPr>
-                <w:rFonts w:ascii="Times New Roman" w:eastAsiaTheme="minorEastAsia" w:hAnsi="Times New Roman"/>
-                <w:bCs/>
-                <w:sz w:val="22"/>
-                <w:szCs w:val="22"/>
-                <w:lang w:eastAsia="zh-CN"/>
-              </w:rPr>
-              <w:t xml:space="preserve"> }</w:t>
-            </w:r>
-            <w:proofErr w:type="gramEnd"/>
-            <w:r>
-              <w:rPr>
-                <w:rFonts w:ascii="Times New Roman" w:eastAsiaTheme="minorEastAsia" w:hAnsi="Times New Roman"/>
-                <w:bCs/>
-                <w:sz w:val="22"/>
-                <w:szCs w:val="22"/>
-                <w:lang w:eastAsia="zh-CN"/>
-              </w:rPr>
-              <w:t>} (Day {{</w:t>
-            </w:r>
-            <w:proofErr w:type="spellStart"/>
-            <w:r>
-              <w:rPr>
-                <w:rFonts w:ascii="Times New Roman" w:eastAsiaTheme="minorEastAsia" w:hAnsi="Times New Roman"/>
-                <w:bCs/>
-                <w:sz w:val="22"/>
-                <w:szCs w:val="22"/>
-                <w:lang w:eastAsia="zh-CN"/>
-              </w:rPr>
-              <w:t>incubation_time</w:t>
-            </w:r>
-            <w:proofErr w:type="spellEnd"/>
-            <w:r>
-              <w:rPr>
-                <w:rFonts w:ascii="Times New Roman" w:eastAsiaTheme="minorEastAsia" w:hAnsi="Times New Roman"/>
-                <w:bCs/>
-                <w:sz w:val="22"/>
-                <w:szCs w:val="22"/>
-                <w:lang w:eastAsia="zh-CN"/>
-              </w:rPr>
-              <w:t xml:space="preserve">}} of incubation), microbial growth was observed in </w:t>
-            </w:r>
-            <w:proofErr w:type="gramStart"/>
-            <w:r>
-              <w:rPr>
-                <w:rFonts w:ascii="Times New Roman" w:eastAsiaTheme="minorEastAsia" w:hAnsi="Times New Roman"/>
-                <w:bCs/>
-                <w:sz w:val="22"/>
-                <w:szCs w:val="22"/>
-                <w:lang w:eastAsia="zh-CN"/>
-              </w:rPr>
-              <w:t xml:space="preserve">{{ </w:t>
-            </w:r>
-            <w:proofErr w:type="spellStart"/>
-            <w:r>
-              <w:rPr>
-                <w:rFonts w:ascii="Times New Roman" w:eastAsiaTheme="minorEastAsia" w:hAnsi="Times New Roman"/>
-                <w:bCs/>
-                <w:sz w:val="22"/>
-                <w:szCs w:val="22"/>
-                <w:lang w:eastAsia="zh-CN"/>
-              </w:rPr>
-              <w:t>positive</w:t>
-            </w:r>
-            <w:proofErr w:type="gramEnd"/>
-            <w:r>
-              <w:rPr>
-                <w:rFonts w:ascii="Times New Roman" w:eastAsiaTheme="minorEastAsia" w:hAnsi="Times New Roman"/>
-                <w:bCs/>
-                <w:sz w:val="22"/>
-                <w:szCs w:val="22"/>
-                <w:lang w:eastAsia="zh-CN"/>
-              </w:rPr>
-              <w:t>_media</w:t>
-            </w:r>
-            <w:proofErr w:type="spellEnd"/>
-            <w:r>
-              <w:rPr>
-                <w:rFonts w:ascii="Times New Roman" w:eastAsiaTheme="minorEastAsia" w:hAnsi="Times New Roman"/>
-                <w:bCs/>
-                <w:sz w:val="22"/>
-                <w:szCs w:val="22"/>
-                <w:lang w:eastAsia="zh-CN"/>
-              </w:rPr>
-              <w:t xml:space="preserve">}} media bottle by analyst </w:t>
-            </w:r>
-            <w:proofErr w:type="gramStart"/>
-            <w:r>
-              <w:rPr>
-                <w:rFonts w:ascii="Times New Roman" w:eastAsiaTheme="minorEastAsia" w:hAnsi="Times New Roman"/>
-                <w:bCs/>
-                <w:sz w:val="22"/>
-                <w:szCs w:val="22"/>
-                <w:lang w:eastAsia="zh-CN"/>
-              </w:rPr>
-              <w:t xml:space="preserve">{{ </w:t>
-            </w:r>
-            <w:proofErr w:type="spellStart"/>
-            <w:r>
-              <w:rPr>
-                <w:rFonts w:ascii="Times New Roman" w:eastAsiaTheme="minorEastAsia" w:hAnsi="Times New Roman"/>
-                <w:bCs/>
-                <w:sz w:val="22"/>
-                <w:szCs w:val="22"/>
-                <w:lang w:eastAsia="zh-CN"/>
-              </w:rPr>
-              <w:t>reading</w:t>
-            </w:r>
-            <w:proofErr w:type="gramEnd"/>
-            <w:r>
-              <w:rPr>
-                <w:rFonts w:ascii="Times New Roman" w:eastAsiaTheme="minorEastAsia" w:hAnsi="Times New Roman"/>
-                <w:bCs/>
-                <w:sz w:val="22"/>
-                <w:szCs w:val="22"/>
-                <w:lang w:eastAsia="zh-CN"/>
-              </w:rPr>
-              <w:t>_</w:t>
-            </w:r>
-            <w:proofErr w:type="gramStart"/>
-            <w:r>
-              <w:rPr>
-                <w:rFonts w:ascii="Times New Roman" w:eastAsiaTheme="minorEastAsia" w:hAnsi="Times New Roman"/>
-                <w:bCs/>
-                <w:sz w:val="22"/>
-                <w:szCs w:val="22"/>
-                <w:lang w:eastAsia="zh-CN"/>
-              </w:rPr>
-              <w:t>name</w:t>
-            </w:r>
-            <w:proofErr w:type="spellEnd"/>
-            <w:r>
-              <w:rPr>
-                <w:rFonts w:ascii="Times New Roman" w:eastAsiaTheme="minorEastAsia" w:hAnsi="Times New Roman"/>
-                <w:bCs/>
-                <w:sz w:val="22"/>
-                <w:szCs w:val="22"/>
-                <w:lang w:eastAsia="zh-CN"/>
-              </w:rPr>
-              <w:t xml:space="preserve"> }</w:t>
-            </w:r>
-            <w:proofErr w:type="gramEnd"/>
-            <w:r>
-              <w:rPr>
-                <w:rFonts w:ascii="Times New Roman" w:eastAsiaTheme="minorEastAsia" w:hAnsi="Times New Roman"/>
-                <w:bCs/>
-                <w:sz w:val="22"/>
-                <w:szCs w:val="22"/>
-                <w:lang w:eastAsia="zh-CN"/>
-              </w:rPr>
-              <w:t xml:space="preserve">} and confirmed by Microbiology Lab Supervisor Robin Seymour. The organism was identified as </w:t>
-            </w:r>
-            <w:proofErr w:type="gramStart"/>
-            <w:r>
-              <w:rPr>
-                <w:rFonts w:ascii="Times New Roman" w:eastAsiaTheme="minorEastAsia" w:hAnsi="Times New Roman"/>
-                <w:bCs/>
-                <w:sz w:val="22"/>
-                <w:szCs w:val="22"/>
-                <w:lang w:eastAsia="zh-CN"/>
-              </w:rPr>
-              <w:t xml:space="preserve">{{ </w:t>
-            </w:r>
-            <w:proofErr w:type="spellStart"/>
-            <w:r>
-              <w:rPr>
-                <w:rFonts w:ascii="Times New Roman" w:eastAsiaTheme="minorEastAsia" w:hAnsi="Times New Roman"/>
-                <w:bCs/>
-                <w:sz w:val="22"/>
-                <w:szCs w:val="22"/>
-                <w:lang w:eastAsia="zh-CN"/>
-              </w:rPr>
-              <w:t>positive</w:t>
-            </w:r>
-            <w:proofErr w:type="gramEnd"/>
-            <w:r>
-              <w:rPr>
-                <w:rFonts w:ascii="Times New Roman" w:eastAsiaTheme="minorEastAsia" w:hAnsi="Times New Roman"/>
-                <w:bCs/>
-                <w:sz w:val="22"/>
-                <w:szCs w:val="22"/>
-                <w:lang w:eastAsia="zh-CN"/>
-              </w:rPr>
-              <w:t>_</w:t>
-            </w:r>
-            <w:proofErr w:type="gramStart"/>
-            <w:r>
-              <w:rPr>
-                <w:rFonts w:ascii="Times New Roman" w:eastAsiaTheme="minorEastAsia" w:hAnsi="Times New Roman"/>
-                <w:bCs/>
-                <w:sz w:val="22"/>
-                <w:szCs w:val="22"/>
-                <w:lang w:eastAsia="zh-CN"/>
-              </w:rPr>
-              <w:t>org</w:t>
-            </w:r>
-            <w:proofErr w:type="spellEnd"/>
-            <w:r>
-              <w:rPr>
-                <w:rFonts w:ascii="Times New Roman" w:eastAsiaTheme="minorEastAsia" w:hAnsi="Times New Roman"/>
-                <w:bCs/>
-                <w:sz w:val="22"/>
-                <w:szCs w:val="22"/>
-                <w:lang w:eastAsia="zh-CN"/>
-              </w:rPr>
-              <w:t xml:space="preserve"> }</w:t>
-            </w:r>
-            <w:proofErr w:type="gramEnd"/>
-            <w:r>
-              <w:rPr>
-                <w:rFonts w:ascii="Times New Roman" w:eastAsiaTheme="minorEastAsia" w:hAnsi="Times New Roman"/>
-                <w:bCs/>
-                <w:sz w:val="22"/>
-                <w:szCs w:val="22"/>
-                <w:lang w:eastAsia="zh-CN"/>
-              </w:rPr>
-              <w:t>} (see Table 1).</w:t>
-            </w:r>
-          </w:p>
-          <w:p>
-            <w:pPr>
-              <w:outlineLvl w:val="0"/>
-              <w:rPr>
-                <w:rFonts w:ascii="Times New Roman" w:eastAsiaTheme="minorEastAsia" w:hAnsi="Times New Roman"/>
-                <w:bCs/>
-                <w:sz w:val="22"/>
-                <w:szCs w:val="22"/>
-                <w:lang w:eastAsia="zh-CN"/>
-              </w:rPr>
-            </w:pPr>
-            <w:r>
-              <w:rPr>
-                <w:rFonts w:ascii="Times New Roman" w:eastAsiaTheme="minorEastAsia" w:hAnsi="Times New Roman"/>
-                <w:bCs/>
-                <w:sz w:val="22"/>
-                <w:szCs w:val="22"/>
-                <w:lang w:eastAsia="zh-CN"/>
-              </w:rPr>
-              <w:t xml:space="preserve"> </w:t>
-            </w:r>
-          </w:p>
-          <w:p>
-            <w:pPr>
-              <w:outlineLvl w:val="0"/>
-              <w:rPr>
-                <w:rFonts w:ascii="Times New Roman" w:eastAsiaTheme="minorEastAsia" w:hAnsi="Times New Roman"/>
-                <w:bCs/>
-                <w:sz w:val="22"/>
-                <w:szCs w:val="22"/>
-                <w:lang w:eastAsia="zh-CN"/>
-              </w:rPr>
-            </w:pPr>
-            <w:r>
-              <w:rPr>
-                <w:rFonts w:ascii="Times New Roman" w:eastAsiaTheme="minorEastAsia" w:hAnsi="Times New Roman"/>
-                <w:bCs/>
-                <w:sz w:val="22"/>
-                <w:szCs w:val="22"/>
-                <w:lang w:eastAsia="zh-CN"/>
-              </w:rPr>
-              <w:t>The culture media used were within expiry. Negative control media bottles were processed and incubated under identical conditions and showed no microbial growth, confirming the integrity of the test procedure.</w:t>
-            </w:r>
-          </w:p>
-          <w:p>
-            <w:pPr>
-              <w:outlineLvl w:val="0"/>
-              <w:rPr>
-                <w:rFonts w:ascii="Times New Roman" w:eastAsiaTheme="minorEastAsia" w:hAnsi="Times New Roman"/>
-                <w:bCs/>
-                <w:sz w:val="22"/>
-                <w:szCs w:val="22"/>
-                <w:lang w:eastAsia="zh-CN"/>
-              </w:rPr>
-            </w:pPr>
-          </w:p>
-          <w:p>
-            <w:pPr>
-              <w:outlineLvl w:val="0"/>
-              <w:rPr>
-                <w:rFonts w:ascii="Times New Roman" w:eastAsiaTheme="minorEastAsia" w:hAnsi="Times New Roman"/>
-                <w:bCs/>
-                <w:sz w:val="22"/>
-                <w:szCs w:val="22"/>
-                <w:lang w:eastAsia="zh-CN"/>
-              </w:rPr>
-            </w:pPr>
-            <w:proofErr w:type="gramStart"/>
-            <w:r>
-              <w:rPr>
-                <w:rFonts w:ascii="Times New Roman" w:eastAsiaTheme="minorEastAsia" w:hAnsi="Times New Roman"/>
-                <w:bCs/>
-                <w:sz w:val="22"/>
-                <w:szCs w:val="22"/>
-                <w:lang w:eastAsia="zh-CN"/>
-              </w:rPr>
-              <w:t xml:space="preserve">{{ </w:t>
-            </w:r>
-            <w:proofErr w:type="spellStart"/>
-            <w:r>
-              <w:rPr>
-                <w:rFonts w:ascii="Times New Roman" w:eastAsiaTheme="minorEastAsia" w:hAnsi="Times New Roman"/>
-                <w:bCs/>
-                <w:sz w:val="22"/>
-                <w:szCs w:val="22"/>
-                <w:lang w:eastAsia="zh-CN"/>
-              </w:rPr>
-              <w:t>narrative</w:t>
-            </w:r>
-            <w:proofErr w:type="gramEnd"/>
-            <w:r>
-              <w:rPr>
-                <w:rFonts w:ascii="Times New Roman" w:eastAsiaTheme="minorEastAsia" w:hAnsi="Times New Roman"/>
-                <w:bCs/>
-                <w:sz w:val="22"/>
-                <w:szCs w:val="22"/>
-                <w:lang w:eastAsia="zh-CN"/>
-              </w:rPr>
-              <w:t>_</w:t>
-            </w:r>
-            <w:proofErr w:type="gramStart"/>
-            <w:r>
-              <w:rPr>
-                <w:rFonts w:ascii="Times New Roman" w:eastAsiaTheme="minorEastAsia" w:hAnsi="Times New Roman"/>
-                <w:bCs/>
-                <w:sz w:val="22"/>
-                <w:szCs w:val="22"/>
-                <w:lang w:eastAsia="zh-CN"/>
-              </w:rPr>
-              <w:t>summary</w:t>
-            </w:r>
-            <w:proofErr w:type="spellEnd"/>
-            <w:r>
-              <w:rPr>
-                <w:rFonts w:ascii="Times New Roman" w:eastAsiaTheme="minorEastAsia" w:hAnsi="Times New Roman"/>
-                <w:bCs/>
-                <w:sz w:val="22"/>
-                <w:szCs w:val="22"/>
-                <w:lang w:eastAsia="zh-CN"/>
-              </w:rPr>
-              <w:t xml:space="preserve"> }</w:t>
-            </w:r>
-            <w:proofErr w:type="gramEnd"/>
-            <w:r>
-              <w:rPr>
-                <w:rFonts w:ascii="Times New Roman" w:eastAsiaTheme="minorEastAsia" w:hAnsi="Times New Roman"/>
-                <w:bCs/>
-                <w:sz w:val="22"/>
-                <w:szCs w:val="22"/>
-                <w:lang w:eastAsia="zh-CN"/>
-              </w:rPr>
-              <w:t xml:space="preserve">} </w:t>
-            </w:r>
-          </w:p>
-          <w:p>
-            <w:pPr>
-              <w:outlineLvl w:val="0"/>
-              <w:rPr>
-                <w:rFonts w:ascii="Times New Roman" w:eastAsiaTheme="minorEastAsia" w:hAnsi="Times New Roman"/>
-                <w:bCs/>
-                <w:sz w:val="22"/>
-                <w:szCs w:val="22"/>
-                <w:lang w:eastAsia="zh-CN"/>
-              </w:rPr>
-            </w:pPr>
-          </w:p>
-          <w:p>
-            <w:pPr>
-              <w:outlineLvl w:val="0"/>
-              <w:rPr>
-                <w:rFonts w:ascii="Times New Roman" w:eastAsiaTheme="minorEastAsia" w:hAnsi="Times New Roman"/>
-                <w:bCs/>
-                <w:sz w:val="22"/>
-                <w:szCs w:val="22"/>
-                <w:lang w:eastAsia="zh-CN"/>
-              </w:rPr>
-            </w:pPr>
-            <w:r>
-              <w:rPr>
-                <w:rFonts w:ascii="Times New Roman" w:eastAsiaTheme="minorEastAsia" w:hAnsi="Times New Roman"/>
-                <w:bCs/>
-                <w:sz w:val="22"/>
-                <w:szCs w:val="22"/>
-                <w:lang w:eastAsia="zh-CN"/>
-              </w:rPr>
-              <w:t xml:space="preserve">The analysts confirmed full compliance with cleaning procedures as outlined in SOPs 2.600.018 (Cleaning and Disinfecting Procedure for Microbiology) and 2.600.008 (USP &lt;71&gt; / EP 2.6.1 Sterility Test). </w:t>
-            </w:r>
-          </w:p>
-          <w:p>
-            <w:pPr>
-              <w:outlineLvl w:val="0"/>
-              <w:rPr>
-                <w:rFonts w:ascii="Times New Roman" w:eastAsiaTheme="minorEastAsia" w:hAnsi="Times New Roman"/>
-                <w:bCs/>
-                <w:sz w:val="22"/>
-                <w:szCs w:val="22"/>
-                <w:lang w:eastAsia="zh-CN"/>
-              </w:rPr>
-            </w:pPr>
-          </w:p>
-          <w:p>
-            <w:pPr>
-              <w:outlineLvl w:val="0"/>
-              <w:rPr>
-                <w:rFonts w:ascii="Times New Roman" w:eastAsiaTheme="minorEastAsia" w:hAnsi="Times New Roman"/>
-                <w:bCs/>
-                <w:sz w:val="22"/>
-                <w:szCs w:val="22"/>
-                <w:lang w:eastAsia="zh-CN"/>
-              </w:rPr>
-            </w:pPr>
-            <w:r>
-              <w:rPr>
-                <w:rFonts w:ascii="Times New Roman" w:eastAsiaTheme="minorEastAsia" w:hAnsi="Times New Roman"/>
-                <w:bCs/>
-                <w:sz w:val="22"/>
-                <w:szCs w:val="22"/>
-                <w:lang w:eastAsia="zh-CN"/>
-              </w:rPr>
-              <w:t xml:space="preserve">Monthly cleaning and disinfection of the outermost ISO 8 Anteroom, the middle ISO 7 Buffer room, the innermost ISO 7 cleanroom, and its containing ISO 5 Biosafety Cabinets for CR </w:t>
-            </w:r>
-            <w:proofErr w:type="gramStart"/>
-            <w:r>
-              <w:rPr>
-                <w:rFonts w:ascii="Times New Roman" w:eastAsiaTheme="minorEastAsia" w:hAnsi="Times New Roman"/>
-                <w:bCs/>
-                <w:sz w:val="22"/>
-                <w:szCs w:val="22"/>
-                <w:lang w:eastAsia="zh-CN"/>
-              </w:rPr>
-              <w:t xml:space="preserve">{{ </w:t>
-            </w:r>
-            <w:proofErr w:type="spellStart"/>
-            <w:r>
-              <w:rPr>
-                <w:rFonts w:ascii="Times New Roman" w:eastAsiaTheme="minorEastAsia" w:hAnsi="Times New Roman"/>
-                <w:bCs/>
-                <w:sz w:val="22"/>
-                <w:szCs w:val="22"/>
-                <w:lang w:eastAsia="zh-CN"/>
-              </w:rPr>
-              <w:t>cr</w:t>
-            </w:r>
-            <w:proofErr w:type="gramEnd"/>
-            <w:r>
-              <w:rPr>
-                <w:rFonts w:ascii="Times New Roman" w:eastAsiaTheme="minorEastAsia" w:hAnsi="Times New Roman"/>
-                <w:bCs/>
-                <w:sz w:val="22"/>
-                <w:szCs w:val="22"/>
-                <w:lang w:eastAsia="zh-CN"/>
-              </w:rPr>
-              <w:t>_</w:t>
-            </w:r>
-            <w:proofErr w:type="gramStart"/>
-            <w:r>
-              <w:rPr>
-                <w:rFonts w:ascii="Times New Roman" w:eastAsiaTheme="minorEastAsia" w:hAnsi="Times New Roman"/>
-                <w:bCs/>
-                <w:sz w:val="22"/>
-                <w:szCs w:val="22"/>
-                <w:lang w:eastAsia="zh-CN"/>
-              </w:rPr>
-              <w:t>suit</w:t>
-            </w:r>
-            <w:proofErr w:type="spellEnd"/>
-            <w:r>
-              <w:rPr>
-                <w:rFonts w:ascii="Times New Roman" w:eastAsiaTheme="minorEastAsia" w:hAnsi="Times New Roman"/>
-                <w:bCs/>
-                <w:sz w:val="22"/>
-                <w:szCs w:val="22"/>
-                <w:lang w:eastAsia="zh-CN"/>
-              </w:rPr>
-              <w:t xml:space="preserve"> }</w:t>
-            </w:r>
-            <w:proofErr w:type="gramEnd"/>
-            <w:r>
-              <w:rPr>
-                <w:rFonts w:ascii="Times New Roman" w:eastAsiaTheme="minorEastAsia" w:hAnsi="Times New Roman"/>
-                <w:bCs/>
-                <w:sz w:val="22"/>
-                <w:szCs w:val="22"/>
-                <w:lang w:eastAsia="zh-CN"/>
-              </w:rPr>
-              <w:t xml:space="preserve">} was performed on </w:t>
-            </w:r>
-            <w:proofErr w:type="gramStart"/>
-            <w:r>
-              <w:rPr>
-                <w:rFonts w:ascii="Times New Roman" w:eastAsiaTheme="minorEastAsia" w:hAnsi="Times New Roman"/>
-                <w:bCs/>
-                <w:sz w:val="22"/>
-                <w:szCs w:val="22"/>
-                <w:lang w:eastAsia="zh-CN"/>
-              </w:rPr>
-              <w:t xml:space="preserve">{{ </w:t>
-            </w:r>
-            <w:proofErr w:type="spellStart"/>
-            <w:r>
-              <w:rPr>
-                <w:rFonts w:ascii="Times New Roman" w:eastAsiaTheme="minorEastAsia" w:hAnsi="Times New Roman"/>
-                <w:bCs/>
-                <w:sz w:val="22"/>
-                <w:szCs w:val="22"/>
-                <w:lang w:eastAsia="zh-CN"/>
-              </w:rPr>
-              <w:t>monthly</w:t>
-            </w:r>
-            <w:proofErr w:type="gramEnd"/>
-            <w:r>
-              <w:rPr>
-                <w:rFonts w:ascii="Times New Roman" w:eastAsiaTheme="minorEastAsia" w:hAnsi="Times New Roman"/>
-                <w:bCs/>
-                <w:sz w:val="22"/>
-                <w:szCs w:val="22"/>
-                <w:lang w:eastAsia="zh-CN"/>
-              </w:rPr>
-              <w:t>_cleaning_</w:t>
-            </w:r>
-            <w:proofErr w:type="gramStart"/>
-            <w:r>
-              <w:rPr>
-                <w:rFonts w:ascii="Times New Roman" w:eastAsiaTheme="minorEastAsia" w:hAnsi="Times New Roman"/>
-                <w:bCs/>
-                <w:sz w:val="22"/>
-                <w:szCs w:val="22"/>
-                <w:lang w:eastAsia="zh-CN"/>
-              </w:rPr>
-              <w:t>date</w:t>
-            </w:r>
-            <w:proofErr w:type="spellEnd"/>
-            <w:r>
-              <w:rPr>
-                <w:rFonts w:ascii="Times New Roman" w:eastAsiaTheme="minorEastAsia" w:hAnsi="Times New Roman"/>
-                <w:bCs/>
-                <w:sz w:val="22"/>
-                <w:szCs w:val="22"/>
-                <w:lang w:eastAsia="zh-CN"/>
-              </w:rPr>
-              <w:t xml:space="preserve"> }</w:t>
-            </w:r>
-            <w:proofErr w:type="gramEnd"/>
-            <w:r>
-              <w:rPr>
-                <w:rFonts w:ascii="Times New Roman" w:eastAsiaTheme="minorEastAsia" w:hAnsi="Times New Roman"/>
-                <w:bCs/>
-                <w:sz w:val="22"/>
-                <w:szCs w:val="22"/>
-                <w:lang w:eastAsia="zh-CN"/>
-              </w:rPr>
-              <w:t xml:space="preserve">}, as per SOP 2.600.018 (Cleaning and Disinfecting Procedure for Microbiology) During </w:t>
-            </w:r>
-            <w:r>
-              <w:rPr>
-                <w:rFonts w:ascii="Times New Roman" w:eastAsiaTheme="minorEastAsia" w:hAnsi="Times New Roman"/>
-                <w:bCs/>
-                <w:sz w:val="22"/>
-                <w:szCs w:val="22"/>
-                <w:lang w:eastAsia="zh-CN"/>
-              </w:rPr>
-              <w:lastRenderedPageBreak/>
-              <w:t xml:space="preserve">both cleaning cycles, it was documented that all H₂O₂ indicators passed. This confirms the efficient monthly cleaning of all three parts of Cleanrooms </w:t>
-            </w:r>
-            <w:proofErr w:type="gramStart"/>
-            <w:r>
-              <w:rPr>
-                <w:rFonts w:ascii="Times New Roman" w:eastAsiaTheme="minorEastAsia" w:hAnsi="Times New Roman"/>
-                <w:bCs/>
-                <w:sz w:val="22"/>
-                <w:szCs w:val="22"/>
-                <w:lang w:eastAsia="zh-CN"/>
-              </w:rPr>
-              <w:t xml:space="preserve">{{ </w:t>
-            </w:r>
-            <w:proofErr w:type="spellStart"/>
-            <w:r>
-              <w:rPr>
-                <w:rFonts w:ascii="Times New Roman" w:eastAsiaTheme="minorEastAsia" w:hAnsi="Times New Roman"/>
-                <w:bCs/>
-                <w:sz w:val="22"/>
-                <w:szCs w:val="22"/>
-                <w:lang w:eastAsia="zh-CN"/>
-              </w:rPr>
-              <w:t>cr</w:t>
-            </w:r>
-            <w:proofErr w:type="gramEnd"/>
-            <w:r>
-              <w:rPr>
-                <w:rFonts w:ascii="Times New Roman" w:eastAsiaTheme="minorEastAsia" w:hAnsi="Times New Roman"/>
-                <w:bCs/>
-                <w:sz w:val="22"/>
-                <w:szCs w:val="22"/>
-                <w:lang w:eastAsia="zh-CN"/>
-              </w:rPr>
-              <w:t>_</w:t>
-            </w:r>
-            <w:proofErr w:type="gramStart"/>
-            <w:r>
-              <w:rPr>
-                <w:rFonts w:ascii="Times New Roman" w:eastAsiaTheme="minorEastAsia" w:hAnsi="Times New Roman"/>
-                <w:bCs/>
-                <w:sz w:val="22"/>
-                <w:szCs w:val="22"/>
-                <w:lang w:eastAsia="zh-CN"/>
-              </w:rPr>
-              <w:t>suit</w:t>
-            </w:r>
-            <w:proofErr w:type="spellEnd"/>
-            <w:r>
-              <w:rPr>
-                <w:rFonts w:ascii="Times New Roman" w:eastAsiaTheme="minorEastAsia" w:hAnsi="Times New Roman"/>
-                <w:bCs/>
-                <w:sz w:val="22"/>
-                <w:szCs w:val="22"/>
-                <w:lang w:eastAsia="zh-CN"/>
-              </w:rPr>
-              <w:t xml:space="preserve"> }</w:t>
-            </w:r>
-            <w:proofErr w:type="gramEnd"/>
-            <w:r>
-              <w:rPr>
-                <w:rFonts w:ascii="Times New Roman" w:eastAsiaTheme="minorEastAsia" w:hAnsi="Times New Roman"/>
-                <w:bCs/>
-                <w:sz w:val="22"/>
-                <w:szCs w:val="22"/>
-                <w:lang w:eastAsia="zh-CN"/>
-              </w:rPr>
-              <w:t xml:space="preserve">}. </w:t>
-            </w:r>
-          </w:p>
-          <w:p>
-            <w:pPr>
-              <w:outlineLvl w:val="0"/>
-              <w:rPr>
-                <w:rFonts w:ascii="Times New Roman" w:eastAsiaTheme="minorEastAsia" w:hAnsi="Times New Roman"/>
-                <w:bCs/>
-                <w:sz w:val="22"/>
-                <w:szCs w:val="22"/>
-                <w:lang w:eastAsia="zh-CN"/>
-              </w:rPr>
-            </w:pPr>
-          </w:p>
-          <w:p>
-            <w:pPr>
-              <w:outlineLvl w:val="0"/>
-              <w:rPr>
-                <w:rFonts w:ascii="Times New Roman" w:eastAsiaTheme="minorEastAsia" w:hAnsi="Times New Roman"/>
-                <w:bCs/>
-                <w:sz w:val="22"/>
-                <w:szCs w:val="22"/>
-                <w:lang w:eastAsia="zh-CN"/>
-              </w:rPr>
-            </w:pPr>
-            <w:proofErr w:type="gramStart"/>
-            <w:r>
-              <w:rPr>
-                <w:rFonts w:ascii="Times New Roman" w:eastAsiaTheme="minorEastAsia" w:hAnsi="Times New Roman"/>
-                <w:bCs/>
-                <w:sz w:val="22"/>
-                <w:szCs w:val="22"/>
-                <w:lang w:eastAsia="zh-CN"/>
-              </w:rPr>
-              <w:t xml:space="preserve">{{ </w:t>
-            </w:r>
-            <w:proofErr w:type="spellStart"/>
-            <w:r>
-              <w:rPr>
-                <w:rFonts w:ascii="Times New Roman" w:eastAsiaTheme="minorEastAsia" w:hAnsi="Times New Roman"/>
-                <w:bCs/>
-                <w:sz w:val="22"/>
-                <w:szCs w:val="22"/>
-                <w:lang w:eastAsia="zh-CN"/>
-              </w:rPr>
-              <w:t>sample</w:t>
-            </w:r>
-            <w:proofErr w:type="gramEnd"/>
-            <w:r>
-              <w:rPr>
-                <w:rFonts w:ascii="Times New Roman" w:eastAsiaTheme="minorEastAsia" w:hAnsi="Times New Roman"/>
-                <w:bCs/>
-                <w:sz w:val="22"/>
-                <w:szCs w:val="22"/>
-                <w:lang w:eastAsia="zh-CN"/>
-              </w:rPr>
-              <w:t>_history_</w:t>
-            </w:r>
-            <w:proofErr w:type="gramStart"/>
-            <w:r>
-              <w:rPr>
-                <w:rFonts w:ascii="Times New Roman" w:eastAsiaTheme="minorEastAsia" w:hAnsi="Times New Roman"/>
-                <w:bCs/>
-                <w:sz w:val="22"/>
-                <w:szCs w:val="22"/>
-                <w:lang w:eastAsia="zh-CN"/>
-              </w:rPr>
-              <w:t>paragraph</w:t>
-            </w:r>
-            <w:proofErr w:type="spellEnd"/>
-            <w:r>
-              <w:rPr>
-                <w:rFonts w:ascii="Times New Roman" w:eastAsiaTheme="minorEastAsia" w:hAnsi="Times New Roman"/>
-                <w:bCs/>
-                <w:sz w:val="22"/>
-                <w:szCs w:val="22"/>
-                <w:lang w:eastAsia="zh-CN"/>
-              </w:rPr>
-              <w:t xml:space="preserve"> }</w:t>
-            </w:r>
-            <w:proofErr w:type="gramEnd"/>
-            <w:r>
-              <w:rPr>
-                <w:rFonts w:ascii="Times New Roman" w:eastAsiaTheme="minorEastAsia" w:hAnsi="Times New Roman"/>
-                <w:bCs/>
-                <w:sz w:val="22"/>
-                <w:szCs w:val="22"/>
-                <w:lang w:eastAsia="zh-CN"/>
-              </w:rPr>
-              <w:t>}</w:t>
-            </w:r>
-          </w:p>
-          <w:p>
-            <w:pPr>
-              <w:outlineLvl w:val="0"/>
-              <w:rPr>
-                <w:rFonts w:ascii="Times New Roman" w:eastAsiaTheme="minorEastAsia" w:hAnsi="Times New Roman"/>
-                <w:bCs/>
-                <w:sz w:val="22"/>
-                <w:szCs w:val="22"/>
-                <w:lang w:eastAsia="zh-CN"/>
-              </w:rPr>
-            </w:pPr>
-          </w:p>
-          <w:p>
-            <w:pPr>
-              <w:outlineLvl w:val="0"/>
-              <w:rPr>
-                <w:rFonts w:ascii="Times New Roman" w:eastAsiaTheme="minorEastAsia" w:hAnsi="Times New Roman"/>
-                <w:bCs/>
-                <w:sz w:val="22"/>
-                <w:szCs w:val="22"/>
-                <w:lang w:eastAsia="zh-CN"/>
-              </w:rPr>
-            </w:pPr>
-            <w:r>
-              <w:rPr>
-                <w:rFonts w:ascii="Times New Roman" w:eastAsiaTheme="minorEastAsia" w:hAnsi="Times New Roman"/>
-                <w:bCs/>
-                <w:sz w:val="22"/>
-                <w:szCs w:val="22"/>
-                <w:lang w:eastAsia="zh-CN"/>
-              </w:rPr>
-              <w:t xml:space="preserve">To assess the potential for sample-to-sample contamination contributing to the positive results, a comprehensive review was conducted of all samples processed on the same day. </w:t>
-            </w:r>
-            <w:proofErr w:type="gramStart"/>
-            <w:r>
-              <w:rPr>
-                <w:rFonts w:ascii="Times New Roman" w:eastAsiaTheme="minorEastAsia" w:hAnsi="Times New Roman"/>
-                <w:bCs/>
-                <w:sz w:val="22"/>
-                <w:szCs w:val="22"/>
-                <w:lang w:eastAsia="zh-CN"/>
-              </w:rPr>
-              <w:t xml:space="preserve">{{ </w:t>
-            </w:r>
-            <w:proofErr w:type="spellStart"/>
-            <w:r>
-              <w:rPr>
-                <w:rFonts w:ascii="Times New Roman" w:eastAsiaTheme="minorEastAsia" w:hAnsi="Times New Roman"/>
-                <w:bCs/>
-                <w:sz w:val="22"/>
-                <w:szCs w:val="22"/>
-                <w:lang w:eastAsia="zh-CN"/>
-              </w:rPr>
-              <w:t>cross</w:t>
-            </w:r>
-            <w:proofErr w:type="gramEnd"/>
-            <w:r>
-              <w:rPr>
-                <w:rFonts w:ascii="Times New Roman" w:eastAsiaTheme="minorEastAsia" w:hAnsi="Times New Roman"/>
-                <w:bCs/>
-                <w:sz w:val="22"/>
-                <w:szCs w:val="22"/>
-                <w:lang w:eastAsia="zh-CN"/>
-              </w:rPr>
-              <w:t>_contamination_</w:t>
-            </w:r>
-            <w:proofErr w:type="gramStart"/>
-            <w:r>
-              <w:rPr>
-                <w:rFonts w:ascii="Times New Roman" w:eastAsiaTheme="minorEastAsia" w:hAnsi="Times New Roman"/>
-                <w:bCs/>
-                <w:sz w:val="22"/>
-                <w:szCs w:val="22"/>
-                <w:lang w:eastAsia="zh-CN"/>
-              </w:rPr>
-              <w:t>summary</w:t>
-            </w:r>
-            <w:proofErr w:type="spellEnd"/>
-            <w:r>
-              <w:rPr>
-                <w:rFonts w:ascii="Times New Roman" w:eastAsiaTheme="minorEastAsia" w:hAnsi="Times New Roman"/>
-                <w:bCs/>
-                <w:sz w:val="22"/>
-                <w:szCs w:val="22"/>
-                <w:lang w:eastAsia="zh-CN"/>
-              </w:rPr>
-              <w:t xml:space="preserve"> }</w:t>
-            </w:r>
-            <w:proofErr w:type="gramEnd"/>
-            <w:r>
-              <w:rPr>
-                <w:rFonts w:ascii="Times New Roman" w:eastAsiaTheme="minorEastAsia" w:hAnsi="Times New Roman"/>
-                <w:bCs/>
-                <w:sz w:val="22"/>
-                <w:szCs w:val="22"/>
-                <w:lang w:eastAsia="zh-CN"/>
-              </w:rPr>
-              <w:t>}</w:t>
+              <w:t>To assess the potential for sample-to-sample contamination contributing to the positive results, a comprehensive review was conducted of all samples processed on the same day. {{ cross_contamination_summary }}</w:t>
             </w:r>
           </w:p>
           <w:p>
@@ -15183,16 +12649,7 @@
               <w:b/>
               <w:sz w:val="24"/>
             </w:rPr>
-            <w:t>3.</w:t>
-          </w:r>
-          <w:proofErr w:type="gramStart"/>
-          <w:r>
-            <w:rPr>
-              <w:rFonts w:ascii="Times New Roman" w:hAnsi="Times New Roman"/>
-              <w:b/>
-              <w:sz w:val="24"/>
-            </w:rPr>
-            <w:t>100.</w:t>
+            <w:t>3.100.</w:t>
           </w:r>
           <w:r>
             <w:rPr>
@@ -15210,7 +12667,6 @@
             </w:rPr>
             <w:t>19.F</w:t>
           </w:r>
-          <w:proofErr w:type="gramEnd"/>
           <w:r>
             <w:rPr>
               <w:rFonts w:ascii="Times New Roman" w:hAnsi="Times New Roman"/>
@@ -15579,7 +13035,6 @@
       </w:rPr>
       <w:t xml:space="preserve"> OOS Number: OOS</w:t>
     </w:r>
-    <w:proofErr w:type="gramStart"/>
     <w:r>
       <w:rPr>
         <w:rFonts w:ascii="Times New Roman" w:hAnsi="Times New Roman"/>
@@ -15598,62 +13053,7 @@
         <w:sz w:val="22"/>
         <w:szCs w:val="22"/>
       </w:rPr>
-      <w:t xml:space="preserve">{{ </w:t>
-    </w:r>
-    <w:proofErr w:type="spellStart"/>
-    <w:r>
-      <w:rPr>
-        <w:rFonts w:ascii="Times New Roman" w:hAnsi="Times New Roman"/>
-        <w:b/>
-        <w:bCs/>
-        <w:sz w:val="22"/>
-        <w:szCs w:val="22"/>
-      </w:rPr>
-      <w:t>oos</w:t>
-    </w:r>
-    <w:proofErr w:type="gramEnd"/>
-    <w:r>
-      <w:rPr>
-        <w:rFonts w:ascii="Times New Roman" w:hAnsi="Times New Roman"/>
-        <w:b/>
-        <w:bCs/>
-        <w:sz w:val="22"/>
-        <w:szCs w:val="22"/>
-      </w:rPr>
-      <w:t>_</w:t>
-    </w:r>
-    <w:proofErr w:type="gramStart"/>
-    <w:r>
-      <w:rPr>
-        <w:rFonts w:ascii="Times New Roman" w:hAnsi="Times New Roman"/>
-        <w:b/>
-        <w:bCs/>
-        <w:sz w:val="22"/>
-        <w:szCs w:val="22"/>
-      </w:rPr>
-      <w:t>id</w:t>
-    </w:r>
-    <w:proofErr w:type="spellEnd"/>
-    <w:r>
-      <w:rPr>
-        <w:rFonts w:ascii="Times New Roman" w:hAnsi="Times New Roman"/>
-        <w:b/>
-        <w:bCs/>
-        <w:sz w:val="22"/>
-        <w:szCs w:val="22"/>
-      </w:rPr>
-      <w:t xml:space="preserve"> }</w:t>
-    </w:r>
-    <w:proofErr w:type="gramEnd"/>
-    <w:r>
-      <w:rPr>
-        <w:rFonts w:ascii="Times New Roman" w:hAnsi="Times New Roman"/>
-        <w:b/>
-        <w:bCs/>
-        <w:sz w:val="22"/>
-        <w:szCs w:val="22"/>
-      </w:rPr>
-      <w:t>}</w:t>
+      <w:t>{{ oos_id }}</w:t>
     </w:r>
   </w:p>
 </w:hdr>
@@ -17916,7 +15316,9 @@
 </file>
 
 <file path=customXml/item2.xml><?xml version="1.0" encoding="utf-8"?>
-<b:Sources xmlns:b="http://schemas.openxmlformats.org/officeDocument/2006/bibliography" xmlns="http://schemas.openxmlformats.org/officeDocument/2006/bibliography" SelectedStyle="\APA.XSL" StyleName="APA"/>
+<p:properties xmlns:p="http://schemas.microsoft.com/office/2006/metadata/properties" xmlns:xsi="http://www.w3.org/2001/XMLSchema-instance" xmlns:pc="http://schemas.microsoft.com/office/infopath/2007/PartnerControls">
+  <documentManagement/>
+</p:properties>
 </file>
 
 <file path=customXml/item3.xml><?xml version="1.0" encoding="utf-8"?>
@@ -18137,9 +15539,7 @@
 </file>
 
 <file path=customXml/item4.xml><?xml version="1.0" encoding="utf-8"?>
-<p:properties xmlns:p="http://schemas.microsoft.com/office/2006/metadata/properties" xmlns:xsi="http://www.w3.org/2001/XMLSchema-instance" xmlns:pc="http://schemas.microsoft.com/office/infopath/2007/PartnerControls">
-  <documentManagement/>
-</p:properties>
+<b:Sources xmlns:b="http://schemas.openxmlformats.org/officeDocument/2006/bibliography" xmlns="http://schemas.openxmlformats.org/officeDocument/2006/bibliography" SelectedStyle="\APA.XSL" StyleName="APA"/>
 </file>
 
 <file path=customXml/itemProps1.xml><?xml version="1.0" encoding="utf-8"?>
@@ -18151,9 +15551,10 @@
 </file>
 
 <file path=customXml/itemProps2.xml><?xml version="1.0" encoding="utf-8"?>
-<ds:datastoreItem xmlns:ds="http://schemas.openxmlformats.org/officeDocument/2006/customXml" ds:itemID="{308E1B35-0FAF-4A78-BEF3-82256463C83E}">
+<ds:datastoreItem xmlns:ds="http://schemas.openxmlformats.org/officeDocument/2006/customXml" ds:itemID="{DD86B631-EF59-42E0-AFBB-4D6A49D52145}">
   <ds:schemaRefs>
-    <ds:schemaRef ds:uri="http://schemas.openxmlformats.org/officeDocument/2006/bibliography"/>
+    <ds:schemaRef ds:uri="http://schemas.microsoft.com/office/2006/metadata/properties"/>
+    <ds:schemaRef ds:uri="http://schemas.microsoft.com/office/infopath/2007/PartnerControls"/>
   </ds:schemaRefs>
 </ds:datastoreItem>
 </file>
@@ -18178,10 +15579,9 @@
 </file>
 
 <file path=customXml/itemProps4.xml><?xml version="1.0" encoding="utf-8"?>
-<ds:datastoreItem xmlns:ds="http://schemas.openxmlformats.org/officeDocument/2006/customXml" ds:itemID="{DD86B631-EF59-42E0-AFBB-4D6A49D52145}">
+<ds:datastoreItem xmlns:ds="http://schemas.openxmlformats.org/officeDocument/2006/customXml" ds:itemID="{308E1B35-0FAF-4A78-BEF3-82256463C83E}">
   <ds:schemaRefs>
-    <ds:schemaRef ds:uri="http://schemas.microsoft.com/office/2006/metadata/properties"/>
-    <ds:schemaRef ds:uri="http://schemas.microsoft.com/office/infopath/2007/PartnerControls"/>
+    <ds:schemaRef ds:uri="http://schemas.openxmlformats.org/officeDocument/2006/bibliography"/>
   </ds:schemaRefs>
 </ds:datastoreItem>
 </file>
</xml_diff>